<commit_message>
[Doc] Bo sung Luong Nghiep Vu Neo4j Graph DB va MongoDB vao Chuong 8 cua Tai lieu SDS
</commit_message>
<xml_diff>
--- a/TaiLieu/TaiLieu_SDS_ToanBo_HeThong_Movana.docx
+++ b/TaiLieu/TaiLieu_SDS_ToanBo_HeThong_Movana.docx
@@ -1933,6 +1933,204 @@
           <w:color w:val="222222"/>
           <w:sz w:val="28"/>
         </w:rPr>
+        <w:t>8.2 Luồng Gợi Ý Top Phim Thịnh Hành Trên Trang Chủ (Neo4j Graph DB + HttpRuntime.Cache)</w:t>
+      </w:r>
+    </w:p>
+    <w:tbl>
+      <w:tblPr>
+        <w:tblW w:type="auto" w:w="0"/>
+        <w:jc w:val="center"/>
+        <w:tblLook w:firstColumn="1" w:firstRow="1" w:lastColumn="0" w:lastRow="0" w:noHBand="0" w:noVBand="1" w:val="04A0"/>
+      </w:tblPr>
+      <w:tblGrid>
+        <w:gridCol w:w="8640"/>
+      </w:tblGrid>
+      <w:tr>
+        <w:tc>
+          <w:tcPr>
+            <w:tcW w:type="dxa" w:w="8640"/>
+            <w:shd w:val="clear" w:color="auto" w:fill="F4F4F6"/>
+          </w:tcPr>
+          <w:p>
+            <w:pPr>
+              <w:spacing w:before="80" w:after="80"/>
+            </w:pPr>
+            <w:r>
+              <w:rPr>
+                <w:rFonts w:ascii="Consolas" w:hAnsi="Consolas"/>
+                <w:color w:val="1F2428"/>
+                <w:sz w:val="21"/>
+              </w:rPr>
+              <w:t>sequenceDiagram</w:t>
+              <w:br/>
+              <w:t xml:space="preserve">    autonumber</w:t>
+              <w:br/>
+              <w:t xml:space="preserve">    actor User as Khách Hàng / Khách vãng cảnh</w:t>
+              <w:br/>
+              <w:t xml:space="preserve">    participant Home as HomeController (/Home/PhimDangChieu)</w:t>
+              <w:br/>
+              <w:t xml:space="preserve">    participant Cache as HttpRuntime.Cache (RAM 5 phút)</w:t>
+              <w:br/>
+              <w:t xml:space="preserve">    participant Neo4j as Neo4j Graph DB Server</w:t>
+              <w:br/>
+              <w:t xml:space="preserve">    participant SQL as SQL Server DB</w:t>
+              <w:br/>
+              <w:br/>
+              <w:t xml:space="preserve">    User-&gt;&gt;Home: Truy cập Trang Chủ</w:t>
+              <w:br/>
+              <w:t xml:space="preserve">    Home-&gt;&gt;Cache: Kiểm tra Cache['TopBookedNeo4j'] &amp; ['TopFavoritesNeo4j']</w:t>
+              <w:br/>
+              <w:t xml:space="preserve">    alt Đã có dữ liệu trong RAM (Cache Hit)</w:t>
+              <w:br/>
+              <w:t xml:space="preserve">        Cache--&gt;&gt;Home: Trả về danh sách Top Phim lập tức (0.001s)</w:t>
+              <w:br/>
+              <w:t xml:space="preserve">    else Chưa có trong RAM (Cache Miss / Lần đầu)</w:t>
+              <w:br/>
+              <w:t xml:space="preserve">        Home-&gt;&gt;Neo4j: ExecuteCypher("MATCH (u:User)-[r:BOOKED]-&gt;(m:Movie) RETURN ...")</w:t>
+              <w:br/>
+              <w:t xml:space="preserve">        Neo4j--&gt;&gt;Home: Trả về 4 Node Phim có lượt đặt vé &amp; yêu thích cao nhất</w:t>
+              <w:br/>
+              <w:t xml:space="preserve">        Home-&gt;&gt;SQL: Sync tên phim &amp; file ảnh Poster từ bảng Phims</w:t>
+              <w:br/>
+              <w:t xml:space="preserve">        SQL--&gt;&gt;Home: Trả về dữ liệu đồng bộ</w:t>
+              <w:br/>
+              <w:t xml:space="preserve">        Home-&gt;&gt;Cache: Insert Cache 5 phút (NoSlidingExpiration)</w:t>
+              <w:br/>
+              <w:t xml:space="preserve">    end</w:t>
+              <w:br/>
+              <w:t xml:space="preserve">    Home--&gt;&gt;User: Hiển thị Bảng Xếp Hạng Top Phim Thịnh Hành trên Trang Chủ</w:t>
+            </w:r>
+          </w:p>
+        </w:tc>
+      </w:tr>
+    </w:tbl>
+    <w:p>
+      <w:pPr>
+        <w:spacing w:before="0" w:after="80"/>
+      </w:pPr>
+    </w:p>
+    <w:p>
+      <w:pPr>
+        <w:spacing w:before="60" w:after="60" w:line="276" w:lineRule="auto"/>
+      </w:pPr>
+      <w:r>
+        <w:rPr>
+          <w:rFonts w:ascii="Times New Roman" w:hAnsi="Times New Roman"/>
+        </w:rPr>
+        <w:t>---</w:t>
+      </w:r>
+    </w:p>
+    <w:p>
+      <w:pPr>
+        <w:spacing w:before="200" w:after="60"/>
+      </w:pPr>
+      <w:r>
+        <w:rPr>
+          <w:rFonts w:ascii="Times New Roman" w:hAnsi="Times New Roman"/>
+          <w:b/>
+          <w:color w:val="222222"/>
+          <w:sz w:val="28"/>
+        </w:rPr>
+        <w:t>8.3 Luồng Tiếp Nhận Khiếu Nại &amp; Trả Lời Của Admin (MongoDB Document Store)</w:t>
+      </w:r>
+    </w:p>
+    <w:tbl>
+      <w:tblPr>
+        <w:tblW w:type="auto" w:w="0"/>
+        <w:jc w:val="center"/>
+        <w:tblLook w:firstColumn="1" w:firstRow="1" w:lastColumn="0" w:lastRow="0" w:noHBand="0" w:noVBand="1" w:val="04A0"/>
+      </w:tblPr>
+      <w:tblGrid>
+        <w:gridCol w:w="8640"/>
+      </w:tblGrid>
+      <w:tr>
+        <w:tc>
+          <w:tcPr>
+            <w:tcW w:type="dxa" w:w="8640"/>
+            <w:shd w:val="clear" w:color="auto" w:fill="F4F4F6"/>
+          </w:tcPr>
+          <w:p>
+            <w:pPr>
+              <w:spacing w:before="80" w:after="80"/>
+            </w:pPr>
+            <w:r>
+              <w:rPr>
+                <w:rFonts w:ascii="Consolas" w:hAnsi="Consolas"/>
+                <w:color w:val="1F2428"/>
+                <w:sz w:val="21"/>
+              </w:rPr>
+              <w:t>sequenceDiagram</w:t>
+              <w:br/>
+              <w:t xml:space="preserve">    autonumber</w:t>
+              <w:br/>
+              <w:t xml:space="preserve">    actor Customer as Khách Hàng</w:t>
+              <w:br/>
+              <w:t xml:space="preserve">    actor Admin as Quản Trị Viên (Admin)</w:t>
+              <w:br/>
+              <w:t xml:space="preserve">    participant Web as MgdbCustomerFeedbackController</w:t>
+              <w:br/>
+              <w:t xml:space="preserve">    participant Mgdb as MongoDB Database ('customer_feedbacks')</w:t>
+              <w:br/>
+              <w:br/>
+              <w:t xml:space="preserve">    Customer-&gt;&gt;Web: Gửi Ticket khiếu nại (Tiêu đề, Nội dung, Chuyên mục)</w:t>
+              <w:br/>
+              <w:t xml:space="preserve">    Web-&gt;&gt;Mgdb: InsertOne(doc { status: 'New', conversations: [] })</w:t>
+              <w:br/>
+              <w:t xml:space="preserve">    Mgdb--&gt;&gt;Web: Trả về ObjectId thành công</w:t>
+              <w:br/>
+              <w:t xml:space="preserve">    Web--&gt;&gt;Customer: Hiển thị Ticket trong Lịch sử Hỗ Trợ</w:t>
+              <w:br/>
+              <w:br/>
+              <w:t xml:space="preserve">    Admin-&gt;&gt;Web: Đăng nhập Admin &amp; Mở trang Quản Lý Phản Hồi</w:t>
+              <w:br/>
+              <w:t xml:space="preserve">    Web-&gt;&gt;Mgdb: Find(filter) &amp; Aggregate($group theo category)</w:t>
+              <w:br/>
+              <w:t xml:space="preserve">    Mgdb--&gt;&gt;Web: Trả về Danh sách Ticket + Bảng Thống Kê Sự Cố</w:t>
+              <w:br/>
+              <w:t xml:space="preserve">    Web--&gt;&gt;Admin: Hiển thị Bảng điều khiển Admin</w:t>
+              <w:br/>
+              <w:br/>
+              <w:t xml:space="preserve">    Admin-&gt;&gt;Web: Nhập Lời nhắn trả lời &amp; Bấm Giải quyết</w:t>
+              <w:br/>
+              <w:t xml:space="preserve">    Web-&gt;&gt;Mgdb: UpdateOne(filter, { $push:conversations, $set:status='Resolved' })</w:t>
+              <w:br/>
+              <w:t xml:space="preserve">    Mgdb--&gt;&gt;Web: Cập nhật Document thành công</w:t>
+              <w:br/>
+              <w:t xml:space="preserve">    Web--&gt;&gt;Admin: Thông báo đã trả lời Ticket</w:t>
+              <w:br/>
+              <w:t xml:space="preserve">    Web--&gt;&gt;Customer: Hiển thị câu trả lời của Admin trong lịch sử hội thoại</w:t>
+            </w:r>
+          </w:p>
+        </w:tc>
+      </w:tr>
+    </w:tbl>
+    <w:p>
+      <w:pPr>
+        <w:spacing w:before="0" w:after="80"/>
+      </w:pPr>
+    </w:p>
+    <w:p>
+      <w:pPr>
+        <w:spacing w:before="60" w:after="60" w:line="276" w:lineRule="auto"/>
+      </w:pPr>
+      <w:r>
+        <w:rPr>
+          <w:rFonts w:ascii="Times New Roman" w:hAnsi="Times New Roman"/>
+        </w:rPr>
+        <w:t>---</w:t>
+      </w:r>
+    </w:p>
+    <w:p>
+      <w:pPr>
+        <w:spacing w:before="200" w:after="60"/>
+      </w:pPr>
+      <w:r>
+        <w:rPr>
+          <w:rFonts w:ascii="Times New Roman" w:hAnsi="Times New Roman"/>
+          <w:b/>
+          <w:color w:val="222222"/>
+          <w:sz w:val="28"/>
+        </w:rPr>
         <w:t>📌 TỔNG KẾT TÀI LIỆU SDS TỔNG THỂ V3.0</w:t>
       </w:r>
     </w:p>

</xml_diff>

<commit_message>
[Doc] Bo sung Luong Ap Dung Voucher Khuyen Mai MongoDB vao Muc 8.4 cua Tai Lieu SDS
</commit_message>
<xml_diff>
--- a/TaiLieu/TaiLieu_SDS_ToanBo_HeThong_Movana.docx
+++ b/TaiLieu/TaiLieu_SDS_ToanBo_HeThong_Movana.docx
@@ -1747,6 +1747,10 @@
               <w:br/>
               <w:t xml:space="preserve">        +GetFeedbackCategoryStats()</w:t>
               <w:br/>
+              <w:t xml:space="preserve">        +GetActivePromotions()</w:t>
+              <w:br/>
+              <w:t xml:space="preserve">        +ClaimPromotion()</w:t>
+              <w:br/>
               <w:t xml:space="preserve">    }</w:t>
               <w:br/>
               <w:br/>
@@ -2131,6 +2135,106 @@
           <w:color w:val="222222"/>
           <w:sz w:val="28"/>
         </w:rPr>
+        <w:t>8.4 Luồng Áp Dụng Mã Khuyến Mãi &amp; Voucher Giảm Giá (MongoDB Collection 'cinema_promotions')</w:t>
+      </w:r>
+    </w:p>
+    <w:tbl>
+      <w:tblPr>
+        <w:tblW w:type="auto" w:w="0"/>
+        <w:jc w:val="center"/>
+        <w:tblLook w:firstColumn="1" w:firstRow="1" w:lastColumn="0" w:lastRow="0" w:noHBand="0" w:noVBand="1" w:val="04A0"/>
+      </w:tblPr>
+      <w:tblGrid>
+        <w:gridCol w:w="8640"/>
+      </w:tblGrid>
+      <w:tr>
+        <w:tc>
+          <w:tcPr>
+            <w:tcW w:type="dxa" w:w="8640"/>
+            <w:shd w:val="clear" w:color="auto" w:fill="F4F4F6"/>
+          </w:tcPr>
+          <w:p>
+            <w:pPr>
+              <w:spacing w:before="80" w:after="80"/>
+            </w:pPr>
+            <w:r>
+              <w:rPr>
+                <w:rFonts w:ascii="Consolas" w:hAnsi="Consolas"/>
+                <w:color w:val="1F2428"/>
+                <w:sz w:val="21"/>
+              </w:rPr>
+              <w:t>sequenceDiagram</w:t>
+              <w:br/>
+              <w:t xml:space="preserve">    autonumber</w:t>
+              <w:br/>
+              <w:t xml:space="preserve">    actor Customer as Khách Hàng</w:t>
+              <w:br/>
+              <w:t xml:space="preserve">    participant Checkout as ThanhToanController / MgdbPromotionController</w:t>
+              <w:br/>
+              <w:t xml:space="preserve">    participant Mgdb as MongoDB Database ('cinema_promotions')</w:t>
+              <w:br/>
+              <w:t xml:space="preserve">    participant SQL as SQL Server RDBMS</w:t>
+              <w:br/>
+              <w:br/>
+              <w:t xml:space="preserve">    Customer-&gt;&gt;Checkout: Mở trang Đặt Vé &amp; Nhập Mã Voucher (VD: 'MOVANA50K')</w:t>
+              <w:br/>
+              <w:t xml:space="preserve">    Checkout-&gt;&gt;Mgdb: Find({ code: 'MOVANA50K', status: 'Active', quantity: { $gt: 0 } })</w:t>
+              <w:br/>
+              <w:t xml:space="preserve">    alt Mã Voucher Không Hợp Lệ hoặc Đã Hết Số Lượng</w:t>
+              <w:br/>
+              <w:t xml:space="preserve">        Mgdb--&gt;&gt;Checkout: Trả về null / Hết lượt</w:t>
+              <w:br/>
+              <w:t xml:space="preserve">        Checkout--&gt;&gt;Customer: Thông báo 'Mã giảm giá không tồn tại hoặc đã hết lượt dùng'</w:t>
+              <w:br/>
+              <w:t xml:space="preserve">    else Mã Voucher Hợp Lệ</w:t>
+              <w:br/>
+              <w:t xml:space="preserve">        Mgdb--&gt;&gt;Checkout: Trả về BSON Document Voucher (discountAmount: 50.000đ)</w:t>
+              <w:br/>
+              <w:t xml:space="preserve">        Checkout-&gt;&gt;Mgdb: UpdateOne({ code: 'MOVANA50K' }, { $inc: { quantity: -1, claimedCount: 1 } })</w:t>
+              <w:br/>
+              <w:t xml:space="preserve">        Mgdb--&gt;&gt;Checkout: Trừ số lượng kho Voucher thành công (Atomic Update)</w:t>
+              <w:br/>
+              <w:t xml:space="preserve">        Checkout-&gt;&gt;Checkout: Tính Tổng Tiền = Giá Vé Gốc - 50.000đ</w:t>
+              <w:br/>
+              <w:t xml:space="preserve">        Checkout-&gt;&gt;SQL: Thêm Hóa Đơn đã trừ chiết khấu vào SQL Server</w:t>
+              <w:br/>
+              <w:t xml:space="preserve">        SQL--&gt;&gt;Checkout: Lưu Hóa Đơn thành công</w:t>
+              <w:br/>
+              <w:t xml:space="preserve">        Checkout--&gt;&gt;Customer: Hiển thị Đơn hàng đã áp mã giảm 50K thành công!</w:t>
+              <w:br/>
+              <w:t xml:space="preserve">    end</w:t>
+            </w:r>
+          </w:p>
+        </w:tc>
+      </w:tr>
+    </w:tbl>
+    <w:p>
+      <w:pPr>
+        <w:spacing w:before="0" w:after="80"/>
+      </w:pPr>
+    </w:p>
+    <w:p>
+      <w:pPr>
+        <w:spacing w:before="60" w:after="60" w:line="276" w:lineRule="auto"/>
+      </w:pPr>
+      <w:r>
+        <w:rPr>
+          <w:rFonts w:ascii="Times New Roman" w:hAnsi="Times New Roman"/>
+        </w:rPr>
+        <w:t>---</w:t>
+      </w:r>
+    </w:p>
+    <w:p>
+      <w:pPr>
+        <w:spacing w:before="200" w:after="60"/>
+      </w:pPr>
+      <w:r>
+        <w:rPr>
+          <w:rFonts w:ascii="Times New Roman" w:hAnsi="Times New Roman"/>
+          <w:b/>
+          <w:color w:val="222222"/>
+          <w:sz w:val="28"/>
+        </w:rPr>
         <w:t>📌 TỔNG KẾT TÀI LIỆU SDS TỔNG THỂ V3.0</w:t>
       </w:r>
     </w:p>

</xml_diff>

<commit_message>
[Doc] Tai cau truc Chuong 8 theo tung CSDL (8.1 Redis, 8.2 Neo4j, 8.3 MongoDB, 8.4 Cassandra)
</commit_message>
<xml_diff>
--- a/TaiLieu/TaiLieu_SDS_ToanBo_HeThong_Movana.docx
+++ b/TaiLieu/TaiLieu_SDS_ToanBo_HeThong_Movana.docx
@@ -1760,6 +1760,10 @@
               <w:br/>
               <w:t xml:space="preserve">        +GetTopFavoriteMovies()</w:t>
               <w:br/>
+              <w:t xml:space="preserve">        +ToggleFavorite()</w:t>
+              <w:br/>
+              <w:t xml:space="preserve">        +GetGenreAnalytics()</w:t>
+              <w:br/>
               <w:t xml:space="preserve">    }</w:t>
               <w:br/>
               <w:br/>
@@ -1832,7 +1836,20 @@
           <w:color w:val="222222"/>
           <w:sz w:val="28"/>
         </w:rPr>
-        <w:t>8.1 Luồng Khách Hàng Đặt Vé &amp; Tạm Giữ Ghế Realtime (Redis + SQL Server + Cassandra)</w:t>
+        <w:t>8.1 Phân hệ CSDL Redis (Key-Value Store)</w:t>
+      </w:r>
+    </w:p>
+    <w:p>
+      <w:pPr>
+        <w:spacing w:before="160" w:after="40"/>
+      </w:pPr>
+      <w:r>
+        <w:rPr>
+          <w:rFonts w:ascii="Times New Roman" w:hAnsi="Times New Roman"/>
+          <w:b/>
+          <w:sz w:val="26"/>
+        </w:rPr>
+        <w:t>8.1.1 Luồng Khách Hàng Chọn Ghế &amp; Khóa Ghế Đếm Ngược Realtime (TTL 5 Phút)</w:t>
       </w:r>
     </w:p>
     <w:tbl>
@@ -1872,8 +1889,6 @@
               <w:br/>
               <w:t xml:space="preserve">    participant SQL as SQL Server RDBMS</w:t>
               <w:br/>
-              <w:t xml:space="preserve">    participant Cass as Cassandra Log DB</w:t>
-              <w:br/>
               <w:br/>
               <w:t xml:space="preserve">    User-&gt;&gt;Web: Chọn ghế A1 Suất chiếu 101</w:t>
               <w:br/>
@@ -1883,13 +1898,11 @@
               <w:br/>
               <w:t xml:space="preserve">        Redis--&gt;&gt;Web: Trả về Key đã tồn tại</w:t>
               <w:br/>
-              <w:t xml:space="preserve">        Web--&gt;&gt;User: Báo lỗi ghế đã bị giữ</w:t>
+              <w:t xml:space="preserve">        Web--&gt;&gt;User: Báo lỗi ghế đã bị giữ bởi người khác</w:t>
               <w:br/>
               <w:t xml:space="preserve">    else Ghế còn trống</w:t>
               <w:br/>
-              <w:t xml:space="preserve">        Redis--&gt;&gt;Web: Khóa ghế thành công</w:t>
-              <w:br/>
-              <w:t xml:space="preserve">        Web-&gt;&gt;Cass: LogUserActivity("Chon_Ghe_A1")</w:t>
+              <w:t xml:space="preserve">        Redis--&gt;&gt;Web: Khóa ghế thành công (True)</w:t>
               <w:br/>
               <w:t xml:space="preserve">        Web--&gt;&gt;User: Hiển thị đếm ngược 5 phút thanh toán</w:t>
               <w:br/>
@@ -1898,13 +1911,11 @@
               <w:br/>
               <w:t xml:space="preserve">    User-&gt;&gt;Web: Xác nhận thanh toán đơn hàng</w:t>
               <w:br/>
-              <w:t xml:space="preserve">    Web-&gt;&gt;SQL: Lưu Hóa Đơn &amp; Mã Vé</w:t>
+              <w:t xml:space="preserve">    Web-&gt;&gt;SQL: Lưu Hóa Đơn &amp; Mã Vé vào SQL Server</w:t>
               <w:br/>
               <w:t xml:space="preserve">    Web-&gt;&gt;Redis: Delete Key 'seat_lock:101:A1'</w:t>
               <w:br/>
-              <w:t xml:space="preserve">    Web-&gt;&gt;Cass: LogUserActivity("Thanh_Toan_Thanh_Cong")</w:t>
-              <w:br/>
-              <w:t xml:space="preserve">    Web--&gt;&gt;User: Hiển thị mã vé QR Code thành công</w:t>
+              <w:t xml:space="preserve">    Web--&gt;&gt;User: Trả về mã vé QR Code thành công</w:t>
             </w:r>
           </w:p>
         </w:tc>
@@ -1937,7 +1948,20 @@
           <w:color w:val="222222"/>
           <w:sz w:val="28"/>
         </w:rPr>
-        <w:t>8.2 Luồng Gợi Ý Top Phim Thịnh Hành Trên Trang Chủ (Neo4j Graph DB + HttpRuntime.Cache)</w:t>
+        <w:t>8.2 Phân hệ CSDL Neo4j (Graph Database)</w:t>
+      </w:r>
+    </w:p>
+    <w:p>
+      <w:pPr>
+        <w:spacing w:before="160" w:after="40"/>
+      </w:pPr>
+      <w:r>
+        <w:rPr>
+          <w:rFonts w:ascii="Times New Roman" w:hAnsi="Times New Roman"/>
+          <w:b/>
+          <w:sz w:val="26"/>
+        </w:rPr>
+        <w:t>8.2.1 Luồng Gợi Ý Top Phim Thịnh Hành Trên Trang Chủ (Neo4j Graph DB + HttpRuntime.Cache)</w:t>
       </w:r>
     </w:p>
     <w:tbl>
@@ -2015,6 +2039,86 @@
     </w:p>
     <w:p>
       <w:pPr>
+        <w:spacing w:before="160" w:after="40"/>
+      </w:pPr>
+      <w:r>
+        <w:rPr>
+          <w:rFonts w:ascii="Times New Roman" w:hAnsi="Times New Roman"/>
+          <w:b/>
+          <w:sz w:val="26"/>
+        </w:rPr>
+        <w:t>8.2.2 Luồng Khách Hàng Thả Tim Yêu Thích Phim Realtime (Relationship [:FAVORITED])</w:t>
+      </w:r>
+    </w:p>
+    <w:tbl>
+      <w:tblPr>
+        <w:tblW w:type="auto" w:w="0"/>
+        <w:jc w:val="center"/>
+        <w:tblLook w:firstColumn="1" w:firstRow="1" w:lastColumn="0" w:lastRow="0" w:noHBand="0" w:noVBand="1" w:val="04A0"/>
+      </w:tblPr>
+      <w:tblGrid>
+        <w:gridCol w:w="8640"/>
+      </w:tblGrid>
+      <w:tr>
+        <w:tc>
+          <w:tcPr>
+            <w:tcW w:type="dxa" w:w="8640"/>
+            <w:shd w:val="clear" w:color="auto" w:fill="F4F4F6"/>
+          </w:tcPr>
+          <w:p>
+            <w:pPr>
+              <w:spacing w:before="80" w:after="80"/>
+            </w:pPr>
+            <w:r>
+              <w:rPr>
+                <w:rFonts w:ascii="Consolas" w:hAnsi="Consolas"/>
+                <w:color w:val="1F2428"/>
+                <w:sz w:val="21"/>
+              </w:rPr>
+              <w:t>sequenceDiagram</w:t>
+              <w:br/>
+              <w:t xml:space="preserve">    autonumber</w:t>
+              <w:br/>
+              <w:t xml:space="preserve">    actor User as Khách Hàng Đã Đăng Nhập</w:t>
+              <w:br/>
+              <w:t xml:space="preserve">    participant Web as HomeController / MovieController</w:t>
+              <w:br/>
+              <w:t xml:space="preserve">    participant Neo4j as Neo4j Graph DB Server</w:t>
+              <w:br/>
+              <w:br/>
+              <w:t xml:space="preserve">    User-&gt;&gt;Web: Nhấp nút Thả Tim / Yêu Thích ❤️ trên Phim (MovieId: 101)</w:t>
+              <w:br/>
+              <w:t xml:space="preserve">    Web-&gt;&gt;Neo4j: ExecuteCypher("MATCH (u:User {userId: 'huy'}), (m:Movie {movieId: 101}) ...")</w:t>
+              <w:br/>
+              <w:t xml:space="preserve">    alt Đã có mối quan hệ [:FAVORITED]</w:t>
+              <w:br/>
+              <w:t xml:space="preserve">        Neo4j-&gt;&gt;Neo4j: DELETE r (Xóa tim yêu thích)</w:t>
+              <w:br/>
+              <w:t xml:space="preserve">        Neo4j--&gt;&gt;Web: Trả về trạng thái Unfavorited</w:t>
+              <w:br/>
+              <w:t xml:space="preserve">        Web--&gt;&gt;User: Cập nhật icon tim rỗng 🤍</w:t>
+              <w:br/>
+              <w:t xml:space="preserve">    else Chưa có mối quan hệ [:FAVORITED]</w:t>
+              <w:br/>
+              <w:t xml:space="preserve">        Neo4j-&gt;&gt;Neo4j: MERGE (u)-[:FAVORITED]-&gt;(m) (Tạo tim mới)</w:t>
+              <w:br/>
+              <w:t xml:space="preserve">        Neo4j--&gt;&gt;Web: Trả về trạng thái Favorited</w:t>
+              <w:br/>
+              <w:t xml:space="preserve">        Web--&gt;&gt;User: Cập nhật icon tim đỏ ❤️ &amp; Tăng số lượt yêu thích</w:t>
+              <w:br/>
+              <w:t xml:space="preserve">    end</w:t>
+            </w:r>
+          </w:p>
+        </w:tc>
+      </w:tr>
+    </w:tbl>
+    <w:p>
+      <w:pPr>
+        <w:spacing w:before="0" w:after="80"/>
+      </w:pPr>
+    </w:p>
+    <w:p>
+      <w:pPr>
         <w:spacing w:before="60" w:after="60" w:line="276" w:lineRule="auto"/>
       </w:pPr>
       <w:r>
@@ -2035,7 +2139,20 @@
           <w:color w:val="222222"/>
           <w:sz w:val="28"/>
         </w:rPr>
-        <w:t>8.3 Luồng Tiếp Nhận Khiếu Nại &amp; Trả Lời Của Admin (MongoDB Document Store)</w:t>
+        <w:t>8.3 Phân hệ CSDL MongoDB (Document Store)</w:t>
+      </w:r>
+    </w:p>
+    <w:p>
+      <w:pPr>
+        <w:spacing w:before="160" w:after="40"/>
+      </w:pPr>
+      <w:r>
+        <w:rPr>
+          <w:rFonts w:ascii="Times New Roman" w:hAnsi="Times New Roman"/>
+          <w:b/>
+          <w:sz w:val="26"/>
+        </w:rPr>
+        <w:t>8.3.1 Luồng Tiếp Nhận Khiếu Nại &amp; Trả Lời Của Admin (Collection 'customer_feedbacks')</w:t>
       </w:r>
     </w:p>
     <w:tbl>
@@ -2115,27 +2232,15 @@
     </w:p>
     <w:p>
       <w:pPr>
-        <w:spacing w:before="60" w:after="60" w:line="276" w:lineRule="auto"/>
-      </w:pPr>
-      <w:r>
-        <w:rPr>
-          <w:rFonts w:ascii="Times New Roman" w:hAnsi="Times New Roman"/>
-        </w:rPr>
-        <w:t>---</w:t>
-      </w:r>
-    </w:p>
-    <w:p>
-      <w:pPr>
-        <w:spacing w:before="200" w:after="60"/>
+        <w:spacing w:before="160" w:after="40"/>
       </w:pPr>
       <w:r>
         <w:rPr>
           <w:rFonts w:ascii="Times New Roman" w:hAnsi="Times New Roman"/>
           <w:b/>
-          <w:color w:val="222222"/>
-          <w:sz w:val="28"/>
+          <w:sz w:val="26"/>
         </w:rPr>
-        <w:t>8.4 Luồng Áp Dụng Mã Khuyến Mãi &amp; Voucher Giảm Giá (MongoDB Collection 'cinema_promotions')</w:t>
+        <w:t>8.3.2 Luồng Áp Dụng Mã Khuyến Mãi &amp; Voucher Giảm Giá (Collection 'cinema_promotions')</w:t>
       </w:r>
     </w:p>
     <w:tbl>
@@ -2203,6 +2308,104 @@
               <w:t xml:space="preserve">        Checkout--&gt;&gt;Customer: Hiển thị Đơn hàng đã áp mã giảm 50K thành công!</w:t>
               <w:br/>
               <w:t xml:space="preserve">    end</w:t>
+            </w:r>
+          </w:p>
+        </w:tc>
+      </w:tr>
+    </w:tbl>
+    <w:p>
+      <w:pPr>
+        <w:spacing w:before="0" w:after="80"/>
+      </w:pPr>
+    </w:p>
+    <w:p>
+      <w:pPr>
+        <w:spacing w:before="60" w:after="60" w:line="276" w:lineRule="auto"/>
+      </w:pPr>
+      <w:r>
+        <w:rPr>
+          <w:rFonts w:ascii="Times New Roman" w:hAnsi="Times New Roman"/>
+        </w:rPr>
+        <w:t>---</w:t>
+      </w:r>
+    </w:p>
+    <w:p>
+      <w:pPr>
+        <w:spacing w:before="200" w:after="60"/>
+      </w:pPr>
+      <w:r>
+        <w:rPr>
+          <w:rFonts w:ascii="Times New Roman" w:hAnsi="Times New Roman"/>
+          <w:b/>
+          <w:color w:val="222222"/>
+          <w:sz w:val="28"/>
+        </w:rPr>
+        <w:t>8.4 Phân hệ CSDL Apache Cassandra (Wide-Column Store)</w:t>
+      </w:r>
+    </w:p>
+    <w:p>
+      <w:pPr>
+        <w:spacing w:before="160" w:after="40"/>
+      </w:pPr>
+      <w:r>
+        <w:rPr>
+          <w:rFonts w:ascii="Times New Roman" w:hAnsi="Times New Roman"/>
+          <w:b/>
+          <w:sz w:val="26"/>
+        </w:rPr>
+        <w:t>8.4.1 Luồng Ghi Nhật Ký Hoạt Động Big Data &amp; Lịch Sử Vé (Keyspace 'cinemadb_analytics')</w:t>
+      </w:r>
+    </w:p>
+    <w:tbl>
+      <w:tblPr>
+        <w:tblW w:type="auto" w:w="0"/>
+        <w:jc w:val="center"/>
+        <w:tblLook w:firstColumn="1" w:firstRow="1" w:lastColumn="0" w:lastRow="0" w:noHBand="0" w:noVBand="1" w:val="04A0"/>
+      </w:tblPr>
+      <w:tblGrid>
+        <w:gridCol w:w="8640"/>
+      </w:tblGrid>
+      <w:tr>
+        <w:tc>
+          <w:tcPr>
+            <w:tcW w:type="dxa" w:w="8640"/>
+            <w:shd w:val="clear" w:color="auto" w:fill="F4F4F6"/>
+          </w:tcPr>
+          <w:p>
+            <w:pPr>
+              <w:spacing w:before="80" w:after="80"/>
+            </w:pPr>
+            <w:r>
+              <w:rPr>
+                <w:rFonts w:ascii="Consolas" w:hAnsi="Consolas"/>
+                <w:color w:val="1F2428"/>
+                <w:sz w:val="21"/>
+              </w:rPr>
+              <w:t>sequenceDiagram</w:t>
+              <w:br/>
+              <w:t xml:space="preserve">    autonumber</w:t>
+              <w:br/>
+              <w:t xml:space="preserve">    actor User as Khách Hàng</w:t>
+              <w:br/>
+              <w:t xml:space="preserve">    participant Web as ASP.NET MVC Backend</w:t>
+              <w:br/>
+              <w:t xml:space="preserve">    participant Cass as Apache Cassandra Database Server</w:t>
+              <w:br/>
+              <w:br/>
+              <w:t xml:space="preserve">    User-&gt;&gt;Web: Thực hiện thao tác trên Web (Đăng nhập, Xem phim, Đặt vé)</w:t>
+              <w:br/>
+              <w:t xml:space="preserve">    Web-&gt;&gt;Cass: ExecuteAsync("INSERT INTO user_activity_logs (user_id, activity_time, ...)")</w:t>
+              <w:br/>
+              <w:t xml:space="preserve">    Cass--&gt;&gt;Web: Ghi Log Big Data thành công (Tốc độ cực nhanh &lt; 1ms)</w:t>
+              <w:br/>
+              <w:br/>
+              <w:t xml:space="preserve">    User-&gt;&gt;Web: Xem trang Thông Tin Cá Nhân / Lịch Sử Vé</w:t>
+              <w:br/>
+              <w:t xml:space="preserve">    Web-&gt;&gt;Cass: Execute("SELECT * FROM user_ticket_history WHERE user_id = 7")</w:t>
+              <w:br/>
+              <w:t xml:space="preserve">    Cass--&gt;&gt;Web: Trả về danh sách Lịch sử đặt vé được sắp xếp theo thời gian mới nhất (ORDER BY booking_time DESC)</w:t>
+              <w:br/>
+              <w:t xml:space="preserve">    Web--&gt;&gt;User: Hiển thị Lịch sử vé và Nhật ký hoạt động cá nhân</w:t>
             </w:r>
           </w:p>
         </w:tc>

</xml_diff>

<commit_message>
[Doc] Bo sung Luong Neo4j 8.2.3 Thong ke do pho bien theo The Loai Phim Do Thi vao Tai Lieu SDS
</commit_message>
<xml_diff>
--- a/TaiLieu/TaiLieu_SDS_ToanBo_HeThong_Movana.docx
+++ b/TaiLieu/TaiLieu_SDS_ToanBo_HeThong_Movana.docx
@@ -1200,7 +1200,7 @@
         <w:rPr>
           <w:rFonts w:ascii="Times New Roman" w:hAnsi="Times New Roman"/>
         </w:rPr>
-        <w:t>Lưu trữ cấu trúc đồ thị mối quan hệ giữa Người Dùng và Bộ Phim để tính toán gợi ý Top Phim Thịnh Hành.</w:t>
+        <w:t>Lưu trữ cấu trúc đồ thị mối quan hệ giữa Người Dùng, Bộ Phim và Thể Loại Phim để tính toán gợi ý Top Phim Thịnh Hành &amp; Thống kê độ phổ biến.</w:t>
       </w:r>
     </w:p>
     <w:p>
@@ -1249,7 +1249,7 @@
         <w:rPr>
           <w:rFonts w:ascii="Times New Roman" w:hAnsi="Times New Roman"/>
         </w:rPr>
-        <w:t>`(:User {userId: 7, username: 'huy'})`</w:t>
+        <w:t>`(:User {userId: 'huy', username: 'huy'})`</w:t>
       </w:r>
     </w:p>
     <w:p>
@@ -1261,7 +1261,19 @@
         <w:rPr>
           <w:rFonts w:ascii="Times New Roman" w:hAnsi="Times New Roman"/>
         </w:rPr>
-        <w:t>`(:Movie {movieId: 101, title: 'Lật Mặt 7'})`</w:t>
+        <w:t>`(:Movie {movieId: 101, title: 'Lật Mặt 7', poster: '001.png', duration: 120})`</w:t>
+      </w:r>
+    </w:p>
+    <w:p>
+      <w:pPr>
+        <w:pStyle w:val="ListBullet"/>
+        <w:spacing w:before="40" w:after="40"/>
+      </w:pPr>
+      <w:r>
+        <w:rPr>
+          <w:rFonts w:ascii="Times New Roman" w:hAnsi="Times New Roman"/>
+        </w:rPr>
+        <w:t>`(:Genre {genreId: 1, genreName: 'Hành Động'})`</w:t>
       </w:r>
     </w:p>
     <w:p>
@@ -1296,7 +1308,7 @@
         <w:rPr>
           <w:rFonts w:ascii="Times New Roman" w:hAnsi="Times New Roman"/>
         </w:rPr>
-        <w:t>`(:User)-[:BOOKED {bookedAt: '2026-08-01'}]-&gt;(:Movie)`</w:t>
+        <w:t>`(:User)-[:BOOKED {bookingId: 'HD001', seatCount: 2, date: '2026-08-01'}]-&gt;(:Movie)`</w:t>
       </w:r>
     </w:p>
     <w:p>
@@ -1313,6 +1325,18 @@
     </w:p>
     <w:p>
       <w:pPr>
+        <w:pStyle w:val="ListBullet"/>
+        <w:spacing w:before="40" w:after="40"/>
+      </w:pPr>
+      <w:r>
+        <w:rPr>
+          <w:rFonts w:ascii="Times New Roman" w:hAnsi="Times New Roman"/>
+        </w:rPr>
+        <w:t>`(:Movie)-[:BELONGS_TO]-&gt;(:Genre)`</w:t>
+      </w:r>
+    </w:p>
+    <w:p>
+      <w:pPr>
         <w:spacing w:before="200" w:after="60"/>
       </w:pPr>
       <w:r>
@@ -1322,7 +1346,7 @@
           <w:color w:val="222222"/>
           <w:sz w:val="28"/>
         </w:rPr>
-        <w:t>5.3 Câu lệnh Cypher Query Truy vấn Top Phim:</w:t>
+        <w:t>5.3 Bộ Câu lệnh Cypher Query Đầy Đủ:</w:t>
       </w:r>
     </w:p>
     <w:tbl>
@@ -1350,7 +1374,7 @@
                 <w:color w:val="1F2428"/>
                 <w:sz w:val="21"/>
               </w:rPr>
-              <w:t>// Top Phim Được Đặt Vé Nhiều Nhất</w:t>
+              <w:t>// 1. Top Phim Được Đặt Vé Nhiều Nhất</w:t>
               <w:br/>
               <w:t>MATCH (u:User)-[r:BOOKED]-&gt;(m:Movie)</w:t>
               <w:br/>
@@ -1359,13 +1383,35 @@
               <w:t>ORDER BY TotalBookings DESC LIMIT 4;</w:t>
               <w:br/>
               <w:br/>
-              <w:t>// Top Phim Được Yêu Thích Nhất</w:t>
+              <w:t>// 2. Top Phim Được Yêu Thích Nhất</w:t>
               <w:br/>
               <w:t>MATCH (u:User)-[r:FAVORITED]-&gt;(m:Movie)</w:t>
               <w:br/>
               <w:t>RETURN m.movieId AS MovieId, m.title AS Title, COUNT(r) AS TotalFavorites</w:t>
               <w:br/>
               <w:t>ORDER BY TotalFavorites DESC LIMIT 4;</w:t>
+              <w:br/>
+              <w:br/>
+              <w:t>// 3. Thả Tim Yêu Thích Phim Realtime (Tạo mới hoặc Xóa mối quan hệ)</w:t>
+              <w:br/>
+              <w:t>MATCH (u:User {userId: 'huy'}), (m:Movie {movieId: 101})</w:t>
+              <w:br/>
+              <w:t>MERGE (u)-[r:FAVORITED]-&gt;(m);</w:t>
+              <w:br/>
+              <w:br/>
+              <w:t>// 4. Thống Kê Phân Tích Độ Phổ Biến Theo Thể Loại Phim Đồ Thị</w:t>
+              <w:br/>
+              <w:t>MATCH (m:Movie)-[:BELONGS_TO]-&gt;(g:Genre)</w:t>
+              <w:br/>
+              <w:t>OPTIONAL MATCH (u:User)-[b:BOOKED]-&gt;(m)</w:t>
+              <w:br/>
+              <w:t>OPTIONAL MATCH (u2:User)-[f:FAVORITED]-&gt;(m)</w:t>
+              <w:br/>
+              <w:t xml:space="preserve">RETURN g.genreId AS GenreId, g.genreName AS GenreName, </w:t>
+              <w:br/>
+              <w:t xml:space="preserve">       COUNT(DISTINCT b) AS TotalBookings, COUNT(DISTINCT f) AS TotalFavorites</w:t>
+              <w:br/>
+              <w:t>ORDER BY TotalBookings DESC;</w:t>
             </w:r>
           </w:p>
         </w:tc>
@@ -1764,6 +1810,8 @@
               <w:br/>
               <w:t xml:space="preserve">        +GetGenreAnalytics()</w:t>
               <w:br/>
+              <w:t xml:space="preserve">        +SeedInitialData()</w:t>
+              <w:br/>
               <w:t xml:space="preserve">    }</w:t>
               <w:br/>
               <w:br/>
@@ -2107,6 +2155,72 @@
               <w:t xml:space="preserve">        Web--&gt;&gt;User: Cập nhật icon tim đỏ ❤️ &amp; Tăng số lượt yêu thích</w:t>
               <w:br/>
               <w:t xml:space="preserve">    end</w:t>
+            </w:r>
+          </w:p>
+        </w:tc>
+      </w:tr>
+    </w:tbl>
+    <w:p>
+      <w:pPr>
+        <w:spacing w:before="0" w:after="80"/>
+      </w:pPr>
+    </w:p>
+    <w:p>
+      <w:pPr>
+        <w:spacing w:before="160" w:after="40"/>
+      </w:pPr>
+      <w:r>
+        <w:rPr>
+          <w:rFonts w:ascii="Times New Roman" w:hAnsi="Times New Roman"/>
+          <w:b/>
+          <w:sz w:val="26"/>
+        </w:rPr>
+        <w:t>8.2.3 Luồng Thống Kê Phân Tích Độ Phổ Biến Theo Thể Loại Phim Đồ Thị (GetGenreAnalytics)</w:t>
+      </w:r>
+    </w:p>
+    <w:tbl>
+      <w:tblPr>
+        <w:tblW w:type="auto" w:w="0"/>
+        <w:jc w:val="center"/>
+        <w:tblLook w:firstColumn="1" w:firstRow="1" w:lastColumn="0" w:lastRow="0" w:noHBand="0" w:noVBand="1" w:val="04A0"/>
+      </w:tblPr>
+      <w:tblGrid>
+        <w:gridCol w:w="8640"/>
+      </w:tblGrid>
+      <w:tr>
+        <w:tc>
+          <w:tcPr>
+            <w:tcW w:type="dxa" w:w="8640"/>
+            <w:shd w:val="clear" w:color="auto" w:fill="F4F4F6"/>
+          </w:tcPr>
+          <w:p>
+            <w:pPr>
+              <w:spacing w:before="80" w:after="80"/>
+            </w:pPr>
+            <w:r>
+              <w:rPr>
+                <w:rFonts w:ascii="Consolas" w:hAnsi="Consolas"/>
+                <w:color w:val="1F2428"/>
+                <w:sz w:val="21"/>
+              </w:rPr>
+              <w:t>sequenceDiagram</w:t>
+              <w:br/>
+              <w:t xml:space="preserve">    autonumber</w:t>
+              <w:br/>
+              <w:t xml:space="preserve">    actor Admin as Quản Trị Viên (Admin)</w:t>
+              <w:br/>
+              <w:t xml:space="preserve">    participant AdminCtrl as AdminController / AnalyticsController</w:t>
+              <w:br/>
+              <w:t xml:space="preserve">    participant Neo4j as Neo4j Graph DB Server</w:t>
+              <w:br/>
+              <w:br/>
+              <w:t xml:space="preserve">    Admin-&gt;&gt;AdminCtrl: Truy cập Bảng Thống Kê Phân Tích Thể Loại Phim</w:t>
+              <w:br/>
+              <w:t xml:space="preserve">    AdminCtrl-&gt;&gt;Neo4j: ExecuteCypher("MATCH (m:Movie)-[:BELONGS_TO]-&gt;(g:Genre) OPTIONAL MATCH ...")</w:t>
+              <w:br/>
+              <w:t xml:space="preserve">    Neo4j--&gt;&gt;AdminCtrl: Trả về Danh sách Thể loại + Tổng vé đợt đặt + Tổng lượt yêu thích</w:t>
+              <w:br/>
+              <w:t xml:space="preserve">    AdminCtrl--&gt;&gt;Admin: Hiển thị Biểu đồ / Bảng Thống kê Độ Phổ Biến Thể Loại Phim Neo4j Graph</w:t>
             </w:r>
           </w:p>
         </w:tc>

</xml_diff>

<commit_message>
[Doc] Bo sung Luong Redis 8.1.2 Giai Phong Khoa Giu Ghe Khi Huy Chon Hoac Thanh Toan Hoan Tat vao Tai Lieu SDS
</commit_message>
<xml_diff>
--- a/TaiLieu/TaiLieu_SDS_ToanBo_HeThong_Movana.docx
+++ b/TaiLieu/TaiLieu_SDS_ToanBo_HeThong_Movana.docx
@@ -1135,12 +1135,17 @@
                 <w:color w:val="1F2428"/>
                 <w:sz w:val="21"/>
               </w:rPr>
-              <w:t>// Đặt khóa giữ ghế trong 5 phút</w:t>
+              <w:t>// 1. Đặt khóa giữ ghế trong 5 phút (TTL 300s)</w:t>
               <w:br/>
               <w:t>bool isLocked = redisDb.StringSet($"seat_lock:{suatChieuId}:{gheId}", $"UserID:{userId}", TimeSpan.FromMinutes(5), When.NotExists);</w:t>
               <w:br/>
               <w:br/>
-              <w:t>// Xóa khóa giữ ghế khi thanh toán xong</w:t>
+              <w:t>// 2. Kiểm tra trạng thái ghế realtime</w:t>
+              <w:br/>
+              <w:t>bool isCurrentlyLocked = redisDb.KeyExists($"seat_lock:{suatChieuId}:{gheId}");</w:t>
+              <w:br/>
+              <w:br/>
+              <w:t>// 3. Giải phóng / Xóa khóa giữ ghế khi thanh toán xong hoặc khách bỏ chọn</w:t>
               <w:br/>
               <w:t>redisDb.KeyDelete($"seat_lock:{suatChieuId}:{gheId}");</w:t>
             </w:r>
@@ -1830,6 +1835,8 @@
               <w:br/>
               <w:t xml:space="preserve">        +UnlockSeat()</w:t>
               <w:br/>
+              <w:t xml:space="preserve">        +IsSeatLocked()</w:t>
+              <w:br/>
               <w:t xml:space="preserve">    }</w:t>
               <w:br/>
               <w:br/>
@@ -1955,15 +1962,102 @@
               <w:t xml:space="preserve">        Web--&gt;&gt;User: Hiển thị đếm ngược 5 phút thanh toán</w:t>
               <w:br/>
               <w:t xml:space="preserve">    end</w:t>
-              <w:br/>
-              <w:br/>
-              <w:t xml:space="preserve">    User-&gt;&gt;Web: Xác nhận thanh toán đơn hàng</w:t>
-              <w:br/>
-              <w:t xml:space="preserve">    Web-&gt;&gt;SQL: Lưu Hóa Đơn &amp; Mã Vé vào SQL Server</w:t>
-              <w:br/>
-              <w:t xml:space="preserve">    Web-&gt;&gt;Redis: Delete Key 'seat_lock:101:A1'</w:t>
-              <w:br/>
-              <w:t xml:space="preserve">    Web--&gt;&gt;User: Trả về mã vé QR Code thành công</w:t>
+            </w:r>
+          </w:p>
+        </w:tc>
+      </w:tr>
+    </w:tbl>
+    <w:p>
+      <w:pPr>
+        <w:spacing w:before="0" w:after="80"/>
+      </w:pPr>
+    </w:p>
+    <w:p>
+      <w:pPr>
+        <w:spacing w:before="160" w:after="40"/>
+      </w:pPr>
+      <w:r>
+        <w:rPr>
+          <w:rFonts w:ascii="Times New Roman" w:hAnsi="Times New Roman"/>
+          <w:b/>
+          <w:sz w:val="26"/>
+        </w:rPr>
+        <w:t>8.1.2 Luồng Giải Phóng Khóa Giữ Ghế Khi Hủy Chọn Hoặc Thanh Toán Hoàn Tất (Redis Key Delete)</w:t>
+      </w:r>
+    </w:p>
+    <w:tbl>
+      <w:tblPr>
+        <w:tblW w:type="auto" w:w="0"/>
+        <w:jc w:val="center"/>
+        <w:tblLook w:firstColumn="1" w:firstRow="1" w:lastColumn="0" w:lastRow="0" w:noHBand="0" w:noVBand="1" w:val="04A0"/>
+      </w:tblPr>
+      <w:tblGrid>
+        <w:gridCol w:w="8640"/>
+      </w:tblGrid>
+      <w:tr>
+        <w:tc>
+          <w:tcPr>
+            <w:tcW w:type="dxa" w:w="8640"/>
+            <w:shd w:val="clear" w:color="auto" w:fill="F4F4F6"/>
+          </w:tcPr>
+          <w:p>
+            <w:pPr>
+              <w:spacing w:before="80" w:after="80"/>
+            </w:pPr>
+            <w:r>
+              <w:rPr>
+                <w:rFonts w:ascii="Consolas" w:hAnsi="Consolas"/>
+                <w:color w:val="1F2428"/>
+                <w:sz w:val="21"/>
+              </w:rPr>
+              <w:t>sequenceDiagram</w:t>
+              <w:br/>
+              <w:t xml:space="preserve">    autonumber</w:t>
+              <w:br/>
+              <w:t xml:space="preserve">    actor User as Khách Hàng</w:t>
+              <w:br/>
+              <w:t xml:space="preserve">    participant Web as ASP.NET MVC Backend</w:t>
+              <w:br/>
+              <w:t xml:space="preserve">    participant Redis as Redis Key-Value</w:t>
+              <w:br/>
+              <w:t xml:space="preserve">    participant SQL as SQL Server RDBMS</w:t>
+              <w:br/>
+              <w:br/>
+              <w:t xml:space="preserve">    alt Trường hợp 1: Khách hàng bấm Bỏ Chọn Ghế hoặc Hủy Đơn</w:t>
+              <w:br/>
+              <w:t xml:space="preserve">        User-&gt;&gt;Web: Bấm Bỏ chọn ghế A1 Suất chiếu 101</w:t>
+              <w:br/>
+              <w:t xml:space="preserve">        Web-&gt;&gt;Redis: KeyDelete('seat_lock:101:A1')</w:t>
+              <w:br/>
+              <w:t xml:space="preserve">        Redis--&gt;&gt;Web: Xóa Key giữ ghế thành công</w:t>
+              <w:br/>
+              <w:t xml:space="preserve">        Web--&gt;&gt;User: Ghế A1 trở về trạng thái trống cho người khác chọn</w:t>
+              <w:br/>
+              <w:t xml:space="preserve">    else Trường hợp 2: Khách hàng Hoàn Tất Thanh Toán Hóa Đơn</w:t>
+              <w:br/>
+              <w:t xml:space="preserve">        User-&gt;&gt;Web: Nhấp Thanh Toán Đơn Hàng Thành Công</w:t>
+              <w:br/>
+              <w:t xml:space="preserve">        Web-&gt;&gt;SQL: Lưu Hóa Đơn &amp; Mã Vé vào SQL Server</w:t>
+              <w:br/>
+              <w:t xml:space="preserve">        Web-&gt;&gt;Redis: KeyDelete('seat_lock:101:A1') (Giải phóng khóa tạm)</w:t>
+              <w:br/>
+              <w:t xml:space="preserve">        Redis--&gt;&gt;Web: Xóa Key thành công</w:t>
+              <w:br/>
+              <w:t xml:space="preserve">        Web--&gt;&gt;User: Trả về Vé Xem Phim &amp; Mã QR Code thành công</w:t>
+              <w:br/>
+              <w:t xml:space="preserve">    else Trường hợp 3: Quá 5 Phút Không Thanh Toán (Hết hạn TTL)</w:t>
+              <w:br/>
+              <w:t xml:space="preserve">        Redis-&gt;&gt;Redis: Tự động xóa Key 'seat_lock:101:A1' do TTL = 0</w:t>
+              <w:br/>
+              <w:t xml:space="preserve">        User-&gt;&gt;Web: Bấm Thanh Toán muộn (sau 5 phút)</w:t>
+              <w:br/>
+              <w:t xml:space="preserve">        Web-&gt;&gt;Redis: KeyExists('seat_lock:101:A1')</w:t>
+              <w:br/>
+              <w:t xml:space="preserve">        Redis--&gt;&gt;Web: Trả về False (Key đã hết hạn)</w:t>
+              <w:br/>
+              <w:t xml:space="preserve">        Web--&gt;&gt;User: Thông báo 'Đã hết thời gian giữ ghế 5 phút, vui lòng chọn lại!'</w:t>
+              <w:br/>
+              <w:t xml:space="preserve">    end</w:t>
             </w:r>
           </w:p>
         </w:tc>

</xml_diff>

<commit_message>
[Doc] Cap nhat So do Lop (Class Diagram) Chuong 7 day du 5 CSDL Web Controllers va Data Services
</commit_message>
<xml_diff>
--- a/TaiLieu/TaiLieu_SDS_ToanBo_HeThong_Movana.docx
+++ b/TaiLieu/TaiLieu_SDS_ToanBo_HeThong_Movana.docx
@@ -1772,9 +1772,22 @@
               <w:br/>
               <w:t xml:space="preserve">        +PhimDangChieu() ActionResult</w:t>
               <w:br/>
+              <w:t xml:space="preserve">        +FavoriteMovie(movieId) ActionResult</w:t>
+              <w:br/>
               <w:t xml:space="preserve">    }</w:t>
               <w:br/>
               <w:br/>
+              <w:t xml:space="preserve">    class DatVeController {</w:t>
+              <w:br/>
+              <w:t xml:space="preserve">        +ChonGhe(suatChieuId) ActionResult</w:t>
+              <w:br/>
+              <w:t xml:space="preserve">        +LockSeatRedis(suatChieuId, gheId) JsonResult</w:t>
+              <w:br/>
+              <w:t xml:space="preserve">        +ThanhToan(hoaDonId) ActionResult</w:t>
+              <w:br/>
+              <w:t xml:space="preserve">    }</w:t>
+              <w:br/>
+              <w:br/>
               <w:t xml:space="preserve">    class MgdbCustomerFeedbackController {</w:t>
               <w:br/>
               <w:t xml:space="preserve">        +Index() ActionResult</w:t>
@@ -1786,32 +1799,52 @@
               <w:t xml:space="preserve">    }</w:t>
               <w:br/>
               <w:br/>
+              <w:t xml:space="preserve">    class MgdbPromotionController {</w:t>
+              <w:br/>
+              <w:t xml:space="preserve">        +Index() ActionResult</w:t>
+              <w:br/>
+              <w:t xml:space="preserve">        +ApplyVoucher(code) JsonResult</w:t>
+              <w:br/>
+              <w:t xml:space="preserve">    }</w:t>
+              <w:br/>
+              <w:br/>
+              <w:t xml:space="preserve">    class CassandraController {</w:t>
+              <w:br/>
+              <w:t xml:space="preserve">        +UserLogs(userId) ActionResult</w:t>
+              <w:br/>
+              <w:t xml:space="preserve">        +TicketHistory(userId) ActionResult</w:t>
+              <w:br/>
+              <w:t xml:space="preserve">    }</w:t>
+              <w:br/>
+              <w:br/>
               <w:t xml:space="preserve">    class MgdbService {</w:t>
               <w:br/>
               <w:t xml:space="preserve">        -MongoClient Client</w:t>
               <w:br/>
-              <w:t xml:space="preserve">        +GetFeedbacksByUser()</w:t>
-              <w:br/>
-              <w:t xml:space="preserve">        +AddFeedback()</w:t>
-              <w:br/>
-              <w:t xml:space="preserve">        +ReplyFeedback()</w:t>
+              <w:t xml:space="preserve">        +GetFeedbacksByUser(userId)</w:t>
+              <w:br/>
+              <w:t xml:space="preserve">        +AddFeedback(doc)</w:t>
+              <w:br/>
+              <w:t xml:space="preserve">        +ReplyFeedback(id, replyMsg)</w:t>
               <w:br/>
               <w:t xml:space="preserve">        +GetFeedbackCategoryStats()</w:t>
               <w:br/>
               <w:t xml:space="preserve">        +GetActivePromotions()</w:t>
               <w:br/>
-              <w:t xml:space="preserve">        +ClaimPromotion()</w:t>
+              <w:t xml:space="preserve">        +ClaimPromotion(code)</w:t>
               <w:br/>
               <w:t xml:space="preserve">    }</w:t>
               <w:br/>
               <w:br/>
               <w:t xml:space="preserve">    class Neo4jService {</w:t>
               <w:br/>
-              <w:t xml:space="preserve">        +GetTopBookedMovies()</w:t>
-              <w:br/>
-              <w:t xml:space="preserve">        +GetTopFavoriteMovies()</w:t>
-              <w:br/>
-              <w:t xml:space="preserve">        +ToggleFavorite()</w:t>
+              <w:t xml:space="preserve">        +ExecuteCypher(query)</w:t>
+              <w:br/>
+              <w:t xml:space="preserve">        +GetTopBookedMovies(limit)</w:t>
+              <w:br/>
+              <w:t xml:space="preserve">        +GetTopFavoriteMovies(limit)</w:t>
+              <w:br/>
+              <w:t xml:space="preserve">        +ToggleFavorite(userId, movieId)</w:t>
               <w:br/>
               <w:t xml:space="preserve">        +GetGenreAnalytics()</w:t>
               <w:br/>
@@ -1822,29 +1855,39 @@
               <w:br/>
               <w:t xml:space="preserve">    class CassandraService {</w:t>
               <w:br/>
-              <w:t xml:space="preserve">        +GetActivityLogsByUser()</w:t>
-              <w:br/>
-              <w:t xml:space="preserve">        +LogUserActivity()</w:t>
+              <w:t xml:space="preserve">        +GetActivityLogsByUser(userId)</w:t>
+              <w:br/>
+              <w:t xml:space="preserve">        +LogUserActivity(userId, activityType, desc)</w:t>
+              <w:br/>
+              <w:t xml:space="preserve">        +GetTicketHistoryByUser(userId)</w:t>
+              <w:br/>
+              <w:t xml:space="preserve">        +LogTicketHistory(userId, bookingId, amount)</w:t>
               <w:br/>
               <w:t xml:space="preserve">    }</w:t>
               <w:br/>
               <w:br/>
               <w:t xml:space="preserve">    class RedisManager {</w:t>
               <w:br/>
-              <w:t xml:space="preserve">        +LockSeat()</w:t>
-              <w:br/>
-              <w:t xml:space="preserve">        +UnlockSeat()</w:t>
-              <w:br/>
-              <w:t xml:space="preserve">        +IsSeatLocked()</w:t>
+              <w:t xml:space="preserve">        +LockSeat(suatChieuId, gheId, userId)</w:t>
+              <w:br/>
+              <w:t xml:space="preserve">        +UnlockSeat(suatChieuId, gheId)</w:t>
+              <w:br/>
+              <w:t xml:space="preserve">        +IsSeatLocked(suatChieuId, gheId)</w:t>
               <w:br/>
               <w:t xml:space="preserve">    }</w:t>
               <w:br/>
               <w:br/>
-              <w:t xml:space="preserve">    HomeController --&gt; Neo4jService : Lấy Top Phim</w:t>
-              <w:br/>
-              <w:t xml:space="preserve">    MgdbCustomerFeedbackController --&gt; MgdbService : Thao tác Khiếu nại</w:t>
-              <w:br/>
-              <w:t xml:space="preserve">    HomeController --&gt; CassandraService : Ghi Logs Hoạt động</w:t>
+              <w:t xml:space="preserve">    HomeController --&gt; Neo4jService : Gọi gợi ý &amp; thả tim Phim</w:t>
+              <w:br/>
+              <w:t xml:space="preserve">    DatVeController --&gt; RedisManager : Tạm giữ ghế 5 phút</w:t>
+              <w:br/>
+              <w:t xml:space="preserve">    DatVeController --&gt; CassandraService : Ghi Log thanh toán vé</w:t>
+              <w:br/>
+              <w:t xml:space="preserve">    MgdbCustomerFeedbackController --&gt; MgdbService : Quản lý khiếu nại</w:t>
+              <w:br/>
+              <w:t xml:space="preserve">    MgdbPromotionController --&gt; MgdbService : Tra cứu &amp; Trừ kho Voucher</w:t>
+              <w:br/>
+              <w:t xml:space="preserve">    CassandraController --&gt; CassandraService : Truy vấn nhật ký Big Data</w:t>
             </w:r>
           </w:p>
         </w:tc>

</xml_diff>

<commit_message>
[Doc] Bo sung Gioi Thieu De Tai, Boi Canh va Muc Tieu He Thong vao Chuong 1 cua Tai Lieu SDS
</commit_message>
<xml_diff>
--- a/TaiLieu/TaiLieu_SDS_ToanBo_HeThong_Movana.docx
+++ b/TaiLieu/TaiLieu_SDS_ToanBo_HeThong_Movana.docx
@@ -275,7 +275,7 @@
         <w:rPr>
           <w:rFonts w:ascii="Times New Roman" w:hAnsi="Times New Roman"/>
         </w:rPr>
-        <w:t>[CHƯƠNG 1: TỔNG QUAN KIẾN TRÚC HỆ THỐNG (SYSTEM ARCHITECTURE OVERVIEW)](#chuong-1-tong-quan-kien-truc-he-thong-system-architecture-overview)</w:t>
+        <w:t>[CHƯƠNG 1: TỔNG QUAN HỆ THỐNG VÀ KIẾN TRÚC TỔNG THỂ (SYSTEM OVERVIEW &amp; ARCHITECTURE)](#chuong-1-tong-quan-he-thong-va-kien-truc-tong-the-system-overview--architecture)</w:t>
       </w:r>
     </w:p>
     <w:p>
@@ -384,7 +384,7 @@
           <w:color w:val="004080"/>
           <w:sz w:val="32"/>
         </w:rPr>
-        <w:t>CHƯƠNG 1: TỔNG QUAN KIẾN TRÚC HỆ THỐNG (SYSTEM ARCHITECTURE OVERVIEW)</w:t>
+        <w:t>CHƯƠNG 1: TỔNG QUAN HỆ THỐNG VÀ KIẾN TRÚC TỔNG THỂ (SYSTEM OVERVIEW &amp; ARCHITECTURE)</w:t>
       </w:r>
     </w:p>
     <w:p>
@@ -398,18 +398,251 @@
           <w:color w:val="222222"/>
           <w:sz w:val="28"/>
         </w:rPr>
-        <w:t>1.1 Mô hình Kiến trúc Polyglot Persistence (Đa Cơ Sở Dữ Liệu)</w:t>
+        <w:t>1.1 Giới thiệu Đề tài và Bối cảnh Dự án</w:t>
       </w:r>
     </w:p>
     <w:p>
       <w:pPr>
-        <w:spacing w:before="60" w:after="60" w:line="276" w:lineRule="auto"/>
+        <w:pStyle w:val="ListBullet"/>
+        <w:spacing w:before="40" w:after="40"/>
       </w:pPr>
       <w:r>
         <w:rPr>
           <w:rFonts w:ascii="Times New Roman" w:hAnsi="Times New Roman"/>
         </w:rPr>
-        <w:t>Hệ thống Movana Cinema kết hợp 5 CSDL khác nhau để đạt hiệu năng đọc/ghi và trải nghiệm người dùng tối ưu:</w:t>
+      </w:r>
+      <w:r>
+        <w:rPr>
+          <w:rFonts w:ascii="Times New Roman" w:hAnsi="Times New Roman"/>
+          <w:b/>
+        </w:rPr>
+        <w:t>Tên dự án:</w:t>
+      </w:r>
+      <w:r>
+        <w:rPr>
+          <w:rFonts w:ascii="Times New Roman" w:hAnsi="Times New Roman"/>
+        </w:rPr>
+        <w:t xml:space="preserve"> Hệ Thống Đặt Vé Xem Phim Trực Tuyến Đa CSDL "MOVANA CINEMA".</w:t>
+      </w:r>
+    </w:p>
+    <w:p>
+      <w:pPr>
+        <w:pStyle w:val="ListBullet"/>
+        <w:spacing w:before="40" w:after="40"/>
+      </w:pPr>
+      <w:r>
+        <w:rPr>
+          <w:rFonts w:ascii="Times New Roman" w:hAnsi="Times New Roman"/>
+        </w:rPr>
+      </w:r>
+      <w:r>
+        <w:rPr>
+          <w:rFonts w:ascii="Times New Roman" w:hAnsi="Times New Roman"/>
+          <w:b/>
+        </w:rPr>
+        <w:t>Bối cảnh xây dựng:</w:t>
+      </w:r>
+      <w:r>
+        <w:rPr>
+          <w:rFonts w:ascii="Times New Roman" w:hAnsi="Times New Roman"/>
+        </w:rPr>
+        <w:t xml:space="preserve"> Ngành dịch vụ giải trí chiếu phim trực tuyến đòi hỏi hệ thống thông tin phải phục vụ hàng triệu lượt truy cập đồng thời, xử lý giao dịch tài chính chính xác (ACID), phản hồi tìm kiếm siêu tốc, gợi ý nội dung thông minh và lưu trữ nhật ký truy vết quy mô lớn (Big Data).</w:t>
+      </w:r>
+    </w:p>
+    <w:p>
+      <w:pPr>
+        <w:pStyle w:val="ListBullet"/>
+        <w:spacing w:before="40" w:after="40"/>
+      </w:pPr>
+      <w:r>
+        <w:rPr>
+          <w:rFonts w:ascii="Times New Roman" w:hAnsi="Times New Roman"/>
+        </w:rPr>
+      </w:r>
+      <w:r>
+        <w:rPr>
+          <w:rFonts w:ascii="Times New Roman" w:hAnsi="Times New Roman"/>
+          <w:b/>
+        </w:rPr>
+        <w:t>Giải pháp kĩ thuật:</w:t>
+      </w:r>
+      <w:r>
+        <w:rPr>
+          <w:rFonts w:ascii="Times New Roman" w:hAnsi="Times New Roman"/>
+        </w:rPr>
+        <w:t xml:space="preserve"> Hệ thống áp dụng mô hình kiến trúc </w:t>
+      </w:r>
+      <w:r>
+        <w:rPr>
+          <w:rFonts w:ascii="Times New Roman" w:hAnsi="Times New Roman"/>
+          <w:b/>
+        </w:rPr>
+        <w:t>Polyglot Persistence (Đa cơ sở dữ liệu)</w:t>
+      </w:r>
+      <w:r>
+        <w:rPr>
+          <w:rFonts w:ascii="Times New Roman" w:hAnsi="Times New Roman"/>
+        </w:rPr>
+        <w:t xml:space="preserve"> kết hợp giữa CSDL Quan hệ SQL Server 2019 truyền thống và 4 hệ NoSQL hiện đại (MongoDB, Redis, Neo4j, Apache Cassandra) nhằm khai thác tối đa ưu thế vượt trội của từng công nghệ CSDL.</w:t>
+      </w:r>
+    </w:p>
+    <w:p>
+      <w:pPr>
+        <w:spacing w:before="200" w:after="60"/>
+      </w:pPr>
+      <w:r>
+        <w:rPr>
+          <w:rFonts w:ascii="Times New Roman" w:hAnsi="Times New Roman"/>
+          <w:b/>
+          <w:color w:val="222222"/>
+          <w:sz w:val="28"/>
+        </w:rPr>
+        <w:t>1.2 Mục tiêu Hệ thống</w:t>
+      </w:r>
+    </w:p>
+    <w:p>
+      <w:pPr>
+        <w:spacing w:before="40" w:after="40"/>
+      </w:pPr>
+      <w:r>
+        <w:rPr>
+          <w:rFonts w:ascii="Times New Roman" w:hAnsi="Times New Roman"/>
+        </w:rPr>
+        <w:t xml:space="preserve">1. </w:t>
+      </w:r>
+      <w:r>
+        <w:rPr>
+          <w:rFonts w:ascii="Times New Roman" w:hAnsi="Times New Roman"/>
+          <w:b/>
+        </w:rPr>
+        <w:t>Quản lý giao dịch cốt lõi (SQL Server):</w:t>
+      </w:r>
+      <w:r>
+        <w:rPr>
+          <w:rFonts w:ascii="Times New Roman" w:hAnsi="Times New Roman"/>
+        </w:rPr>
+        <w:t xml:space="preserve"> Đảm bảo tính toàn vẹn dữ liệu tuyệt đối cho các thực thể Phim, Rạp, Suất chiếu, Vé và Hóa đơn tài chính.</w:t>
+      </w:r>
+    </w:p>
+    <w:p>
+      <w:pPr>
+        <w:spacing w:before="40" w:after="40"/>
+      </w:pPr>
+      <w:r>
+        <w:rPr>
+          <w:rFonts w:ascii="Times New Roman" w:hAnsi="Times New Roman"/>
+        </w:rPr>
+        <w:t xml:space="preserve">2. </w:t>
+      </w:r>
+      <w:r>
+        <w:rPr>
+          <w:rFonts w:ascii="Times New Roman" w:hAnsi="Times New Roman"/>
+          <w:b/>
+        </w:rPr>
+        <w:t>Khóa tạm giữ ghế đếm ngược thời gian thực (Redis):</w:t>
+      </w:r>
+      <w:r>
+        <w:rPr>
+          <w:rFonts w:ascii="Times New Roman" w:hAnsi="Times New Roman"/>
+        </w:rPr>
+        <w:t xml:space="preserve"> Giữ tạm thời ghế ngồi trong 5 phút với độ trễ cực thấp (&lt; 1ms), ngăn ngừa xung đột đụng độ 2 người mua cùng 1 ghế.</w:t>
+      </w:r>
+    </w:p>
+    <w:p>
+      <w:pPr>
+        <w:spacing w:before="40" w:after="40"/>
+      </w:pPr>
+      <w:r>
+        <w:rPr>
+          <w:rFonts w:ascii="Times New Roman" w:hAnsi="Times New Roman"/>
+        </w:rPr>
+        <w:t xml:space="preserve">3. </w:t>
+      </w:r>
+      <w:r>
+        <w:rPr>
+          <w:rFonts w:ascii="Times New Roman" w:hAnsi="Times New Roman"/>
+          <w:b/>
+        </w:rPr>
+        <w:t>Mạng đồ thị gợi ý phim thông minh (Neo4j):</w:t>
+      </w:r>
+      <w:r>
+        <w:rPr>
+          <w:rFonts w:ascii="Times New Roman" w:hAnsi="Times New Roman"/>
+        </w:rPr>
+        <w:t xml:space="preserve"> Phân tích mối quan hệ đặt vé và yêu thích của người dùng để đề xuất Bảng xếp hạng Top Phim thịnh hành.</w:t>
+      </w:r>
+    </w:p>
+    <w:p>
+      <w:pPr>
+        <w:spacing w:before="40" w:after="40"/>
+      </w:pPr>
+      <w:r>
+        <w:rPr>
+          <w:rFonts w:ascii="Times New Roman" w:hAnsi="Times New Roman"/>
+        </w:rPr>
+        <w:t xml:space="preserve">4. </w:t>
+      </w:r>
+      <w:r>
+        <w:rPr>
+          <w:rFonts w:ascii="Times New Roman" w:hAnsi="Times New Roman"/>
+          <w:b/>
+        </w:rPr>
+        <w:t>Hệ thống Khiếu nại &amp; Khuyến mãi linh hoạt (MongoDB):</w:t>
+      </w:r>
+      <w:r>
+        <w:rPr>
+          <w:rFonts w:ascii="Times New Roman" w:hAnsi="Times New Roman"/>
+        </w:rPr>
+        <w:t xml:space="preserve"> Lưu trữ cấu trúc Document linh hoạt dạng mảng lồng `conversations` trao đổi sự cố và quản lý mã Voucher chiết khấu.</w:t>
+      </w:r>
+    </w:p>
+    <w:p>
+      <w:pPr>
+        <w:spacing w:before="40" w:after="40"/>
+      </w:pPr>
+      <w:r>
+        <w:rPr>
+          <w:rFonts w:ascii="Times New Roman" w:hAnsi="Times New Roman"/>
+        </w:rPr>
+        <w:t xml:space="preserve">5. </w:t>
+      </w:r>
+      <w:r>
+        <w:rPr>
+          <w:rFonts w:ascii="Times New Roman" w:hAnsi="Times New Roman"/>
+          <w:b/>
+        </w:rPr>
+        <w:t>Nhật ký truy vết hoạt động Big Data (Apache Cassandra):</w:t>
+      </w:r>
+      <w:r>
+        <w:rPr>
+          <w:rFonts w:ascii="Times New Roman" w:hAnsi="Times New Roman"/>
+        </w:rPr>
+        <w:t xml:space="preserve"> Ghi nhận liên tục nhật ký thao tác và lịch sử vé người dùng với tốc độ ghi cao, khả năng mở rộng hàng triệu bản ghi.</w:t>
+      </w:r>
+    </w:p>
+    <w:p>
+      <w:pPr>
+        <w:spacing w:before="200" w:after="60"/>
+      </w:pPr>
+      <w:r>
+        <w:rPr>
+          <w:rFonts w:ascii="Times New Roman" w:hAnsi="Times New Roman"/>
+          <w:b/>
+          <w:color w:val="222222"/>
+          <w:sz w:val="28"/>
+        </w:rPr>
+        <w:t>1.3 Mô hình Kiến trúc Polyglot Persistence (5 Cơ Sở Dữ Liệu)</w:t>
+      </w:r>
+    </w:p>
+    <w:p>
+      <w:pPr>
+        <w:spacing w:before="60" w:after="60" w:line="276" w:lineRule="auto"/>
+      </w:pPr>
+      <w:r>
+        <w:rPr>
+          <w:rFonts w:ascii="Times New Roman" w:hAnsi="Times New Roman"/>
+        </w:rPr>
+        <w:t>Sơ đồ tổng quan kết nối giữa tầng ứng dụng ASP.NET MVC Backend và 5 hệ CSDL:</w:t>
       </w:r>
     </w:p>
     <w:tbl>

</xml_diff>

<commit_message>
[Doc] Bo sung chi tiet kĩ thuat hoan chinh cho Chuong 3 MongoDB, Chuong 4 Redis, Chuong 5 Neo4j, Chuong 6 Cassandra
</commit_message>
<xml_diff>
--- a/TaiLieu/TaiLieu_SDS_ToanBo_HeThong_Movana.docx
+++ b/TaiLieu/TaiLieu_SDS_ToanBo_HeThong_Movana.docx
@@ -1014,18 +1014,80 @@
           <w:color w:val="222222"/>
           <w:sz w:val="28"/>
         </w:rPr>
-        <w:t>3.1 Cấu trúc Collection 1: `customer_feedbacks` (Trung tâm Khiếu nại Hỗ trợ)</w:t>
+        <w:t>3.1 Phạm vi nhiệm vụ &amp; Database Name</w:t>
       </w:r>
     </w:p>
     <w:p>
       <w:pPr>
-        <w:spacing w:before="60" w:after="60" w:line="276" w:lineRule="auto"/>
+        <w:pStyle w:val="ListBullet"/>
+        <w:spacing w:before="40" w:after="40"/>
       </w:pPr>
       <w:r>
         <w:rPr>
           <w:rFonts w:ascii="Times New Roman" w:hAnsi="Times New Roman"/>
         </w:rPr>
-        <w:t>Lưu trữ ticket sự cố với mảng lồng `conversations` (Embedded Document Array) ghi nhận lịch sử phản hồi giữa Admin và Khách hàng.</w:t>
+      </w:r>
+      <w:r>
+        <w:rPr>
+          <w:rFonts w:ascii="Times New Roman" w:hAnsi="Times New Roman"/>
+          <w:b/>
+        </w:rPr>
+        <w:t>Database Name:</w:t>
+      </w:r>
+      <w:r>
+        <w:rPr>
+          <w:rFonts w:ascii="Times New Roman" w:hAnsi="Times New Roman"/>
+        </w:rPr>
+        <w:t xml:space="preserve"> `CinemaNoSQL`</w:t>
+      </w:r>
+    </w:p>
+    <w:p>
+      <w:pPr>
+        <w:pStyle w:val="ListBullet"/>
+        <w:spacing w:before="40" w:after="40"/>
+      </w:pPr>
+      <w:r>
+        <w:rPr>
+          <w:rFonts w:ascii="Times New Roman" w:hAnsi="Times New Roman"/>
+        </w:rPr>
+      </w:r>
+      <w:r>
+        <w:rPr>
+          <w:rFonts w:ascii="Times New Roman" w:hAnsi="Times New Roman"/>
+          <w:b/>
+        </w:rPr>
+        <w:t>Nhiệm vụ:</w:t>
+      </w:r>
+      <w:r>
+        <w:rPr>
+          <w:rFonts w:ascii="Times New Roman" w:hAnsi="Times New Roman"/>
+        </w:rPr>
+        <w:t xml:space="preserve"> Lưu trữ dữ liệu tài liệu bán cấu trúc (Semi-structured Document Data), hỗ trợ mảng lồng động (Embedded Array) cho phản hồi giao tiếp giữa Admin và Khách hàng, quản lý danh mục mã Voucher ưu đãi và thực thi Aggregation thống kê báo cáo sự cố.</w:t>
+      </w:r>
+    </w:p>
+    <w:p>
+      <w:pPr>
+        <w:spacing w:before="200" w:after="60"/>
+      </w:pPr>
+      <w:r>
+        <w:rPr>
+          <w:rFonts w:ascii="Times New Roman" w:hAnsi="Times New Roman"/>
+          <w:b/>
+          <w:color w:val="222222"/>
+          <w:sz w:val="28"/>
+        </w:rPr>
+        <w:t>3.2 Cấu trúc Collection 1: `customer_feedbacks` (Trung tâm Khiếu nại Hỗ trợ)</w:t>
+      </w:r>
+    </w:p>
+    <w:p>
+      <w:pPr>
+        <w:spacing w:before="60" w:after="60" w:line="276" w:lineRule="auto"/>
+      </w:pPr>
+      <w:r>
+        <w:rPr>
+          <w:rFonts w:ascii="Times New Roman" w:hAnsi="Times New Roman"/>
+        </w:rPr>
+        <w:t>Lưu trữ ticket sự cố với mảng lồng `conversations` (Embedded Document Array) ghi nhận lịch sử phản hồi thời gian thực.</w:t>
       </w:r>
     </w:p>
     <w:tbl>
@@ -1069,6 +1131,8 @@
               <w:br/>
               <w:t xml:space="preserve">  "content": "Tôi vừa thanh toán 180.000đ lúc 10h15 qua ví Momo, tiền đã trừ nhưng chưa có vé.",</w:t>
               <w:br/>
+              <w:t xml:space="preserve">  "imageUrls": ["/uploads/momo_bill_001.png"],</w:t>
+              <w:br/>
               <w:t xml:space="preserve">  "status": "Resolved",</w:t>
               <w:br/>
               <w:t xml:space="preserve">  "conversations": [</w:t>
@@ -1109,7 +1173,7 @@
           <w:color w:val="222222"/>
           <w:sz w:val="28"/>
         </w:rPr>
-        <w:t>3.2 Cấu trúc Collection 2: `cinema_promotions` (Kho Mã Giảm Giá Voucher)</w:t>
+        <w:t>3.3 Cấu trúc Collection 2: `cinema_promotions` (Kho Mã Giảm Giá Voucher)</w:t>
       </w:r>
     </w:p>
     <w:p>
@@ -1120,21 +1184,7 @@
         <w:rPr>
           <w:rFonts w:ascii="Times New Roman" w:hAnsi="Times New Roman"/>
         </w:rPr>
-        <w:t>Lưu trữ danh sách mã ưu đãi (`code`, `title`, `discountAmount`, `quantity`, `claimedCount`, `status`, `startDate`, `endDate`).</w:t>
-      </w:r>
-    </w:p>
-    <w:p>
-      <w:pPr>
-        <w:spacing w:before="200" w:after="60"/>
-      </w:pPr>
-      <w:r>
-        <w:rPr>
-          <w:rFonts w:ascii="Times New Roman" w:hAnsi="Times New Roman"/>
-          <w:b/>
-          <w:color w:val="222222"/>
-          <w:sz w:val="28"/>
-        </w:rPr>
-        <w:t>3.3 Thuật toán Aggregation Pipeline (`$group`, `$sum`, `$cond`, `$project`):</w:t>
+        <w:t>Lưu trữ danh sách các chương trình khuyến mãi ưu đãi đặt vé.</w:t>
       </w:r>
     </w:p>
     <w:tbl>
@@ -1162,27 +1212,27 @@
                 <w:color w:val="1F2428"/>
                 <w:sz w:val="21"/>
               </w:rPr>
-              <w:t>db.customer_feedbacks.aggregate([</w:t>
-              <w:br/>
-              <w:t xml:space="preserve">  {</w:t>
-              <w:br/>
-              <w:t xml:space="preserve">    $group: {</w:t>
-              <w:br/>
-              <w:t xml:space="preserve">      _id: "$category",</w:t>
-              <w:br/>
-              <w:t xml:space="preserve">      totalTickets: { $sum: 1 },</w:t>
-              <w:br/>
-              <w:t xml:space="preserve">      resolvedCount: { $sum: { $cond: [{ $eq: ["$status", "Resolved"] }, 1, 0] } },</w:t>
-              <w:br/>
-              <w:t xml:space="preserve">      pendingCount: { $sum: { $cond: [{ $ne: ["$status", "Resolved"] }, 1, 0] } }</w:t>
-              <w:br/>
-              <w:t xml:space="preserve">    }</w:t>
-              <w:br/>
-              <w:t xml:space="preserve">  },</w:t>
-              <w:br/>
-              <w:t xml:space="preserve">  { $project: { _id: 0, category: "$_id", totalTickets: 1, resolvedCount: 1, pendingCount: 1 } }</w:t>
-              <w:br/>
-              <w:t>]);</w:t>
+              <w:t>{</w:t>
+              <w:br/>
+              <w:t xml:space="preserve">  "_id": { "$oid": "6a71eaa38676d746beb73499" },</w:t>
+              <w:br/>
+              <w:t xml:space="preserve">  "code": "MOVANA50K",</w:t>
+              <w:br/>
+              <w:t xml:space="preserve">  "title": "Giảm ngay 50.000đ cho đơn hàng từ 150.000đ",</w:t>
+              <w:br/>
+              <w:t xml:space="preserve">  "discountAmount": 50000,</w:t>
+              <w:br/>
+              <w:t xml:space="preserve">  "quantity": 100,</w:t>
+              <w:br/>
+              <w:t xml:space="preserve">  "claimedCount": 45,</w:t>
+              <w:br/>
+              <w:t xml:space="preserve">  "status": "Active",</w:t>
+              <w:br/>
+              <w:t xml:space="preserve">  "startDate": { "$date": "2026-08-01T00:00:00.000Z" },</w:t>
+              <w:br/>
+              <w:t xml:space="preserve">  "endDate": { "$date": "2026-08-31T23:59:59.000Z" }</w:t>
+              <w:br/>
+              <w:t>}</w:t>
             </w:r>
           </w:p>
         </w:tc>
@@ -1192,31 +1242,6 @@
       <w:pPr>
         <w:spacing w:before="0" w:after="80"/>
       </w:pPr>
-    </w:p>
-    <w:p>
-      <w:pPr>
-        <w:spacing w:before="60" w:after="60" w:line="276" w:lineRule="auto"/>
-      </w:pPr>
-      <w:r>
-        <w:rPr>
-          <w:rFonts w:ascii="Times New Roman" w:hAnsi="Times New Roman"/>
-        </w:rPr>
-        <w:t>---</w:t>
-      </w:r>
-    </w:p>
-    <w:p>
-      <w:pPr>
-        <w:spacing w:before="280" w:after="80"/>
-      </w:pPr>
-      <w:r>
-        <w:rPr>
-          <w:rFonts w:ascii="Times New Roman" w:hAnsi="Times New Roman"/>
-          <w:b/>
-          <w:color w:val="004080"/>
-          <w:sz w:val="32"/>
-        </w:rPr>
-        <w:t>CHƯƠNG 4: THIẾT KẾ CSDL NOSQL REDIS (KEY-VALUE STORE DESIGN)</w:t>
-      </w:r>
     </w:p>
     <w:p>
       <w:pPr>
@@ -1229,118 +1254,7 @@
           <w:color w:val="222222"/>
           <w:sz w:val="28"/>
         </w:rPr>
-        <w:t>4.1 Phạm vi nhiệm vụ</w:t>
-      </w:r>
-    </w:p>
-    <w:p>
-      <w:pPr>
-        <w:spacing w:before="60" w:after="60" w:line="276" w:lineRule="auto"/>
-      </w:pPr>
-      <w:r>
-        <w:rPr>
-          <w:rFonts w:ascii="Times New Roman" w:hAnsi="Times New Roman"/>
-        </w:rPr>
-        <w:t>Thực hiện khóa tạm thời ghế ngồi (Realtime Seat Locking) khi người dùng đang chọn ghế đặt vé, ngăn chặn đụng độ 2 người mua cùng 1 ghế.</w:t>
-      </w:r>
-    </w:p>
-    <w:p>
-      <w:pPr>
-        <w:spacing w:before="200" w:after="60"/>
-      </w:pPr>
-      <w:r>
-        <w:rPr>
-          <w:rFonts w:ascii="Times New Roman" w:hAnsi="Times New Roman"/>
-          <w:b/>
-          <w:color w:val="222222"/>
-          <w:sz w:val="28"/>
-        </w:rPr>
-        <w:t>4.2 Thiết kế Key Pattern &amp; TTL:</w:t>
-      </w:r>
-    </w:p>
-    <w:p>
-      <w:pPr>
-        <w:pStyle w:val="ListBullet"/>
-        <w:spacing w:before="40" w:after="40"/>
-      </w:pPr>
-      <w:r>
-        <w:rPr>
-          <w:rFonts w:ascii="Times New Roman" w:hAnsi="Times New Roman"/>
-        </w:rPr>
-      </w:r>
-      <w:r>
-        <w:rPr>
-          <w:rFonts w:ascii="Times New Roman" w:hAnsi="Times New Roman"/>
-          <w:b/>
-        </w:rPr>
-        <w:t>Cấu trúc Key:</w:t>
-      </w:r>
-      <w:r>
-        <w:rPr>
-          <w:rFonts w:ascii="Times New Roman" w:hAnsi="Times New Roman"/>
-        </w:rPr>
-        <w:t xml:space="preserve"> `seat_lock:{SuatChieuID}:{GheID}` (Ví dụ: `seat_lock:101:A1`)</w:t>
-      </w:r>
-    </w:p>
-    <w:p>
-      <w:pPr>
-        <w:pStyle w:val="ListBullet"/>
-        <w:spacing w:before="40" w:after="40"/>
-      </w:pPr>
-      <w:r>
-        <w:rPr>
-          <w:rFonts w:ascii="Times New Roman" w:hAnsi="Times New Roman"/>
-        </w:rPr>
-      </w:r>
-      <w:r>
-        <w:rPr>
-          <w:rFonts w:ascii="Times New Roman" w:hAnsi="Times New Roman"/>
-          <w:b/>
-        </w:rPr>
-        <w:t>Giá trị (Value):</w:t>
-      </w:r>
-      <w:r>
-        <w:rPr>
-          <w:rFonts w:ascii="Times New Roman" w:hAnsi="Times New Roman"/>
-        </w:rPr>
-        <w:t xml:space="preserve"> `UserID:{UserID}` (Ví dụ: `UserID:7`)</w:t>
-      </w:r>
-    </w:p>
-    <w:p>
-      <w:pPr>
-        <w:pStyle w:val="ListBullet"/>
-        <w:spacing w:before="40" w:after="40"/>
-      </w:pPr>
-      <w:r>
-        <w:rPr>
-          <w:rFonts w:ascii="Times New Roman" w:hAnsi="Times New Roman"/>
-        </w:rPr>
-      </w:r>
-      <w:r>
-        <w:rPr>
-          <w:rFonts w:ascii="Times New Roman" w:hAnsi="Times New Roman"/>
-          <w:b/>
-        </w:rPr>
-        <w:t>Thời gian hết hạn (TTL):</w:t>
-      </w:r>
-      <w:r>
-        <w:rPr>
-          <w:rFonts w:ascii="Times New Roman" w:hAnsi="Times New Roman"/>
-        </w:rPr>
-        <w:t xml:space="preserve"> `300` giây (5 phút). Sau 5 phút, Key tự động xóa để giải phóng ghế.</w:t>
-      </w:r>
-    </w:p>
-    <w:p>
-      <w:pPr>
-        <w:spacing w:before="200" w:after="60"/>
-      </w:pPr>
-      <w:r>
-        <w:rPr>
-          <w:rFonts w:ascii="Times New Roman" w:hAnsi="Times New Roman"/>
-          <w:b/>
-          <w:color w:val="222222"/>
-          <w:sz w:val="28"/>
-        </w:rPr>
-        <w:t>4.3 Mã lệnh C# Tương tác Redis (StackExchange.Redis):</w:t>
+        <w:t>3.4 Thiết lập Chỉ Mục (Indexing) Tối Ưu Truy Vấn MongoDB:</w:t>
       </w:r>
     </w:p>
     <w:tbl>
@@ -1368,19 +1282,19 @@
                 <w:color w:val="1F2428"/>
                 <w:sz w:val="21"/>
               </w:rPr>
-              <w:t>// 1. Đặt khóa giữ ghế trong 5 phút (TTL 300s)</w:t>
-              <w:br/>
-              <w:t>bool isLocked = redisDb.StringSet($"seat_lock:{suatChieuId}:{gheId}", $"UserID:{userId}", TimeSpan.FromMinutes(5), When.NotExists);</w:t>
-              <w:br/>
-              <w:br/>
-              <w:t>// 2. Kiểm tra trạng thái ghế realtime</w:t>
-              <w:br/>
-              <w:t>bool isCurrentlyLocked = redisDb.KeyExists($"seat_lock:{suatChieuId}:{gheId}");</w:t>
-              <w:br/>
-              <w:br/>
-              <w:t>// 3. Giải phóng / Xóa khóa giữ ghế khi thanh toán xong hoặc khách bỏ chọn</w:t>
-              <w:br/>
-              <w:t>redisDb.KeyDelete($"seat_lock:{suatChieuId}:{gheId}");</w:t>
+              <w:t>// Chỉ mục tìm kiếm theo tài khoản Khách hàng</w:t>
+              <w:br/>
+              <w:t>db.customer_feedbacks.createIndex({ "username": 1 });</w:t>
+              <w:br/>
+              <w:br/>
+              <w:t>// Chỉ mục tìm kiếm theo Trạng thái Ticket</w:t>
+              <w:br/>
+              <w:t>db.customer_feedbacks.createIndex({ "status": 1 });</w:t>
+              <w:br/>
+              <w:br/>
+              <w:t>// Chỉ mục duy nhất (Unique Index) mã Voucher Khuyến mãi</w:t>
+              <w:br/>
+              <w:t>db.cinema_promotions.createIndex({ "code": 1 }, { unique: true });</w:t>
             </w:r>
           </w:p>
         </w:tc>
@@ -1390,31 +1304,6 @@
       <w:pPr>
         <w:spacing w:before="0" w:after="80"/>
       </w:pPr>
-    </w:p>
-    <w:p>
-      <w:pPr>
-        <w:spacing w:before="60" w:after="60" w:line="276" w:lineRule="auto"/>
-      </w:pPr>
-      <w:r>
-        <w:rPr>
-          <w:rFonts w:ascii="Times New Roman" w:hAnsi="Times New Roman"/>
-        </w:rPr>
-        <w:t>---</w:t>
-      </w:r>
-    </w:p>
-    <w:p>
-      <w:pPr>
-        <w:spacing w:before="280" w:after="80"/>
-      </w:pPr>
-      <w:r>
-        <w:rPr>
-          <w:rFonts w:ascii="Times New Roman" w:hAnsi="Times New Roman"/>
-          <w:b/>
-          <w:color w:val="004080"/>
-          <w:sz w:val="32"/>
-        </w:rPr>
-        <w:t>CHƯƠNG 5: THIẾT KẾ CSDL NOSQL NEO4J (GRAPH DATABASE DESIGN)</w:t>
-      </w:r>
     </w:p>
     <w:p>
       <w:pPr>
@@ -1427,164 +1316,7 @@
           <w:color w:val="222222"/>
           <w:sz w:val="28"/>
         </w:rPr>
-        <w:t>5.1 Phạm vi nhiệm vụ</w:t>
-      </w:r>
-    </w:p>
-    <w:p>
-      <w:pPr>
-        <w:spacing w:before="60" w:after="60" w:line="276" w:lineRule="auto"/>
-      </w:pPr>
-      <w:r>
-        <w:rPr>
-          <w:rFonts w:ascii="Times New Roman" w:hAnsi="Times New Roman"/>
-        </w:rPr>
-        <w:t>Lưu trữ cấu trúc đồ thị mối quan hệ giữa Người Dùng, Bộ Phim và Thể Loại Phim để tính toán gợi ý Top Phim Thịnh Hành &amp; Thống kê độ phổ biến.</w:t>
-      </w:r>
-    </w:p>
-    <w:p>
-      <w:pPr>
-        <w:spacing w:before="200" w:after="60"/>
-      </w:pPr>
-      <w:r>
-        <w:rPr>
-          <w:rFonts w:ascii="Times New Roman" w:hAnsi="Times New Roman"/>
-          <w:b/>
-          <w:color w:val="222222"/>
-          <w:sz w:val="28"/>
-        </w:rPr>
-        <w:t>5.2 Sơ đồ Đồ thị (Graph Model):</w:t>
-      </w:r>
-    </w:p>
-    <w:p>
-      <w:pPr>
-        <w:pStyle w:val="ListBullet"/>
-        <w:spacing w:before="40" w:after="40"/>
-      </w:pPr>
-      <w:r>
-        <w:rPr>
-          <w:rFonts w:ascii="Times New Roman" w:hAnsi="Times New Roman"/>
-        </w:rPr>
-      </w:r>
-      <w:r>
-        <w:rPr>
-          <w:rFonts w:ascii="Times New Roman" w:hAnsi="Times New Roman"/>
-          <w:b/>
-        </w:rPr>
-        <w:t>Nodes:</w:t>
-      </w:r>
-      <w:r>
-        <w:rPr>
-          <w:rFonts w:ascii="Times New Roman" w:hAnsi="Times New Roman"/>
-        </w:rPr>
-      </w:r>
-    </w:p>
-    <w:p>
-      <w:pPr>
-        <w:pStyle w:val="ListBullet"/>
-        <w:spacing w:before="40" w:after="40"/>
-      </w:pPr>
-      <w:r>
-        <w:rPr>
-          <w:rFonts w:ascii="Times New Roman" w:hAnsi="Times New Roman"/>
-        </w:rPr>
-        <w:t>`(:User {userId: 'huy', username: 'huy'})`</w:t>
-      </w:r>
-    </w:p>
-    <w:p>
-      <w:pPr>
-        <w:pStyle w:val="ListBullet"/>
-        <w:spacing w:before="40" w:after="40"/>
-      </w:pPr>
-      <w:r>
-        <w:rPr>
-          <w:rFonts w:ascii="Times New Roman" w:hAnsi="Times New Roman"/>
-        </w:rPr>
-        <w:t>`(:Movie {movieId: 101, title: 'Lật Mặt 7', poster: '001.png', duration: 120})`</w:t>
-      </w:r>
-    </w:p>
-    <w:p>
-      <w:pPr>
-        <w:pStyle w:val="ListBullet"/>
-        <w:spacing w:before="40" w:after="40"/>
-      </w:pPr>
-      <w:r>
-        <w:rPr>
-          <w:rFonts w:ascii="Times New Roman" w:hAnsi="Times New Roman"/>
-        </w:rPr>
-        <w:t>`(:Genre {genreId: 1, genreName: 'Hành Động'})`</w:t>
-      </w:r>
-    </w:p>
-    <w:p>
-      <w:pPr>
-        <w:pStyle w:val="ListBullet"/>
-        <w:spacing w:before="40" w:after="40"/>
-      </w:pPr>
-      <w:r>
-        <w:rPr>
-          <w:rFonts w:ascii="Times New Roman" w:hAnsi="Times New Roman"/>
-        </w:rPr>
-      </w:r>
-      <w:r>
-        <w:rPr>
-          <w:rFonts w:ascii="Times New Roman" w:hAnsi="Times New Roman"/>
-          <w:b/>
-        </w:rPr>
-        <w:t>Relationships:</w:t>
-      </w:r>
-      <w:r>
-        <w:rPr>
-          <w:rFonts w:ascii="Times New Roman" w:hAnsi="Times New Roman"/>
-        </w:rPr>
-      </w:r>
-    </w:p>
-    <w:p>
-      <w:pPr>
-        <w:pStyle w:val="ListBullet"/>
-        <w:spacing w:before="40" w:after="40"/>
-      </w:pPr>
-      <w:r>
-        <w:rPr>
-          <w:rFonts w:ascii="Times New Roman" w:hAnsi="Times New Roman"/>
-        </w:rPr>
-        <w:t>`(:User)-[:BOOKED {bookingId: 'HD001', seatCount: 2, date: '2026-08-01'}]-&gt;(:Movie)`</w:t>
-      </w:r>
-    </w:p>
-    <w:p>
-      <w:pPr>
-        <w:pStyle w:val="ListBullet"/>
-        <w:spacing w:before="40" w:after="40"/>
-      </w:pPr>
-      <w:r>
-        <w:rPr>
-          <w:rFonts w:ascii="Times New Roman" w:hAnsi="Times New Roman"/>
-        </w:rPr>
-        <w:t>`(:User)-[:FAVORITED]-&gt;(:Movie)`</w:t>
-      </w:r>
-    </w:p>
-    <w:p>
-      <w:pPr>
-        <w:pStyle w:val="ListBullet"/>
-        <w:spacing w:before="40" w:after="40"/>
-      </w:pPr>
-      <w:r>
-        <w:rPr>
-          <w:rFonts w:ascii="Times New Roman" w:hAnsi="Times New Roman"/>
-        </w:rPr>
-        <w:t>`(:Movie)-[:BELONGS_TO]-&gt;(:Genre)`</w:t>
-      </w:r>
-    </w:p>
-    <w:p>
-      <w:pPr>
-        <w:spacing w:before="200" w:after="60"/>
-      </w:pPr>
-      <w:r>
-        <w:rPr>
-          <w:rFonts w:ascii="Times New Roman" w:hAnsi="Times New Roman"/>
-          <w:b/>
-          <w:color w:val="222222"/>
-          <w:sz w:val="28"/>
-        </w:rPr>
-        <w:t>5.3 Bộ Câu lệnh Cypher Query Đầy Đủ:</w:t>
+        <w:t>3.5 Bộ Thao Tác Lệnh Mongo Shell CRUD &amp; Aggregation Pipeline:</w:t>
       </w:r>
     </w:p>
     <w:tbl>
@@ -1612,7 +1344,672 @@
                 <w:color w:val="1F2428"/>
                 <w:sz w:val="21"/>
               </w:rPr>
-              <w:t>// 1. Top Phim Được Đặt Vé Nhiều Nhất</w:t>
+              <w:t>// 1. Create - Gửi khiếu nại mới</w:t>
+              <w:br/>
+              <w:t>db.customer_feedbacks.insertOne({</w:t>
+              <w:br/>
+              <w:t xml:space="preserve">  "userId": 7, "username": "huy", "email": "huy@gmail.com",</w:t>
+              <w:br/>
+              <w:t xml:space="preserve">  "category": "Thanh toán", "subject": "Sự cố giao dịch Momo",</w:t>
+              <w:br/>
+              <w:t xml:space="preserve">  "content": "Đã trừ tiền nhưng chưa nhận mã vé", "status": "New",</w:t>
+              <w:br/>
+              <w:t xml:space="preserve">  "conversations": [], "createdAt": new Date()</w:t>
+              <w:br/>
+              <w:t>});</w:t>
+              <w:br/>
+              <w:br/>
+              <w:t>// 2. Read - Xem lịch sử ticket của tài khoản</w:t>
+              <w:br/>
+              <w:t>db.customer_feedbacks.find({ "username": "huy" }).sort({ "createdAt": -1 });</w:t>
+              <w:br/>
+              <w:br/>
+              <w:t>// 3. Update - Admin trả lời ticket và đổi trạng thái sang Resolved</w:t>
+              <w:br/>
+              <w:t>db.customer_feedbacks.updateOne(</w:t>
+              <w:br/>
+              <w:t xml:space="preserve">  { "_id": ObjectId("6a71eaa38676d746beb73484") },</w:t>
+              <w:br/>
+              <w:t xml:space="preserve">  {</w:t>
+              <w:br/>
+              <w:t xml:space="preserve">    $push: { "conversations": { "sender": "Admin", "message": "Đã xử lý xong", "createdAt": new Date() } },</w:t>
+              <w:br/>
+              <w:t xml:space="preserve">    $set: { "status": "Resolved" }</w:t>
+              <w:br/>
+              <w:t xml:space="preserve">  }</w:t>
+              <w:br/>
+              <w:t>);</w:t>
+              <w:br/>
+              <w:br/>
+              <w:t>// 4. Aggregation Pipeline - Thống kê số lượng ticket theo Chuyên mục</w:t>
+              <w:br/>
+              <w:t>db.customer_feedbacks.aggregate([</w:t>
+              <w:br/>
+              <w:t xml:space="preserve">  {</w:t>
+              <w:br/>
+              <w:t xml:space="preserve">    $group: {</w:t>
+              <w:br/>
+              <w:t xml:space="preserve">      _id: "$category",</w:t>
+              <w:br/>
+              <w:t xml:space="preserve">      totalTickets: { $sum: 1 },</w:t>
+              <w:br/>
+              <w:t xml:space="preserve">      resolvedCount: { $sum: { $cond: [{ $eq: ["$status", "Resolved"] }, 1, 0] } },</w:t>
+              <w:br/>
+              <w:t xml:space="preserve">      pendingCount: { $sum: { $cond: [{ $ne: ["$status", "Resolved"] }, 1, 0] } }</w:t>
+              <w:br/>
+              <w:t xml:space="preserve">    }</w:t>
+              <w:br/>
+              <w:t xml:space="preserve">  },</w:t>
+              <w:br/>
+              <w:t xml:space="preserve">  { $project: { _id: 0, category: "$_id", totalTickets: 1, resolvedCount: 1, pendingCount: 1 } }</w:t>
+              <w:br/>
+              <w:t>]);</w:t>
+            </w:r>
+          </w:p>
+        </w:tc>
+      </w:tr>
+    </w:tbl>
+    <w:p>
+      <w:pPr>
+        <w:spacing w:before="0" w:after="80"/>
+      </w:pPr>
+    </w:p>
+    <w:p>
+      <w:pPr>
+        <w:spacing w:before="200" w:after="60"/>
+      </w:pPr>
+      <w:r>
+        <w:rPr>
+          <w:rFonts w:ascii="Times New Roman" w:hAnsi="Times New Roman"/>
+          <w:b/>
+          <w:color w:val="222222"/>
+          <w:sz w:val="28"/>
+        </w:rPr>
+        <w:t>3.6 Mã C# Tương Tác MongoDB Driver (`MgdbService.cs`):</w:t>
+      </w:r>
+    </w:p>
+    <w:tbl>
+      <w:tblPr>
+        <w:tblW w:type="auto" w:w="0"/>
+        <w:jc w:val="center"/>
+        <w:tblLook w:firstColumn="1" w:firstRow="1" w:lastColumn="0" w:lastRow="0" w:noHBand="0" w:noVBand="1" w:val="04A0"/>
+      </w:tblPr>
+      <w:tblGrid>
+        <w:gridCol w:w="8640"/>
+      </w:tblGrid>
+      <w:tr>
+        <w:tc>
+          <w:tcPr>
+            <w:tcW w:type="dxa" w:w="8640"/>
+            <w:shd w:val="clear" w:color="auto" w:fill="F4F4F6"/>
+          </w:tcPr>
+          <w:p>
+            <w:pPr>
+              <w:spacing w:before="80" w:after="80"/>
+            </w:pPr>
+            <w:r>
+              <w:rPr>
+                <w:rFonts w:ascii="Consolas" w:hAnsi="Consolas"/>
+                <w:color w:val="1F2428"/>
+                <w:sz w:val="21"/>
+              </w:rPr>
+              <w:t>// Đẩy câu trả lời Admin vào mảng lồng conversations</w:t>
+              <w:br/>
+              <w:t>var filter = Builders&lt;CustomerFeedbackDoc&gt;.Filter.Eq(x =&gt; x.Id, ticketId);</w:t>
+              <w:br/>
+              <w:t>var update = Builders&lt;CustomerFeedbackDoc&gt;.Update</w:t>
+              <w:br/>
+              <w:t xml:space="preserve">    .Push(x =&gt; x.Conversations, new ConversationItem { Sender = "Admin", Message = replyMsg, CreatedAt = DateTime.Now })</w:t>
+              <w:br/>
+              <w:t xml:space="preserve">    .Set(x =&gt; x.Status, "Resolved");</w:t>
+              <w:br/>
+              <w:t>FeedbacksCollection.UpdateOne(filter, update);</w:t>
+            </w:r>
+          </w:p>
+        </w:tc>
+      </w:tr>
+    </w:tbl>
+    <w:p>
+      <w:pPr>
+        <w:spacing w:before="0" w:after="80"/>
+      </w:pPr>
+    </w:p>
+    <w:p>
+      <w:pPr>
+        <w:spacing w:before="60" w:after="60" w:line="276" w:lineRule="auto"/>
+      </w:pPr>
+      <w:r>
+        <w:rPr>
+          <w:rFonts w:ascii="Times New Roman" w:hAnsi="Times New Roman"/>
+        </w:rPr>
+        <w:t>---</w:t>
+      </w:r>
+    </w:p>
+    <w:p>
+      <w:pPr>
+        <w:spacing w:before="280" w:after="80"/>
+      </w:pPr>
+      <w:r>
+        <w:rPr>
+          <w:rFonts w:ascii="Times New Roman" w:hAnsi="Times New Roman"/>
+          <w:b/>
+          <w:color w:val="004080"/>
+          <w:sz w:val="32"/>
+        </w:rPr>
+        <w:t>CHƯƠNG 4: THIẾT KẾ CSDL NOSQL REDIS (KEY-VALUE STORE DESIGN)</w:t>
+      </w:r>
+    </w:p>
+    <w:p>
+      <w:pPr>
+        <w:spacing w:before="200" w:after="60"/>
+      </w:pPr>
+      <w:r>
+        <w:rPr>
+          <w:rFonts w:ascii="Times New Roman" w:hAnsi="Times New Roman"/>
+          <w:b/>
+          <w:color w:val="222222"/>
+          <w:sz w:val="28"/>
+        </w:rPr>
+        <w:t>4.1 Phạm vi nhiệm vụ &amp; Cơ chế TTL</w:t>
+      </w:r>
+    </w:p>
+    <w:p>
+      <w:pPr>
+        <w:pStyle w:val="ListBullet"/>
+        <w:spacing w:before="40" w:after="40"/>
+      </w:pPr>
+      <w:r>
+        <w:rPr>
+          <w:rFonts w:ascii="Times New Roman" w:hAnsi="Times New Roman"/>
+        </w:rPr>
+      </w:r>
+      <w:r>
+        <w:rPr>
+          <w:rFonts w:ascii="Times New Roman" w:hAnsi="Times New Roman"/>
+          <w:b/>
+        </w:rPr>
+        <w:t>Loại CSDL:</w:t>
+      </w:r>
+      <w:r>
+        <w:rPr>
+          <w:rFonts w:ascii="Times New Roman" w:hAnsi="Times New Roman"/>
+        </w:rPr>
+        <w:t xml:space="preserve"> Key-Value In-Memory Store (Redis Server 7.0).</w:t>
+      </w:r>
+    </w:p>
+    <w:p>
+      <w:pPr>
+        <w:pStyle w:val="ListBullet"/>
+        <w:spacing w:before="40" w:after="40"/>
+      </w:pPr>
+      <w:r>
+        <w:rPr>
+          <w:rFonts w:ascii="Times New Roman" w:hAnsi="Times New Roman"/>
+        </w:rPr>
+      </w:r>
+      <w:r>
+        <w:rPr>
+          <w:rFonts w:ascii="Times New Roman" w:hAnsi="Times New Roman"/>
+          <w:b/>
+        </w:rPr>
+        <w:t>Phạm vi:</w:t>
+      </w:r>
+      <w:r>
+        <w:rPr>
+          <w:rFonts w:ascii="Times New Roman" w:hAnsi="Times New Roman"/>
+        </w:rPr>
+        <w:t xml:space="preserve"> Khóa tạm thời ghế ngồi (Realtime Seat Locking) khi Khách hàng thao tác chọn ghế đặt vé, ngăn đụng độ 2 người mua cùng 1 ghế.</w:t>
+      </w:r>
+    </w:p>
+    <w:p>
+      <w:pPr>
+        <w:pStyle w:val="ListBullet"/>
+        <w:spacing w:before="40" w:after="40"/>
+      </w:pPr>
+      <w:r>
+        <w:rPr>
+          <w:rFonts w:ascii="Times New Roman" w:hAnsi="Times New Roman"/>
+        </w:rPr>
+      </w:r>
+      <w:r>
+        <w:rPr>
+          <w:rFonts w:ascii="Times New Roman" w:hAnsi="Times New Roman"/>
+          <w:b/>
+        </w:rPr>
+        <w:t>Thời gian đếm ngược (TTL):</w:t>
+      </w:r>
+      <w:r>
+        <w:rPr>
+          <w:rFonts w:ascii="Times New Roman" w:hAnsi="Times New Roman"/>
+        </w:rPr>
+        <w:t xml:space="preserve"> `300` giây (5 phút). Sau 5 phút, Key tự động hủy để trả lại ghế cho người khác.</w:t>
+      </w:r>
+    </w:p>
+    <w:p>
+      <w:pPr>
+        <w:spacing w:before="200" w:after="60"/>
+      </w:pPr>
+      <w:r>
+        <w:rPr>
+          <w:rFonts w:ascii="Times New Roman" w:hAnsi="Times New Roman"/>
+          <w:b/>
+          <w:color w:val="222222"/>
+          <w:sz w:val="28"/>
+        </w:rPr>
+        <w:t>4.2 Cấu trúc Key Pattern &amp; Kiểu Dữ Liệu:</w:t>
+      </w:r>
+    </w:p>
+    <w:p>
+      <w:pPr>
+        <w:pStyle w:val="ListBullet"/>
+        <w:spacing w:before="40" w:after="40"/>
+      </w:pPr>
+      <w:r>
+        <w:rPr>
+          <w:rFonts w:ascii="Times New Roman" w:hAnsi="Times New Roman"/>
+        </w:rPr>
+      </w:r>
+      <w:r>
+        <w:rPr>
+          <w:rFonts w:ascii="Times New Roman" w:hAnsi="Times New Roman"/>
+          <w:b/>
+        </w:rPr>
+        <w:t>Key Pattern giữ ghế:</w:t>
+      </w:r>
+      <w:r>
+        <w:rPr>
+          <w:rFonts w:ascii="Times New Roman" w:hAnsi="Times New Roman"/>
+        </w:rPr>
+        <w:t xml:space="preserve"> `seat_lock:{SuatChieuID}:{GheID}` (Ví dụ: `seat_lock:101:A1`).</w:t>
+      </w:r>
+    </w:p>
+    <w:p>
+      <w:pPr>
+        <w:pStyle w:val="ListBullet"/>
+        <w:spacing w:before="40" w:after="40"/>
+      </w:pPr>
+      <w:r>
+        <w:rPr>
+          <w:rFonts w:ascii="Times New Roman" w:hAnsi="Times New Roman"/>
+        </w:rPr>
+      </w:r>
+      <w:r>
+        <w:rPr>
+          <w:rFonts w:ascii="Times New Roman" w:hAnsi="Times New Roman"/>
+          <w:b/>
+        </w:rPr>
+        <w:t>Value:</w:t>
+      </w:r>
+      <w:r>
+        <w:rPr>
+          <w:rFonts w:ascii="Times New Roman" w:hAnsi="Times New Roman"/>
+        </w:rPr>
+        <w:t xml:space="preserve"> `UserID:{UserID}` (Ví dụ: `UserID:7`).</w:t>
+      </w:r>
+    </w:p>
+    <w:p>
+      <w:pPr>
+        <w:pStyle w:val="ListBullet"/>
+        <w:spacing w:before="40" w:after="40"/>
+      </w:pPr>
+      <w:r>
+        <w:rPr>
+          <w:rFonts w:ascii="Times New Roman" w:hAnsi="Times New Roman"/>
+        </w:rPr>
+      </w:r>
+      <w:r>
+        <w:rPr>
+          <w:rFonts w:ascii="Times New Roman" w:hAnsi="Times New Roman"/>
+          <w:b/>
+        </w:rPr>
+        <w:t>Data Type:</w:t>
+      </w:r>
+      <w:r>
+        <w:rPr>
+          <w:rFonts w:ascii="Times New Roman" w:hAnsi="Times New Roman"/>
+        </w:rPr>
+        <w:t xml:space="preserve"> `String`.</w:t>
+      </w:r>
+    </w:p>
+    <w:p>
+      <w:pPr>
+        <w:spacing w:before="200" w:after="60"/>
+      </w:pPr>
+      <w:r>
+        <w:rPr>
+          <w:rFonts w:ascii="Times New Roman" w:hAnsi="Times New Roman"/>
+          <w:b/>
+          <w:color w:val="222222"/>
+          <w:sz w:val="28"/>
+        </w:rPr>
+        <w:t>4.3 Bộ Lệnh Redis Shell Command:</w:t>
+      </w:r>
+    </w:p>
+    <w:tbl>
+      <w:tblPr>
+        <w:tblW w:type="auto" w:w="0"/>
+        <w:jc w:val="center"/>
+        <w:tblLook w:firstColumn="1" w:firstRow="1" w:lastColumn="0" w:lastRow="0" w:noHBand="0" w:noVBand="1" w:val="04A0"/>
+      </w:tblPr>
+      <w:tblGrid>
+        <w:gridCol w:w="8640"/>
+      </w:tblGrid>
+      <w:tr>
+        <w:tc>
+          <w:tcPr>
+            <w:tcW w:type="dxa" w:w="8640"/>
+            <w:shd w:val="clear" w:color="auto" w:fill="F4F4F6"/>
+          </w:tcPr>
+          <w:p>
+            <w:pPr>
+              <w:spacing w:before="80" w:after="80"/>
+            </w:pPr>
+            <w:r>
+              <w:rPr>
+                <w:rFonts w:ascii="Consolas" w:hAnsi="Consolas"/>
+                <w:color w:val="1F2428"/>
+                <w:sz w:val="21"/>
+              </w:rPr>
+              <w:t># 1. Đặt khóa tạm giữ ghế A1 suất chiếu 101 trong 5 phút (300 giây) nếu ghế chưa bị khóa (NX)</w:t>
+              <w:br/>
+              <w:t>SET seat_lock:101:A1 "UserID:7" NX EX 300</w:t>
+              <w:br/>
+              <w:br/>
+              <w:t># 2. Kiểm tra xem ghế A1 suất 101 có đang bị ai giữ không</w:t>
+              <w:br/>
+              <w:t>EXISTS seat_lock:101:A1</w:t>
+              <w:br/>
+              <w:br/>
+              <w:t># 3. Xem thời gian giữ ghế còn lại bao nhiêu giây</w:t>
+              <w:br/>
+              <w:t>TTL seat_lock:101:A1</w:t>
+              <w:br/>
+              <w:br/>
+              <w:t># 4. Giải phóng khóa giữ ghế khi khách bỏ chọn hoặc hoàn tất thanh toán</w:t>
+              <w:br/>
+              <w:t>DEL seat_lock:101:A1</w:t>
+            </w:r>
+          </w:p>
+        </w:tc>
+      </w:tr>
+    </w:tbl>
+    <w:p>
+      <w:pPr>
+        <w:spacing w:before="0" w:after="80"/>
+      </w:pPr>
+    </w:p>
+    <w:p>
+      <w:pPr>
+        <w:spacing w:before="200" w:after="60"/>
+      </w:pPr>
+      <w:r>
+        <w:rPr>
+          <w:rFonts w:ascii="Times New Roman" w:hAnsi="Times New Roman"/>
+          <w:b/>
+          <w:color w:val="222222"/>
+          <w:sz w:val="28"/>
+        </w:rPr>
+        <w:t>4.4 Mã Lệnh C# StackExchange.Redis Integration (`RedisManager.cs`):</w:t>
+      </w:r>
+    </w:p>
+    <w:tbl>
+      <w:tblPr>
+        <w:tblW w:type="auto" w:w="0"/>
+        <w:jc w:val="center"/>
+        <w:tblLook w:firstColumn="1" w:firstRow="1" w:lastColumn="0" w:lastRow="0" w:noHBand="0" w:noVBand="1" w:val="04A0"/>
+      </w:tblPr>
+      <w:tblGrid>
+        <w:gridCol w:w="8640"/>
+      </w:tblGrid>
+      <w:tr>
+        <w:tc>
+          <w:tcPr>
+            <w:tcW w:type="dxa" w:w="8640"/>
+            <w:shd w:val="clear" w:color="auto" w:fill="F4F4F6"/>
+          </w:tcPr>
+          <w:p>
+            <w:pPr>
+              <w:spacing w:before="80" w:after="80"/>
+            </w:pPr>
+            <w:r>
+              <w:rPr>
+                <w:rFonts w:ascii="Consolas" w:hAnsi="Consolas"/>
+                <w:color w:val="1F2428"/>
+                <w:sz w:val="21"/>
+              </w:rPr>
+              <w:t>// Đặt khóa giữ ghế 5 phút</w:t>
+              <w:br/>
+              <w:t>public bool LockSeat(int suatChieuId, int gheId, int userId) {</w:t>
+              <w:br/>
+              <w:t xml:space="preserve">    string key = $"seat_lock:{suatChieuId}:{gheId}";</w:t>
+              <w:br/>
+              <w:t xml:space="preserve">    string val = $"UserID:{userId}";</w:t>
+              <w:br/>
+              <w:t xml:space="preserve">    return redisDb.StringSet(key, val, TimeSpan.FromMinutes(5), When.NotExists);</w:t>
+              <w:br/>
+              <w:t>}</w:t>
+              <w:br/>
+              <w:br/>
+              <w:t>// Xóa khóa giữ ghế</w:t>
+              <w:br/>
+              <w:t>public bool UnlockSeat(int suatChieuId, int gheId) {</w:t>
+              <w:br/>
+              <w:t xml:space="preserve">    string key = $"seat_lock:{suatChieuId}:{gheId}";</w:t>
+              <w:br/>
+              <w:t xml:space="preserve">    return redisDb.KeyDelete(key);</w:t>
+              <w:br/>
+              <w:t>}</w:t>
+            </w:r>
+          </w:p>
+        </w:tc>
+      </w:tr>
+    </w:tbl>
+    <w:p>
+      <w:pPr>
+        <w:spacing w:before="0" w:after="80"/>
+      </w:pPr>
+    </w:p>
+    <w:p>
+      <w:pPr>
+        <w:spacing w:before="60" w:after="60" w:line="276" w:lineRule="auto"/>
+      </w:pPr>
+      <w:r>
+        <w:rPr>
+          <w:rFonts w:ascii="Times New Roman" w:hAnsi="Times New Roman"/>
+        </w:rPr>
+        <w:t>---</w:t>
+      </w:r>
+    </w:p>
+    <w:p>
+      <w:pPr>
+        <w:spacing w:before="280" w:after="80"/>
+      </w:pPr>
+      <w:r>
+        <w:rPr>
+          <w:rFonts w:ascii="Times New Roman" w:hAnsi="Times New Roman"/>
+          <w:b/>
+          <w:color w:val="004080"/>
+          <w:sz w:val="32"/>
+        </w:rPr>
+        <w:t>CHƯƠNG 5: THIẾT KẾ CSDL NOSQL NEO4J (GRAPH DATABASE DESIGN)</w:t>
+      </w:r>
+    </w:p>
+    <w:p>
+      <w:pPr>
+        <w:spacing w:before="200" w:after="60"/>
+      </w:pPr>
+      <w:r>
+        <w:rPr>
+          <w:rFonts w:ascii="Times New Roman" w:hAnsi="Times New Roman"/>
+          <w:b/>
+          <w:color w:val="222222"/>
+          <w:sz w:val="28"/>
+        </w:rPr>
+        <w:t>5.1 Phạm vi nhiệm vụ &amp; Mô hình Đồ thị</w:t>
+      </w:r>
+    </w:p>
+    <w:p>
+      <w:pPr>
+        <w:pStyle w:val="ListBullet"/>
+        <w:spacing w:before="40" w:after="40"/>
+      </w:pPr>
+      <w:r>
+        <w:rPr>
+          <w:rFonts w:ascii="Times New Roman" w:hAnsi="Times New Roman"/>
+        </w:rPr>
+      </w:r>
+      <w:r>
+        <w:rPr>
+          <w:rFonts w:ascii="Times New Roman" w:hAnsi="Times New Roman"/>
+          <w:b/>
+        </w:rPr>
+        <w:t>Loại CSDL:</w:t>
+      </w:r>
+      <w:r>
+        <w:rPr>
+          <w:rFonts w:ascii="Times New Roman" w:hAnsi="Times New Roman"/>
+        </w:rPr>
+        <w:t xml:space="preserve"> Graph Database (Neo4j 5.0).</w:t>
+      </w:r>
+    </w:p>
+    <w:p>
+      <w:pPr>
+        <w:pStyle w:val="ListBullet"/>
+        <w:spacing w:before="40" w:after="40"/>
+      </w:pPr>
+      <w:r>
+        <w:rPr>
+          <w:rFonts w:ascii="Times New Roman" w:hAnsi="Times New Roman"/>
+        </w:rPr>
+      </w:r>
+      <w:r>
+        <w:rPr>
+          <w:rFonts w:ascii="Times New Roman" w:hAnsi="Times New Roman"/>
+          <w:b/>
+        </w:rPr>
+        <w:t>Nhiệm vụ:</w:t>
+      </w:r>
+      <w:r>
+        <w:rPr>
+          <w:rFonts w:ascii="Times New Roman" w:hAnsi="Times New Roman"/>
+        </w:rPr>
+        <w:t xml:space="preserve"> Lưu trữ mạng lưới mối quan hệ người dùng, bộ phim và thể loại để tính toán Bảng xếp hạng gợi ý Top Phim Thịnh Hành &amp; Thống kê độ phổ biến.</w:t>
+      </w:r>
+    </w:p>
+    <w:p>
+      <w:pPr>
+        <w:spacing w:before="200" w:after="60"/>
+      </w:pPr>
+      <w:r>
+        <w:rPr>
+          <w:rFonts w:ascii="Times New Roman" w:hAnsi="Times New Roman"/>
+          <w:b/>
+          <w:color w:val="222222"/>
+          <w:sz w:val="28"/>
+        </w:rPr>
+        <w:t>5.2 Sơ đồ Đồ thị Đầy Đủ (Graph Model Schema):</w:t>
+      </w:r>
+    </w:p>
+    <w:tbl>
+      <w:tblPr>
+        <w:tblW w:type="auto" w:w="0"/>
+        <w:jc w:val="center"/>
+        <w:tblLook w:firstColumn="1" w:firstRow="1" w:lastColumn="0" w:lastRow="0" w:noHBand="0" w:noVBand="1" w:val="04A0"/>
+      </w:tblPr>
+      <w:tblGrid>
+        <w:gridCol w:w="8640"/>
+      </w:tblGrid>
+      <w:tr>
+        <w:tc>
+          <w:tcPr>
+            <w:tcW w:type="dxa" w:w="8640"/>
+            <w:shd w:val="clear" w:color="auto" w:fill="F4F4F6"/>
+          </w:tcPr>
+          <w:p>
+            <w:pPr>
+              <w:spacing w:before="80" w:after="80"/>
+            </w:pPr>
+            <w:r>
+              <w:rPr>
+                <w:rFonts w:ascii="Consolas" w:hAnsi="Consolas"/>
+                <w:color w:val="1F2428"/>
+                <w:sz w:val="21"/>
+              </w:rPr>
+              <w:t>graph LR</w:t>
+              <w:br/>
+              <w:t xml:space="preserve">    User["(:User {userId: 'huy', username: 'huy'})"]</w:t>
+              <w:br/>
+              <w:t xml:space="preserve">    Movie["(:Movie {movieId: 101, title: 'Lật Mặt 7', poster: '001.png', duration: 120})"]</w:t>
+              <w:br/>
+              <w:t xml:space="preserve">    Genre["(:Genre {genreId: 1, genreName: 'Hành Động'})"]</w:t>
+              <w:br/>
+              <w:br/>
+              <w:t xml:space="preserve">    User --&gt;|":BOOKED {bookingId: 'HD001', seatCount: 2, date: '2026-08-01'}"| Movie</w:t>
+              <w:br/>
+              <w:t xml:space="preserve">    User --&gt;|":FAVORITED"| Movie</w:t>
+              <w:br/>
+              <w:t xml:space="preserve">    Movie --&gt;|":BELONGS_TO"| Genre</w:t>
+            </w:r>
+          </w:p>
+        </w:tc>
+      </w:tr>
+    </w:tbl>
+    <w:p>
+      <w:pPr>
+        <w:spacing w:before="0" w:after="80"/>
+      </w:pPr>
+    </w:p>
+    <w:p>
+      <w:pPr>
+        <w:spacing w:before="200" w:after="60"/>
+      </w:pPr>
+      <w:r>
+        <w:rPr>
+          <w:rFonts w:ascii="Times New Roman" w:hAnsi="Times New Roman"/>
+          <w:b/>
+          <w:color w:val="222222"/>
+          <w:sz w:val="28"/>
+        </w:rPr>
+        <w:t>5.3 Bộ Câu Lệnh Cypher Query Shell Chi Tiết:</w:t>
+      </w:r>
+    </w:p>
+    <w:tbl>
+      <w:tblPr>
+        <w:tblW w:type="auto" w:w="0"/>
+        <w:jc w:val="center"/>
+        <w:tblLook w:firstColumn="1" w:firstRow="1" w:lastColumn="0" w:lastRow="0" w:noHBand="0" w:noVBand="1" w:val="04A0"/>
+      </w:tblPr>
+      <w:tblGrid>
+        <w:gridCol w:w="8640"/>
+      </w:tblGrid>
+      <w:tr>
+        <w:tc>
+          <w:tcPr>
+            <w:tcW w:type="dxa" w:w="8640"/>
+            <w:shd w:val="clear" w:color="auto" w:fill="F4F4F6"/>
+          </w:tcPr>
+          <w:p>
+            <w:pPr>
+              <w:spacing w:before="80" w:after="80"/>
+            </w:pPr>
+            <w:r>
+              <w:rPr>
+                <w:rFonts w:ascii="Consolas" w:hAnsi="Consolas"/>
+                <w:color w:val="1F2428"/>
+                <w:sz w:val="21"/>
+              </w:rPr>
+              <w:t>// 1. Khởi tạo Node và Mối quan hệ mẫu</w:t>
+              <w:br/>
+              <w:t>MERGE (u:User { userId: 'huy' }) SET u.username = 'Huy Vu'</w:t>
+              <w:br/>
+              <w:t>MERGE (m:Movie { movieId: 101 }) SET m.title = 'Lật Mặt 7', m.poster = 'poster01.jpg'</w:t>
+              <w:br/>
+              <w:t>MERGE (g:Genre { genreId: 1 }) SET g.genreName = 'Hành Động'</w:t>
+              <w:br/>
+              <w:t>MERGE (m)-[:BELONGS_TO]-&gt;(g);</w:t>
+              <w:br/>
+              <w:br/>
+              <w:t>// 2. Truy vấn Top Phim Được Đặt Vé Nhiều Nhất</w:t>
               <w:br/>
               <w:t>MATCH (u:User)-[r:BOOKED]-&gt;(m:Movie)</w:t>
               <w:br/>
@@ -1621,7 +2018,7 @@
               <w:t>ORDER BY TotalBookings DESC LIMIT 4;</w:t>
               <w:br/>
               <w:br/>
-              <w:t>// 2. Top Phim Được Yêu Thích Nhất</w:t>
+              <w:t>// 3. Truy vấn Top Phim Được Yêu Thích Nhất</w:t>
               <w:br/>
               <w:t>MATCH (u:User)-[r:FAVORITED]-&gt;(m:Movie)</w:t>
               <w:br/>
@@ -1630,14 +2027,14 @@
               <w:t>ORDER BY TotalFavorites DESC LIMIT 4;</w:t>
               <w:br/>
               <w:br/>
-              <w:t>// 3. Thả Tim Yêu Thích Phim Realtime (Tạo mới hoặc Xóa mối quan hệ)</w:t>
-              <w:br/>
-              <w:t>MATCH (u:User {userId: 'huy'}), (m:Movie {movieId: 101})</w:t>
+              <w:t>// 4. Thả Tim Yêu Thích Phim Realtime (Tạo mới hoặc Xóa mối quan hệ)</w:t>
+              <w:br/>
+              <w:t>MATCH (u:User { userId: 'huy' }), (m:Movie { movieId: 101 })</w:t>
               <w:br/>
               <w:t>MERGE (u)-[r:FAVORITED]-&gt;(m);</w:t>
               <w:br/>
               <w:br/>
-              <w:t>// 4. Thống Kê Phân Tích Độ Phổ Biến Theo Thể Loại Phim Đồ Thị</w:t>
+              <w:t>// 5. Thống Kê Phân Tích Độ Phổ Biến Theo Thể Loại Phim Đồ Thị</w:t>
               <w:br/>
               <w:t>MATCH (m:Movie)-[:BELONGS_TO]-&gt;(g:Genre)</w:t>
               <w:br/>
@@ -1650,6 +2047,72 @@
               <w:t xml:space="preserve">       COUNT(DISTINCT b) AS TotalBookings, COUNT(DISTINCT f) AS TotalFavorites</w:t>
               <w:br/>
               <w:t>ORDER BY TotalBookings DESC;</w:t>
+            </w:r>
+          </w:p>
+        </w:tc>
+      </w:tr>
+    </w:tbl>
+    <w:p>
+      <w:pPr>
+        <w:spacing w:before="0" w:after="80"/>
+      </w:pPr>
+    </w:p>
+    <w:p>
+      <w:pPr>
+        <w:spacing w:before="200" w:after="60"/>
+      </w:pPr>
+      <w:r>
+        <w:rPr>
+          <w:rFonts w:ascii="Times New Roman" w:hAnsi="Times New Roman"/>
+          <w:b/>
+          <w:color w:val="222222"/>
+          <w:sz w:val="28"/>
+        </w:rPr>
+        <w:t>5.4 Mã C# Neo4j REST API Client (`Neo4jService.cs`):</w:t>
+      </w:r>
+    </w:p>
+    <w:tbl>
+      <w:tblPr>
+        <w:tblW w:type="auto" w:w="0"/>
+        <w:jc w:val="center"/>
+        <w:tblLook w:firstColumn="1" w:firstRow="1" w:lastColumn="0" w:lastRow="0" w:noHBand="0" w:noVBand="1" w:val="04A0"/>
+      </w:tblPr>
+      <w:tblGrid>
+        <w:gridCol w:w="8640"/>
+      </w:tblGrid>
+      <w:tr>
+        <w:tc>
+          <w:tcPr>
+            <w:tcW w:type="dxa" w:w="8640"/>
+            <w:shd w:val="clear" w:color="auto" w:fill="F4F4F6"/>
+          </w:tcPr>
+          <w:p>
+            <w:pPr>
+              <w:spacing w:before="80" w:after="80"/>
+            </w:pPr>
+            <w:r>
+              <w:rPr>
+                <w:rFonts w:ascii="Consolas" w:hAnsi="Consolas"/>
+                <w:color w:val="1F2428"/>
+                <w:sz w:val="21"/>
+              </w:rPr>
+              <w:t>// Gửi câu lệnh Cypher tới Neo4j HTTP REST Endpoint</w:t>
+              <w:br/>
+              <w:t>public JObject ExecuteCypher(string cypherQuery, Dictionary&lt;string, object&gt; parameters = null) {</w:t>
+              <w:br/>
+              <w:t xml:space="preserve">    var request = (HttpWebRequest)WebRequest.Create("http://localhost:7474/db/data/transaction/commit");</w:t>
+              <w:br/>
+              <w:t xml:space="preserve">    request.Method = "POST";</w:t>
+              <w:br/>
+              <w:t xml:space="preserve">    request.ContentType = "application/json";</w:t>
+              <w:br/>
+              <w:t xml:space="preserve">    string authInfo = Convert.ToBase64String(Encoding.UTF8.GetBytes("neo4j:adminpassword"));</w:t>
+              <w:br/>
+              <w:t xml:space="preserve">    request.Headers["Authorization"] = "Basic " + authInfo;</w:t>
+              <w:br/>
+              <w:t xml:space="preserve">    // ... Serialize Payload &amp; Return JObject</w:t>
+              <w:br/>
+              <w:t>}</w:t>
             </w:r>
           </w:p>
         </w:tc>
@@ -1696,32 +2159,7 @@
           <w:color w:val="222222"/>
           <w:sz w:val="28"/>
         </w:rPr>
-        <w:t>6.1 Phạm vi nhiệm vụ</w:t>
-      </w:r>
-    </w:p>
-    <w:p>
-      <w:pPr>
-        <w:spacing w:before="60" w:after="60" w:line="276" w:lineRule="auto"/>
-      </w:pPr>
-      <w:r>
-        <w:rPr>
-          <w:rFonts w:ascii="Times New Roman" w:hAnsi="Times New Roman"/>
-        </w:rPr>
-        <w:t>Lưu nhật ký hoạt động người dùng (User Activity Logs) và lịch sử vé theo mô hình Big Data với tốc độ ghi nhanh (High Write Performance).</w:t>
-      </w:r>
-    </w:p>
-    <w:p>
-      <w:pPr>
-        <w:spacing w:before="200" w:after="60"/>
-      </w:pPr>
-      <w:r>
-        <w:rPr>
-          <w:rFonts w:ascii="Times New Roman" w:hAnsi="Times New Roman"/>
-          <w:b/>
-          <w:color w:val="222222"/>
-          <w:sz w:val="28"/>
-        </w:rPr>
-        <w:t>6.2 Cấu trúc Keyspace &amp; Các Bảng CQL:</w:t>
+        <w:t>6.1 Phạm vi nhiệm vụ &amp; Keyspace Architecture</w:t>
       </w:r>
     </w:p>
     <w:p>
@@ -1739,13 +2177,99 @@
           <w:rFonts w:ascii="Times New Roman" w:hAnsi="Times New Roman"/>
           <w:b/>
         </w:rPr>
-        <w:t>Keyspace:</w:t>
+        <w:t>Loại CSDL:</w:t>
       </w:r>
       <w:r>
         <w:rPr>
           <w:rFonts w:ascii="Times New Roman" w:hAnsi="Times New Roman"/>
         </w:rPr>
-        <w:t xml:space="preserve"> `cinemadb_analytics` (Replication Strategy: `SimpleStrategy`, `replication_factor: 1`).</w:t>
+        <w:t xml:space="preserve"> Wide-Column Distributed Store (Apache Cassandra 4.0).</w:t>
+      </w:r>
+    </w:p>
+    <w:p>
+      <w:pPr>
+        <w:pStyle w:val="ListBullet"/>
+        <w:spacing w:before="40" w:after="40"/>
+      </w:pPr>
+      <w:r>
+        <w:rPr>
+          <w:rFonts w:ascii="Times New Roman" w:hAnsi="Times New Roman"/>
+        </w:rPr>
+      </w:r>
+      <w:r>
+        <w:rPr>
+          <w:rFonts w:ascii="Times New Roman" w:hAnsi="Times New Roman"/>
+          <w:b/>
+        </w:rPr>
+        <w:t>Keyspace Name:</w:t>
+      </w:r>
+      <w:r>
+        <w:rPr>
+          <w:rFonts w:ascii="Times New Roman" w:hAnsi="Times New Roman"/>
+        </w:rPr>
+        <w:t xml:space="preserve"> `cinemadb_analytics`</w:t>
+      </w:r>
+    </w:p>
+    <w:p>
+      <w:pPr>
+        <w:pStyle w:val="ListBullet"/>
+        <w:spacing w:before="40" w:after="40"/>
+      </w:pPr>
+      <w:r>
+        <w:rPr>
+          <w:rFonts w:ascii="Times New Roman" w:hAnsi="Times New Roman"/>
+        </w:rPr>
+      </w:r>
+      <w:r>
+        <w:rPr>
+          <w:rFonts w:ascii="Times New Roman" w:hAnsi="Times New Roman"/>
+          <w:b/>
+        </w:rPr>
+        <w:t>Replication Strategy:</w:t>
+      </w:r>
+      <w:r>
+        <w:rPr>
+          <w:rFonts w:ascii="Times New Roman" w:hAnsi="Times New Roman"/>
+        </w:rPr>
+        <w:t xml:space="preserve"> `SimpleStrategy`, `replication_factor: 1`.</w:t>
+      </w:r>
+    </w:p>
+    <w:p>
+      <w:pPr>
+        <w:pStyle w:val="ListBullet"/>
+        <w:spacing w:before="40" w:after="40"/>
+      </w:pPr>
+      <w:r>
+        <w:rPr>
+          <w:rFonts w:ascii="Times New Roman" w:hAnsi="Times New Roman"/>
+        </w:rPr>
+      </w:r>
+      <w:r>
+        <w:rPr>
+          <w:rFonts w:ascii="Times New Roman" w:hAnsi="Times New Roman"/>
+          <w:b/>
+        </w:rPr>
+        <w:t>Nhiệm vụ:</w:t>
+      </w:r>
+      <w:r>
+        <w:rPr>
+          <w:rFonts w:ascii="Times New Roman" w:hAnsi="Times New Roman"/>
+        </w:rPr>
+        <w:t xml:space="preserve"> Lưu vết nhật ký hoạt động Big Data (User Activity Logs) và lịch sử vé đặt với tốc độ ghi cực nhanh (High Write Throughput).</w:t>
+      </w:r>
+    </w:p>
+    <w:p>
+      <w:pPr>
+        <w:spacing w:before="200" w:after="60"/>
+      </w:pPr>
+      <w:r>
+        <w:rPr>
+          <w:rFonts w:ascii="Times New Roman" w:hAnsi="Times New Roman"/>
+          <w:b/>
+          <w:color w:val="222222"/>
+          <w:sz w:val="28"/>
+        </w:rPr>
+        <w:t>6.2 Cấu trúc Các Bảng CQL (Wide-Column Tables):</w:t>
       </w:r>
     </w:p>
     <w:p>
@@ -1759,6 +2283,54 @@
           <w:sz w:val="26"/>
         </w:rPr>
         <w:t>Bảng 1: `user_activity_logs` (Nhật ký hoạt động)</w:t>
+      </w:r>
+    </w:p>
+    <w:p>
+      <w:pPr>
+        <w:pStyle w:val="ListBullet"/>
+        <w:spacing w:before="40" w:after="40"/>
+      </w:pPr>
+      <w:r>
+        <w:rPr>
+          <w:rFonts w:ascii="Times New Roman" w:hAnsi="Times New Roman"/>
+        </w:rPr>
+      </w:r>
+      <w:r>
+        <w:rPr>
+          <w:rFonts w:ascii="Times New Roman" w:hAnsi="Times New Roman"/>
+          <w:b/>
+        </w:rPr>
+        <w:t>Partition Key:</w:t>
+      </w:r>
+      <w:r>
+        <w:rPr>
+          <w:rFonts w:ascii="Times New Roman" w:hAnsi="Times New Roman"/>
+        </w:rPr>
+        <w:t xml:space="preserve"> `user_id`</w:t>
+      </w:r>
+    </w:p>
+    <w:p>
+      <w:pPr>
+        <w:pStyle w:val="ListBullet"/>
+        <w:spacing w:before="40" w:after="40"/>
+      </w:pPr>
+      <w:r>
+        <w:rPr>
+          <w:rFonts w:ascii="Times New Roman" w:hAnsi="Times New Roman"/>
+        </w:rPr>
+      </w:r>
+      <w:r>
+        <w:rPr>
+          <w:rFonts w:ascii="Times New Roman" w:hAnsi="Times New Roman"/>
+          <w:b/>
+        </w:rPr>
+        <w:t>Clustering Key:</w:t>
+      </w:r>
+      <w:r>
+        <w:rPr>
+          <w:rFonts w:ascii="Times New Roman" w:hAnsi="Times New Roman"/>
+        </w:rPr>
+        <w:t xml:space="preserve"> `activity_time DESC`</w:t>
       </w:r>
     </w:p>
     <w:tbl>
@@ -1828,6 +2400,54 @@
         <w:t>Bảng 2: `user_ticket_history` (Lịch sử đặt vé)</w:t>
       </w:r>
     </w:p>
+    <w:p>
+      <w:pPr>
+        <w:pStyle w:val="ListBullet"/>
+        <w:spacing w:before="40" w:after="40"/>
+      </w:pPr>
+      <w:r>
+        <w:rPr>
+          <w:rFonts w:ascii="Times New Roman" w:hAnsi="Times New Roman"/>
+        </w:rPr>
+      </w:r>
+      <w:r>
+        <w:rPr>
+          <w:rFonts w:ascii="Times New Roman" w:hAnsi="Times New Roman"/>
+          <w:b/>
+        </w:rPr>
+        <w:t>Partition Key:</w:t>
+      </w:r>
+      <w:r>
+        <w:rPr>
+          <w:rFonts w:ascii="Times New Roman" w:hAnsi="Times New Roman"/>
+        </w:rPr>
+        <w:t xml:space="preserve"> `user_id`</w:t>
+      </w:r>
+    </w:p>
+    <w:p>
+      <w:pPr>
+        <w:pStyle w:val="ListBullet"/>
+        <w:spacing w:before="40" w:after="40"/>
+      </w:pPr>
+      <w:r>
+        <w:rPr>
+          <w:rFonts w:ascii="Times New Roman" w:hAnsi="Times New Roman"/>
+        </w:rPr>
+      </w:r>
+      <w:r>
+        <w:rPr>
+          <w:rFonts w:ascii="Times New Roman" w:hAnsi="Times New Roman"/>
+          <w:b/>
+        </w:rPr>
+        <w:t>Clustering Key:</w:t>
+      </w:r>
+      <w:r>
+        <w:rPr>
+          <w:rFonts w:ascii="Times New Roman" w:hAnsi="Times New Roman"/>
+        </w:rPr>
+        <w:t xml:space="preserve"> `booking_time DESC`</w:t>
+      </w:r>
+    </w:p>
     <w:tbl>
       <w:tblPr>
         <w:tblW w:type="auto" w:w="0"/>
@@ -1895,6 +2515,54 @@
           <w:sz w:val="26"/>
         </w:rPr>
         <w:t>Bảng 3: `seat_status_history` (Nhật ký biến động trạng thái ghế)</w:t>
+      </w:r>
+    </w:p>
+    <w:p>
+      <w:pPr>
+        <w:pStyle w:val="ListBullet"/>
+        <w:spacing w:before="40" w:after="40"/>
+      </w:pPr>
+      <w:r>
+        <w:rPr>
+          <w:rFonts w:ascii="Times New Roman" w:hAnsi="Times New Roman"/>
+        </w:rPr>
+      </w:r>
+      <w:r>
+        <w:rPr>
+          <w:rFonts w:ascii="Times New Roman" w:hAnsi="Times New Roman"/>
+          <w:b/>
+        </w:rPr>
+        <w:t>Partition Key:</w:t>
+      </w:r>
+      <w:r>
+        <w:rPr>
+          <w:rFonts w:ascii="Times New Roman" w:hAnsi="Times New Roman"/>
+        </w:rPr>
+        <w:t xml:space="preserve"> `showtime_id`</w:t>
+      </w:r>
+    </w:p>
+    <w:p>
+      <w:pPr>
+        <w:pStyle w:val="ListBullet"/>
+        <w:spacing w:before="40" w:after="40"/>
+      </w:pPr>
+      <w:r>
+        <w:rPr>
+          <w:rFonts w:ascii="Times New Roman" w:hAnsi="Times New Roman"/>
+        </w:rPr>
+      </w:r>
+      <w:r>
+        <w:rPr>
+          <w:rFonts w:ascii="Times New Roman" w:hAnsi="Times New Roman"/>
+          <w:b/>
+        </w:rPr>
+        <w:t>Clustering Key:</w:t>
+      </w:r>
+      <w:r>
+        <w:rPr>
+          <w:rFonts w:ascii="Times New Roman" w:hAnsi="Times New Roman"/>
+        </w:rPr>
+        <w:t xml:space="preserve"> `status_time DESC`</w:t>
       </w:r>
     </w:p>
     <w:tbl>
@@ -1939,6 +2607,129 @@
               <w:t xml:space="preserve">    PRIMARY KEY (showtime_id, status_time)</w:t>
               <w:br/>
               <w:t>) WITH CLUSTERING ORDER BY (status_time DESC);</w:t>
+            </w:r>
+          </w:p>
+        </w:tc>
+      </w:tr>
+    </w:tbl>
+    <w:p>
+      <w:pPr>
+        <w:spacing w:before="0" w:after="80"/>
+      </w:pPr>
+    </w:p>
+    <w:p>
+      <w:pPr>
+        <w:spacing w:before="200" w:after="60"/>
+      </w:pPr>
+      <w:r>
+        <w:rPr>
+          <w:rFonts w:ascii="Times New Roman" w:hAnsi="Times New Roman"/>
+          <w:b/>
+          <w:color w:val="222222"/>
+          <w:sz w:val="28"/>
+        </w:rPr>
+        <w:t>6.3 Bộ Lệnh Truy Vấn CQL Shell:</w:t>
+      </w:r>
+    </w:p>
+    <w:tbl>
+      <w:tblPr>
+        <w:tblW w:type="auto" w:w="0"/>
+        <w:jc w:val="center"/>
+        <w:tblLook w:firstColumn="1" w:firstRow="1" w:lastColumn="0" w:lastRow="0" w:noHBand="0" w:noVBand="1" w:val="04A0"/>
+      </w:tblPr>
+      <w:tblGrid>
+        <w:gridCol w:w="8640"/>
+      </w:tblGrid>
+      <w:tr>
+        <w:tc>
+          <w:tcPr>
+            <w:tcW w:type="dxa" w:w="8640"/>
+            <w:shd w:val="clear" w:color="auto" w:fill="F4F4F6"/>
+          </w:tcPr>
+          <w:p>
+            <w:pPr>
+              <w:spacing w:before="80" w:after="80"/>
+            </w:pPr>
+            <w:r>
+              <w:rPr>
+                <w:rFonts w:ascii="Consolas" w:hAnsi="Consolas"/>
+                <w:color w:val="1F2428"/>
+                <w:sz w:val="21"/>
+              </w:rPr>
+              <w:t>-- 1. Ghi nhận Nhật ký hoạt động đăng nhập của người dùng</w:t>
+              <w:br/>
+              <w:t>INSERT INTO cinemadb_analytics.user_activity_logs (user_id, activity_time, log_id, activity_type, description, ip_address, device_info)</w:t>
+              <w:br/>
+              <w:t>VALUES (7, toTimestamp(now()), uuid(), 'LOGIN', 'Đăng nhập hệ thống thành công', '192.168.1.10', 'Chrome Windows 11');</w:t>
+              <w:br/>
+              <w:br/>
+              <w:t>-- 2. Truy vấn Lịch sử đặt vé của người dùng (Tự động sắp xếp thời gian mới nhất lên đầu)</w:t>
+              <w:br/>
+              <w:t>SELECT * FROM cinemadb_analytics.user_ticket_history WHERE user_id = 7;</w:t>
+            </w:r>
+          </w:p>
+        </w:tc>
+      </w:tr>
+    </w:tbl>
+    <w:p>
+      <w:pPr>
+        <w:spacing w:before="0" w:after="80"/>
+      </w:pPr>
+    </w:p>
+    <w:p>
+      <w:pPr>
+        <w:spacing w:before="200" w:after="60"/>
+      </w:pPr>
+      <w:r>
+        <w:rPr>
+          <w:rFonts w:ascii="Times New Roman" w:hAnsi="Times New Roman"/>
+          <w:b/>
+          <w:color w:val="222222"/>
+          <w:sz w:val="28"/>
+        </w:rPr>
+        <w:t>6.4 Mã C# Cassandra C# Driver Integration (`CassandraService.cs`):</w:t>
+      </w:r>
+    </w:p>
+    <w:tbl>
+      <w:tblPr>
+        <w:tblW w:type="auto" w:w="0"/>
+        <w:jc w:val="center"/>
+        <w:tblLook w:firstColumn="1" w:firstRow="1" w:lastColumn="0" w:lastRow="0" w:noHBand="0" w:noVBand="1" w:val="04A0"/>
+      </w:tblPr>
+      <w:tblGrid>
+        <w:gridCol w:w="8640"/>
+      </w:tblGrid>
+      <w:tr>
+        <w:tc>
+          <w:tcPr>
+            <w:tcW w:type="dxa" w:w="8640"/>
+            <w:shd w:val="clear" w:color="auto" w:fill="F4F4F6"/>
+          </w:tcPr>
+          <w:p>
+            <w:pPr>
+              <w:spacing w:before="80" w:after="80"/>
+            </w:pPr>
+            <w:r>
+              <w:rPr>
+                <w:rFonts w:ascii="Consolas" w:hAnsi="Consolas"/>
+                <w:color w:val="1F2428"/>
+                <w:sz w:val="21"/>
+              </w:rPr>
+              <w:t>// Ghi nhận nhật ký bất đồng bộ (High Speed Write)</w:t>
+              <w:br/>
+              <w:t>public async Task LogUserActivityAsync(int userId, string activityType, string description) {</w:t>
+              <w:br/>
+              <w:t xml:space="preserve">    var statement = new SimpleStatement(</w:t>
+              <w:br/>
+              <w:t xml:space="preserve">        "INSERT INTO cinemadb_analytics.user_activity_logs (user_id, activity_time, log_id, activity_type, description) VALUES (?, ?, ?, ?, ?)",</w:t>
+              <w:br/>
+              <w:t xml:space="preserve">        userId, DateTimeOffset.UtcNow, Guid.NewGuid(), activityType, description</w:t>
+              <w:br/>
+              <w:t xml:space="preserve">    );</w:t>
+              <w:br/>
+              <w:t xml:space="preserve">    await session.ExecuteAsync(statement);</w:t>
+              <w:br/>
+              <w:t>}</w:t>
             </w:r>
           </w:p>
         </w:tc>

</xml_diff>

<commit_message>
[Doc] Cap nhat Chuong 2 tap trung vao diem tich hop va phoi hop giua SQL Server va 4 he NoSQL
</commit_message>
<xml_diff>
--- a/TaiLieu/TaiLieu_SDS_ToanBo_HeThong_Movana.docx
+++ b/TaiLieu/TaiLieu_SDS_ToanBo_HeThong_Movana.docx
@@ -287,7 +287,7 @@
         <w:rPr>
           <w:rFonts w:ascii="Times New Roman" w:hAnsi="Times New Roman"/>
         </w:rPr>
-        <w:t>[CHƯƠNG 2: THIẾT KẾ CSDL QUAN HỆ SQL SERVER (RDBMS CORE DESIGN)](#chuong-2-thiet-ke-csdl-quan-he-sql-server-rdbms-core-design)</w:t>
+        <w:t>[CHƯƠNG 2: THIẾT KẾ CSDL QUAN HỆ SQL SERVER (RDBMS CORE &amp; NOSQL INTEGRATION DESIGN)](#chuong-2-thiet-ke-csdl-quan-he-sql-server-rdbms-core--nosql-integration-design)</w:t>
       </w:r>
     </w:p>
     <w:p>
@@ -732,7 +732,7 @@
           <w:color w:val="004080"/>
           <w:sz w:val="32"/>
         </w:rPr>
-        <w:t>CHƯƠNG 2: THIẾT KẾ CSDL QUAN HỆ SQL SERVER (RDBMS CORE DESIGN)</w:t>
+        <w:t>CHƯƠNG 2: THIẾT KẾ CSDL QUAN HỆ SQL SERVER (RDBMS CORE &amp; NOSQL INTEGRATION DESIGN)</w:t>
       </w:r>
     </w:p>
     <w:p>
@@ -746,7 +746,7 @@
           <w:color w:val="222222"/>
           <w:sz w:val="28"/>
         </w:rPr>
-        <w:t>2.1 Phạm vi nhiệm vụ</w:t>
+        <w:t>2.1 Vai trò Nền tảng RDBMS &amp; Điểm Tích Hợp Với 4 Hệ NoSQL</w:t>
       </w:r>
     </w:p>
     <w:p>
@@ -757,19 +757,116 @@
         <w:rPr>
           <w:rFonts w:ascii="Times New Roman" w:hAnsi="Times New Roman"/>
         </w:rPr>
-        <w:t>Quản lý các thực thể cố định và đảm bảo tính toàn vẹn dữ liệu giao dịch tài chính (ACID):</w:t>
+        <w:t xml:space="preserve">Trong mô hình kiến trúc Đa CSDL (Polyglot Persistence), SQL Server 2019 đóng vai trò là </w:t>
       </w:r>
-    </w:p>
-    <w:p>
-      <w:pPr>
-        <w:pStyle w:val="ListBullet"/>
-        <w:spacing w:before="40" w:after="40"/>
-      </w:pPr>
+      <w:r>
+        <w:rPr>
+          <w:rFonts w:ascii="Times New Roman" w:hAnsi="Times New Roman"/>
+          <w:b/>
+        </w:rPr>
+        <w:t>CSDL trung tâm giao dịch tài chính (RDBMS Core)</w:t>
+      </w:r>
       <w:r>
         <w:rPr>
           <w:rFonts w:ascii="Times New Roman" w:hAnsi="Times New Roman"/>
         </w:rPr>
-        <w:t>`Phim`, `Rap`, `PhongChieu`, `SuatChieu`, `Ghe`, `NguoiDung`, `HoaDon`, `Ve`.</w:t>
+        <w:t xml:space="preserve"> đảm bảo tính toàn vẹn ACID cho các dữ liệu cố định, đồng thời phối hợp ăn khớp với 4 hệ NoSQL:</w:t>
+      </w:r>
+    </w:p>
+    <w:p>
+      <w:pPr>
+        <w:pStyle w:val="ListBullet"/>
+        <w:spacing w:before="40" w:after="40"/>
+      </w:pPr>
+      <w:r>
+        <w:rPr>
+          <w:rFonts w:ascii="Times New Roman" w:hAnsi="Times New Roman"/>
+        </w:rPr>
+      </w:r>
+      <w:r>
+        <w:rPr>
+          <w:rFonts w:ascii="Times New Roman" w:hAnsi="Times New Roman"/>
+          <w:b/>
+        </w:rPr>
+        <w:t>1. Phối hợp với Redis:</w:t>
+      </w:r>
+      <w:r>
+        <w:rPr>
+          <w:rFonts w:ascii="Times New Roman" w:hAnsi="Times New Roman"/>
+        </w:rPr>
+        <w:t xml:space="preserve"> SQL Server lưu trữ danh mục Ghế (`Ghe`) và Suất Chiếu (`SuatChieu`). Khi khách hàng chọn ghế, Redis chịu trách nhiệm tạm khóa ghế `seat_lock:{suatChieuId}:{gheId}` trong 5 phút. Khi thanh toán hoàn tất, dữ liệu hóa đơn chính thức được ghi về SQL Server và Redis giải phóng khóa tạm.</w:t>
+      </w:r>
+    </w:p>
+    <w:p>
+      <w:pPr>
+        <w:pStyle w:val="ListBullet"/>
+        <w:spacing w:before="40" w:after="40"/>
+      </w:pPr>
+      <w:r>
+        <w:rPr>
+          <w:rFonts w:ascii="Times New Roman" w:hAnsi="Times New Roman"/>
+        </w:rPr>
+      </w:r>
+      <w:r>
+        <w:rPr>
+          <w:rFonts w:ascii="Times New Roman" w:hAnsi="Times New Roman"/>
+          <w:b/>
+        </w:rPr>
+        <w:t>2. Phối hợp với Neo4j:</w:t>
+      </w:r>
+      <w:r>
+        <w:rPr>
+          <w:rFonts w:ascii="Times New Roman" w:hAnsi="Times New Roman"/>
+        </w:rPr>
+        <w:t xml:space="preserve"> Dữ liệu Phim, Thể loại và Lịch sử đặt vé từ SQL Server được đồng bộ sang Neo4j dưới dạng các Nút `(:User)`, `(:Movie)`, `(:Genre)` và các Cung `[:BOOKED]`, `[:FAVORITED]`. Neo4j tính toán xong Top Phim sẽ trả danh sách ID về cho SQL Server để lấy ảnh Poster hiển thị lên Trang chủ.</w:t>
+      </w:r>
+    </w:p>
+    <w:p>
+      <w:pPr>
+        <w:pStyle w:val="ListBullet"/>
+        <w:spacing w:before="40" w:after="40"/>
+      </w:pPr>
+      <w:r>
+        <w:rPr>
+          <w:rFonts w:ascii="Times New Roman" w:hAnsi="Times New Roman"/>
+        </w:rPr>
+      </w:r>
+      <w:r>
+        <w:rPr>
+          <w:rFonts w:ascii="Times New Roman" w:hAnsi="Times New Roman"/>
+          <w:b/>
+        </w:rPr>
+        <w:t>3. Phối hợp với MongoDB:</w:t>
+      </w:r>
+      <w:r>
+        <w:rPr>
+          <w:rFonts w:ascii="Times New Roman" w:hAnsi="Times New Roman"/>
+        </w:rPr>
+        <w:t xml:space="preserve"> SQL Server quản lý hóa đơn thanh toán. Khi áp dụng mã giảm giá từ MongoDB (`cinema_promotions`), số tiền chiết khấu `discountAmount` được trừ trực tiếp vào `TongTien` của SQL Server. Nếu xảy ra sự cố thanh toán, ticket khiếu nại của khách được lưu vào MongoDB Collection `customer_feedbacks`.</w:t>
+      </w:r>
+    </w:p>
+    <w:p>
+      <w:pPr>
+        <w:pStyle w:val="ListBullet"/>
+        <w:spacing w:before="40" w:after="40"/>
+      </w:pPr>
+      <w:r>
+        <w:rPr>
+          <w:rFonts w:ascii="Times New Roman" w:hAnsi="Times New Roman"/>
+        </w:rPr>
+      </w:r>
+      <w:r>
+        <w:rPr>
+          <w:rFonts w:ascii="Times New Roman" w:hAnsi="Times New Roman"/>
+          <w:b/>
+        </w:rPr>
+        <w:t>4. Phối hợp với Cassandra:</w:t>
+      </w:r>
+      <w:r>
+        <w:rPr>
+          <w:rFonts w:ascii="Times New Roman" w:hAnsi="Times New Roman"/>
+        </w:rPr>
+        <w:t xml:space="preserve"> Sau khi mỗi đơn đặt vé hoàn tất lưu vào SQL Server, hệ thống tự động ghi bất đồng bộ (Async Write) dữ liệu lịch sử đặt vé sang Cassandra `user_ticket_history` để phục vụ tra cứu Big Data tốc độ cao.</w:t>
       </w:r>
     </w:p>
     <w:p>
@@ -977,6 +1074,72 @@
         </w:rPr>
         <w:t>: `VeID` (PK, int), `SuatChieuID` (FK), `GheID` (FK), `HoaDonID` (FK), `GiaVe`.</w:t>
       </w:r>
+    </w:p>
+    <w:p>
+      <w:pPr>
+        <w:spacing w:before="200" w:after="60"/>
+      </w:pPr>
+      <w:r>
+        <w:rPr>
+          <w:rFonts w:ascii="Times New Roman" w:hAnsi="Times New Roman"/>
+          <w:b/>
+          <w:color w:val="222222"/>
+          <w:sz w:val="28"/>
+        </w:rPr>
+        <w:t>2.3 Sơ đồ Quan hệ Thực thể SQL Server (ERD Diagram):</w:t>
+      </w:r>
+    </w:p>
+    <w:tbl>
+      <w:tblPr>
+        <w:tblW w:type="auto" w:w="0"/>
+        <w:jc w:val="center"/>
+        <w:tblLook w:firstColumn="1" w:firstRow="1" w:lastColumn="0" w:lastRow="0" w:noHBand="0" w:noVBand="1" w:val="04A0"/>
+      </w:tblPr>
+      <w:tblGrid>
+        <w:gridCol w:w="8640"/>
+      </w:tblGrid>
+      <w:tr>
+        <w:tc>
+          <w:tcPr>
+            <w:tcW w:type="dxa" w:w="8640"/>
+            <w:shd w:val="clear" w:color="auto" w:fill="F4F4F6"/>
+          </w:tcPr>
+          <w:p>
+            <w:pPr>
+              <w:spacing w:before="80" w:after="80"/>
+            </w:pPr>
+            <w:r>
+              <w:rPr>
+                <w:rFonts w:ascii="Consolas" w:hAnsi="Consolas"/>
+                <w:color w:val="1F2428"/>
+                <w:sz w:val="21"/>
+              </w:rPr>
+              <w:t>erDiagram</w:t>
+              <w:br/>
+              <w:t xml:space="preserve">    NguoiDung ||--o{ HoaDon : "Lap"</w:t>
+              <w:br/>
+              <w:t xml:space="preserve">    Phim ||--o{ SuatChieu : "Co"</w:t>
+              <w:br/>
+              <w:t xml:space="preserve">    Rap ||--o{ PhongChieu : "Thuoc"</w:t>
+              <w:br/>
+              <w:t xml:space="preserve">    PhongChieu ||--o{ SuatChieu : "Dien ra"</w:t>
+              <w:br/>
+              <w:t xml:space="preserve">    PhongChieu ||--o{ Ghe : "Chua"</w:t>
+              <w:br/>
+              <w:t xml:space="preserve">    HoaDon ||--o{ Ve : "Gom"</w:t>
+              <w:br/>
+              <w:t xml:space="preserve">    SuatChieu ||--o{ Ve : "Thuoc"</w:t>
+              <w:br/>
+              <w:t xml:space="preserve">    Ghe ||--o{ Ve : "Ung voi"</w:t>
+            </w:r>
+          </w:p>
+        </w:tc>
+      </w:tr>
+    </w:tbl>
+    <w:p>
+      <w:pPr>
+        <w:spacing w:before="0" w:after="80"/>
+      </w:pPr>
     </w:p>
     <w:p>
       <w:pPr>

</xml_diff>

<commit_message>
[Doc] Tinh gon Chuong 2, 3, 4, 5, 6 tap trung 100% vao trong tam NoSQL thuc te trong Do an Movana
</commit_message>
<xml_diff>
--- a/TaiLieu/TaiLieu_SDS_ToanBo_HeThong_Movana.docx
+++ b/TaiLieu/TaiLieu_SDS_ToanBo_HeThong_Movana.docx
@@ -287,7 +287,7 @@
         <w:rPr>
           <w:rFonts w:ascii="Times New Roman" w:hAnsi="Times New Roman"/>
         </w:rPr>
-        <w:t>[CHƯƠNG 2: THIẾT KẾ CSDL QUAN HỆ SQL SERVER (RDBMS CORE &amp; NOSQL INTEGRATION DESIGN)](#chuong-2-thiet-ke-csdl-quan-he-sql-server-rdbms-core--nosql-integration-design)</w:t>
+        <w:t>[CHƯƠNG 2: THIẾT KẾ CSDL QUAN HỆ SQL SERVER VÀ TÍCH HỢP NOSQL (RDBMS CORE &amp; NOSQL INTEGRATION)](#chuong-2-thiet-ke-csdl-quan-he-sql-server-va-tich-hop-nosql-rdbms-core--nosql-integration)</w:t>
       </w:r>
     </w:p>
     <w:p>
@@ -732,7 +732,7 @@
           <w:color w:val="004080"/>
           <w:sz w:val="32"/>
         </w:rPr>
-        <w:t>CHƯƠNG 2: THIẾT KẾ CSDL QUAN HỆ SQL SERVER (RDBMS CORE &amp; NOSQL INTEGRATION DESIGN)</w:t>
+        <w:t>CHƯƠNG 2: THIẾT KẾ CSDL QUAN HỆ SQL SERVER VÀ TÍCH HỢP NOSQL (RDBMS CORE &amp; NOSQL INTEGRATION)</w:t>
       </w:r>
     </w:p>
     <w:p>
@@ -788,13 +788,13 @@
           <w:rFonts w:ascii="Times New Roman" w:hAnsi="Times New Roman"/>
           <w:b/>
         </w:rPr>
-        <w:t>1. Phối hợp với Redis:</w:t>
+        <w:t>1. Tích hợp với Redis:</w:t>
       </w:r>
       <w:r>
         <w:rPr>
           <w:rFonts w:ascii="Times New Roman" w:hAnsi="Times New Roman"/>
         </w:rPr>
-        <w:t xml:space="preserve"> SQL Server lưu trữ danh mục Ghế (`Ghe`) và Suất Chiếu (`SuatChieu`). Khi khách hàng chọn ghế, Redis chịu trách nhiệm tạm khóa ghế `seat_lock:{suatChieuId}:{gheId}` trong 5 phút. Khi thanh toán hoàn tất, dữ liệu hóa đơn chính thức được ghi về SQL Server và Redis giải phóng khóa tạm.</w:t>
+        <w:t xml:space="preserve"> SQL Server quản lý danh mục `Ghe` và `SuatChieu`. Khi khách hàng chọn ghế, Redis chịu trách nhiệm tạm khóa ghế `seat_lock:{suatChieuId}:{gheId}` trong 5 phút. Khi thanh toán hoàn tất, dữ liệu hóa đơn chính thức được ghi về SQL Server và Redis giải phóng khóa tạm.</w:t>
       </w:r>
     </w:p>
     <w:p>
@@ -812,7 +812,7 @@
           <w:rFonts w:ascii="Times New Roman" w:hAnsi="Times New Roman"/>
           <w:b/>
         </w:rPr>
-        <w:t>2. Phối hợp với Neo4j:</w:t>
+        <w:t>2. Tích hợp với Neo4j:</w:t>
       </w:r>
       <w:r>
         <w:rPr>
@@ -836,7 +836,7 @@
           <w:rFonts w:ascii="Times New Roman" w:hAnsi="Times New Roman"/>
           <w:b/>
         </w:rPr>
-        <w:t>3. Phối hợp với MongoDB:</w:t>
+        <w:t>3. Tích hợp với MongoDB:</w:t>
       </w:r>
       <w:r>
         <w:rPr>
@@ -860,7 +860,7 @@
           <w:rFonts w:ascii="Times New Roman" w:hAnsi="Times New Roman"/>
           <w:b/>
         </w:rPr>
-        <w:t>4. Phối hợp với Cassandra:</w:t>
+        <w:t>4. Tích hợp với Cassandra:</w:t>
       </w:r>
       <w:r>
         <w:rPr>
@@ -880,199 +880,79 @@
           <w:color w:val="222222"/>
           <w:sz w:val="28"/>
         </w:rPr>
-        <w:t>2.2 Bảng Mô tả Chi tiết Thực thể SQL Server:</w:t>
+        <w:t>2.2 Các Thực thể Cốt lõi SQL Server:</w:t>
       </w:r>
     </w:p>
     <w:p>
       <w:pPr>
+        <w:pStyle w:val="ListBullet"/>
         <w:spacing w:before="40" w:after="40"/>
       </w:pPr>
       <w:r>
         <w:rPr>
           <w:rFonts w:ascii="Times New Roman" w:hAnsi="Times New Roman"/>
         </w:rPr>
-        <w:t xml:space="preserve">1. </w:t>
+        <w:t>`NguoiDung` (`UserID`, `TenDangNhap`, `MatKhau`, `Email`, `GroupID`)</w:t>
       </w:r>
-      <w:r>
-        <w:rPr>
-          <w:rFonts w:ascii="Times New Roman" w:hAnsi="Times New Roman"/>
-          <w:b/>
-        </w:rPr>
-        <w:t>`NguoiDung`</w:t>
-      </w:r>
+    </w:p>
+    <w:p>
+      <w:pPr>
+        <w:pStyle w:val="ListBullet"/>
+        <w:spacing w:before="40" w:after="40"/>
+      </w:pPr>
       <w:r>
         <w:rPr>
           <w:rFonts w:ascii="Times New Roman" w:hAnsi="Times New Roman"/>
         </w:rPr>
-        <w:t>: `UserID` (PK, int), `TenDangNhap` (nvarchar), `MatKhau` (nvarchar), `HoTen`, `Email`, `SoDienThoai`, `GroupID` (1: Admin, 2: Customer).</w:t>
+        <w:t>`Phim` (`PhimID`, `TenPhim`, `Poster`, `ThoiLuong`, `MoTa`)</w:t>
       </w:r>
     </w:p>
     <w:p>
       <w:pPr>
+        <w:pStyle w:val="ListBullet"/>
         <w:spacing w:before="40" w:after="40"/>
       </w:pPr>
       <w:r>
         <w:rPr>
           <w:rFonts w:ascii="Times New Roman" w:hAnsi="Times New Roman"/>
         </w:rPr>
-        <w:t xml:space="preserve">2. </w:t>
+        <w:t>`Rap` (`RapID`, `TenRap`, `DiaChi`) - `PhongChieu` (`PhongID`, `TenPhong`, `RapID`)</w:t>
       </w:r>
-      <w:r>
-        <w:rPr>
-          <w:rFonts w:ascii="Times New Roman" w:hAnsi="Times New Roman"/>
-          <w:b/>
-        </w:rPr>
-        <w:t>`Phim`</w:t>
-      </w:r>
+    </w:p>
+    <w:p>
+      <w:pPr>
+        <w:pStyle w:val="ListBullet"/>
+        <w:spacing w:before="40" w:after="40"/>
+      </w:pPr>
       <w:r>
         <w:rPr>
           <w:rFonts w:ascii="Times New Roman" w:hAnsi="Times New Roman"/>
         </w:rPr>
-        <w:t>: `PhimID` (PK, int), `TenPhim`, `DaoDien`, `DienVien`, `Poster`, `ThoiLuong`, `NgayKhoiChieu`, `MoTa`.</w:t>
+        <w:t>`SuatChieu` (`SuatChieuID`, `PhimID`, `PhongID`, `NgayChieu`, `GioChieu`, `GiaVe`)</w:t>
       </w:r>
     </w:p>
     <w:p>
       <w:pPr>
+        <w:pStyle w:val="ListBullet"/>
         <w:spacing w:before="40" w:after="40"/>
       </w:pPr>
       <w:r>
         <w:rPr>
           <w:rFonts w:ascii="Times New Roman" w:hAnsi="Times New Roman"/>
         </w:rPr>
-        <w:t xml:space="preserve">3. </w:t>
+        <w:t>`Ghe` (`GheID`, `PhongID`, `TenGhe`, `LoaiGhe`)</w:t>
       </w:r>
-      <w:r>
-        <w:rPr>
-          <w:rFonts w:ascii="Times New Roman" w:hAnsi="Times New Roman"/>
-          <w:b/>
-        </w:rPr>
-        <w:t>`Rap`</w:t>
-      </w:r>
+    </w:p>
+    <w:p>
+      <w:pPr>
+        <w:pStyle w:val="ListBullet"/>
+        <w:spacing w:before="40" w:after="40"/>
+      </w:pPr>
       <w:r>
         <w:rPr>
           <w:rFonts w:ascii="Times New Roman" w:hAnsi="Times New Roman"/>
         </w:rPr>
-        <w:t>: `RapID` (PK, int), `TenRap`, `DiaChi`, `SoDienThoai`.</w:t>
-      </w:r>
-    </w:p>
-    <w:p>
-      <w:pPr>
-        <w:spacing w:before="40" w:after="40"/>
-      </w:pPr>
-      <w:r>
-        <w:rPr>
-          <w:rFonts w:ascii="Times New Roman" w:hAnsi="Times New Roman"/>
-        </w:rPr>
-        <w:t xml:space="preserve">4. </w:t>
-      </w:r>
-      <w:r>
-        <w:rPr>
-          <w:rFonts w:ascii="Times New Roman" w:hAnsi="Times New Roman"/>
-          <w:b/>
-        </w:rPr>
-        <w:t>`PhongChieu`</w:t>
-      </w:r>
-      <w:r>
-        <w:rPr>
-          <w:rFonts w:ascii="Times New Roman" w:hAnsi="Times New Roman"/>
-        </w:rPr>
-        <w:t>: `PhongID` (PK, int), `TenPhong`, `RapID` (FK).</w:t>
-      </w:r>
-    </w:p>
-    <w:p>
-      <w:pPr>
-        <w:spacing w:before="40" w:after="40"/>
-      </w:pPr>
-      <w:r>
-        <w:rPr>
-          <w:rFonts w:ascii="Times New Roman" w:hAnsi="Times New Roman"/>
-        </w:rPr>
-        <w:t xml:space="preserve">5. </w:t>
-      </w:r>
-      <w:r>
-        <w:rPr>
-          <w:rFonts w:ascii="Times New Roman" w:hAnsi="Times New Roman"/>
-          <w:b/>
-        </w:rPr>
-        <w:t>`SuatChieu`</w:t>
-      </w:r>
-      <w:r>
-        <w:rPr>
-          <w:rFonts w:ascii="Times New Roman" w:hAnsi="Times New Roman"/>
-        </w:rPr>
-        <w:t>: `SuatChieuID` (PK, int), `PhimID` (FK), `PhongID` (FK), `NgayChieu`, `GioChieu`, `GiaVe`.</w:t>
-      </w:r>
-    </w:p>
-    <w:p>
-      <w:pPr>
-        <w:spacing w:before="40" w:after="40"/>
-      </w:pPr>
-      <w:r>
-        <w:rPr>
-          <w:rFonts w:ascii="Times New Roman" w:hAnsi="Times New Roman"/>
-        </w:rPr>
-        <w:t xml:space="preserve">6. </w:t>
-      </w:r>
-      <w:r>
-        <w:rPr>
-          <w:rFonts w:ascii="Times New Roman" w:hAnsi="Times New Roman"/>
-          <w:b/>
-        </w:rPr>
-        <w:t>`Ghe`</w:t>
-      </w:r>
-      <w:r>
-        <w:rPr>
-          <w:rFonts w:ascii="Times New Roman" w:hAnsi="Times New Roman"/>
-        </w:rPr>
-        <w:t>: `GheID` (PK, int), `PhongID` (FK), `TenGhe`, `LoaiGhe` (Thường / VIP).</w:t>
-      </w:r>
-    </w:p>
-    <w:p>
-      <w:pPr>
-        <w:spacing w:before="40" w:after="40"/>
-      </w:pPr>
-      <w:r>
-        <w:rPr>
-          <w:rFonts w:ascii="Times New Roman" w:hAnsi="Times New Roman"/>
-        </w:rPr>
-        <w:t xml:space="preserve">7. </w:t>
-      </w:r>
-      <w:r>
-        <w:rPr>
-          <w:rFonts w:ascii="Times New Roman" w:hAnsi="Times New Roman"/>
-          <w:b/>
-        </w:rPr>
-        <w:t>`HoaDon`</w:t>
-      </w:r>
-      <w:r>
-        <w:rPr>
-          <w:rFonts w:ascii="Times New Roman" w:hAnsi="Times New Roman"/>
-        </w:rPr>
-        <w:t>: `HoaDonID` (PK, int), `UserID` (FK), `NgayDat`, `TongTien`, `TrangThai`.</w:t>
-      </w:r>
-    </w:p>
-    <w:p>
-      <w:pPr>
-        <w:spacing w:before="40" w:after="40"/>
-      </w:pPr>
-      <w:r>
-        <w:rPr>
-          <w:rFonts w:ascii="Times New Roman" w:hAnsi="Times New Roman"/>
-        </w:rPr>
-        <w:t xml:space="preserve">8. </w:t>
-      </w:r>
-      <w:r>
-        <w:rPr>
-          <w:rFonts w:ascii="Times New Roman" w:hAnsi="Times New Roman"/>
-          <w:b/>
-        </w:rPr>
-        <w:t>`Ve`</w:t>
-      </w:r>
-      <w:r>
-        <w:rPr>
-          <w:rFonts w:ascii="Times New Roman" w:hAnsi="Times New Roman"/>
-        </w:rPr>
-        <w:t>: `VeID` (PK, int), `SuatChieuID` (FK), `GheID` (FK), `HoaDonID` (FK), `GiaVe`.</w:t>
+        <w:t>`HoaDon` (`HoaDonID`, `UserID`, `NgayDat`, `TongTien`, `TrangThai`) - `Ve` (`VeID`, `SuatChieuID`, `GheID`, `HoaDonID`)</w:t>
       </w:r>
     </w:p>
     <w:p>

</xml_diff>

<commit_message>
[Doc] Bo sung Luong Active Session Dang Nhap va Luong Gio Hang Dat Ve Redis vao Chuong 4 va Chuong 8
</commit_message>
<xml_diff>
--- a/TaiLieu/TaiLieu_SDS_ToanBo_HeThong_Movana.docx
+++ b/TaiLieu/TaiLieu_SDS_ToanBo_HeThong_Movana.docx
@@ -167,7 +167,7 @@
         <w:rPr>
           <w:rFonts w:ascii="Times New Roman" w:hAnsi="Times New Roman"/>
         </w:rPr>
-        <w:t xml:space="preserve"> (Key-Value Store: Tạm khóa giữ ghế Realtime, TTL Đếm ngược 5 phút)</w:t>
+        <w:t xml:space="preserve"> (Key-Value Store: Tạm khóa giữ ghế Realtime, Session Đăng nhập, Giỏ hàng đếm ngược)</w:t>
       </w:r>
     </w:p>
     <w:p>
@@ -539,13 +539,13 @@
           <w:rFonts w:ascii="Times New Roman" w:hAnsi="Times New Roman"/>
           <w:b/>
         </w:rPr>
-        <w:t>Khóa tạm giữ ghế đếm ngược thời gian thực (Redis):</w:t>
+        <w:t>Khóa tạm giữ ghế &amp; Giỏ hàng đếm ngược thời gian thực (Redis):</w:t>
       </w:r>
       <w:r>
         <w:rPr>
           <w:rFonts w:ascii="Times New Roman" w:hAnsi="Times New Roman"/>
         </w:rPr>
-        <w:t xml:space="preserve"> Giữ tạm thời ghế ngồi trong 5 phút với độ trễ cực thấp (&lt; 1ms), ngăn ngừa xung đột đụng độ 2 người mua cùng 1 ghế.</w:t>
+        <w:t xml:space="preserve"> Quản lý Session đăng nhập (TTL 1h), giữ tạm ghế ngồi và giỏ hàng trong 5 phút với độ trễ cực thấp (&lt; 1ms), ngăn ngừa xung đột đụng độ 2 người mua cùng 1 ghế.</w:t>
       </w:r>
     </w:p>
     <w:p>
@@ -682,7 +682,7 @@
               <w:br/>
               <w:t xml:space="preserve">    DB_MGDB[("2. MongoDB 7.0 Document Store&lt;br/&gt;(Khiếu nại Khách hàng, Mã giảm giá)")]</w:t>
               <w:br/>
-              <w:t xml:space="preserve">    DB_REDIS[("3. Redis 7.0 Key-Value&lt;br/&gt;(Khóa ghế đếm ngược TTL 5 phút)")]</w:t>
+              <w:t xml:space="preserve">    DB_REDIS[("3. Redis 7.0 Key-Value&lt;br/&gt;(Session Đăng nhập, Khóa ghế &amp; Giỏ hàng đếm ngược)")]</w:t>
               <w:br/>
               <w:t xml:space="preserve">    DB_NEO[("4. Neo4j 5.0 Graph DB&lt;br/&gt;(Gợi ý Top Phim thịnh hành)")]</w:t>
               <w:br/>
@@ -794,7 +794,7 @@
         <w:rPr>
           <w:rFonts w:ascii="Times New Roman" w:hAnsi="Times New Roman"/>
         </w:rPr>
-        <w:t xml:space="preserve"> SQL Server quản lý danh mục `Ghe` và `SuatChieu`. Khi khách hàng chọn ghế, Redis chịu trách nhiệm tạm khóa ghế `seat_lock:{suatChieuId}:{gheId}` trong 5 phút. Khi thanh toán hoàn tất, dữ liệu hóa đơn chính thức được ghi về SQL Server và Redis giải phóng khóa tạm.</w:t>
+        <w:t xml:space="preserve"> SQL Server quản lý danh mục `Ghe` và `SuatChieu`. Khi khách hàng đăng nhập, Redis lưu giữ Session người dùng `user_session:{userId}` (TTL 3600s). Khi chọn ghế và combo nước uống, Redis quản lý Giỏ hàng tạm thời `cart:{userId}:{suatChieuId}` và khóa ghế `seat_lock:{suatChieuId}:{gheId}` trong 5 phút. Khi thanh toán hoàn tất, dữ liệu hóa đơn chính thức được ghi về SQL Server và Redis giải phóng giỏ hàng / khóa tạm.</w:t>
       </w:r>
     </w:p>
     <w:p>
@@ -1553,7 +1553,7 @@
           <w:color w:val="222222"/>
           <w:sz w:val="28"/>
         </w:rPr>
-        <w:t>4.1 Phạm vi nhiệm vụ &amp; Cơ chế TTL</w:t>
+        <w:t>4.1 Phạm vi nhiệm vụ &amp; Cơ chế TTL In-Memory</w:t>
       </w:r>
     </w:p>
     <w:p>
@@ -1595,37 +1595,84 @@
           <w:rFonts w:ascii="Times New Roman" w:hAnsi="Times New Roman"/>
           <w:b/>
         </w:rPr>
-        <w:t>Phạm vi:</w:t>
+        <w:t>Phạm vi nhiệm vụ:</w:t>
       </w:r>
       <w:r>
         <w:rPr>
           <w:rFonts w:ascii="Times New Roman" w:hAnsi="Times New Roman"/>
         </w:rPr>
-        <w:t xml:space="preserve"> Khóa tạm thời ghế ngồi (Realtime Seat Locking) khi Khách hàng thao tác chọn ghế đặt vé, ngăn đụng độ 2 người mua cùng 1 ghế.</w:t>
       </w:r>
     </w:p>
     <w:p>
       <w:pPr>
-        <w:pStyle w:val="ListBullet"/>
         <w:spacing w:before="40" w:after="40"/>
       </w:pPr>
       <w:r>
         <w:rPr>
           <w:rFonts w:ascii="Times New Roman" w:hAnsi="Times New Roman"/>
         </w:rPr>
+        <w:t xml:space="preserve">1. </w:t>
       </w:r>
       <w:r>
         <w:rPr>
           <w:rFonts w:ascii="Times New Roman" w:hAnsi="Times New Roman"/>
           <w:b/>
         </w:rPr>
-        <w:t>Thời gian đếm ngược (TTL):</w:t>
+        <w:t>Quản lý Session Đăng Nhập (User Session Store):</w:t>
       </w:r>
       <w:r>
         <w:rPr>
           <w:rFonts w:ascii="Times New Roman" w:hAnsi="Times New Roman"/>
         </w:rPr>
-        <w:t xml:space="preserve"> `300` giây (5 phút). Sau 5 phút, Key tự động hủy để trả lại ghế cho người khác.</w:t>
+        <w:t xml:space="preserve"> Lưu phiên đăng nhập người dùng với TTL = `3600` giây (1 giờ), giúp xác thực truy cập siêu tốc mà không cần query lại SQL Server.</w:t>
+      </w:r>
+    </w:p>
+    <w:p>
+      <w:pPr>
+        <w:spacing w:before="40" w:after="40"/>
+      </w:pPr>
+      <w:r>
+        <w:rPr>
+          <w:rFonts w:ascii="Times New Roman" w:hAnsi="Times New Roman"/>
+        </w:rPr>
+        <w:t xml:space="preserve">2. </w:t>
+      </w:r>
+      <w:r>
+        <w:rPr>
+          <w:rFonts w:ascii="Times New Roman" w:hAnsi="Times New Roman"/>
+          <w:b/>
+        </w:rPr>
+        <w:t>Quản lý Giỏ Hàng Chọn Vé (Realtime Cart Reservation):</w:t>
+      </w:r>
+      <w:r>
+        <w:rPr>
+          <w:rFonts w:ascii="Times New Roman" w:hAnsi="Times New Roman"/>
+        </w:rPr>
+        <w:t xml:space="preserve"> Lưu tạm thời các ghế và combo nước uống đang chọn trong Giỏ hàng với TTL = `300` giây (5 phút).</w:t>
+      </w:r>
+    </w:p>
+    <w:p>
+      <w:pPr>
+        <w:spacing w:before="40" w:after="40"/>
+      </w:pPr>
+      <w:r>
+        <w:rPr>
+          <w:rFonts w:ascii="Times New Roman" w:hAnsi="Times New Roman"/>
+        </w:rPr>
+        <w:t xml:space="preserve">3. </w:t>
+      </w:r>
+      <w:r>
+        <w:rPr>
+          <w:rFonts w:ascii="Times New Roman" w:hAnsi="Times New Roman"/>
+          <w:b/>
+        </w:rPr>
+        <w:t>Khóa Tạm Giữ Ghế Thời Gian Thực (Realtime Seat Locking):</w:t>
+      </w:r>
+      <w:r>
+        <w:rPr>
+          <w:rFonts w:ascii="Times New Roman" w:hAnsi="Times New Roman"/>
+        </w:rPr>
+        <w:t xml:space="preserve"> Tạm giữ ghế ngồi tránh xung đột đụng độ 2 người mua cùng 1 ghế với TTL = `300` giây (5 phút).</w:t>
       </w:r>
     </w:p>
     <w:p>
@@ -1639,80 +1686,397 @@
           <w:color w:val="222222"/>
           <w:sz w:val="28"/>
         </w:rPr>
-        <w:t>4.2 Cấu trúc Key Pattern &amp; Kiểu Dữ Liệu:</w:t>
+        <w:t>4.2 Cấu trúc Key Patterns &amp; Kiểu Dữ Liệu Redis:</w:t>
       </w:r>
     </w:p>
+    <w:tbl>
+      <w:tblPr>
+        <w:tblStyle w:val="TableGrid"/>
+        <w:tblW w:type="auto" w:w="0"/>
+        <w:jc w:val="center"/>
+        <w:tblLook w:firstColumn="1" w:firstRow="1" w:lastColumn="0" w:lastRow="0" w:noHBand="0" w:noVBand="1" w:val="04A0"/>
+      </w:tblPr>
+      <w:tblGrid>
+        <w:gridCol w:w="1440"/>
+        <w:gridCol w:w="1440"/>
+        <w:gridCol w:w="1440"/>
+        <w:gridCol w:w="1440"/>
+        <w:gridCol w:w="1440"/>
+        <w:gridCol w:w="1440"/>
+      </w:tblGrid>
+      <w:tr>
+        <w:tc>
+          <w:tcPr>
+            <w:tcW w:type="dxa" w:w="1440"/>
+            <w:shd w:val="clear" w:color="auto" w:fill="003366"/>
+          </w:tcPr>
+          <w:p>
+            <w:r>
+              <w:rPr>
+                <w:rFonts w:ascii="Times New Roman" w:hAnsi="Times New Roman"/>
+                <w:b/>
+                <w:color w:val="FFFFFF"/>
+              </w:rPr>
+              <w:t>STT</w:t>
+            </w:r>
+          </w:p>
+        </w:tc>
+        <w:tc>
+          <w:tcPr>
+            <w:tcW w:type="dxa" w:w="1440"/>
+            <w:shd w:val="clear" w:color="auto" w:fill="003366"/>
+          </w:tcPr>
+          <w:p>
+            <w:r>
+              <w:rPr>
+                <w:rFonts w:ascii="Times New Roman" w:hAnsi="Times New Roman"/>
+                <w:b/>
+                <w:color w:val="FFFFFF"/>
+              </w:rPr>
+              <w:t>Chức Năng Nghiệp Vụ</w:t>
+            </w:r>
+          </w:p>
+        </w:tc>
+        <w:tc>
+          <w:tcPr>
+            <w:tcW w:type="dxa" w:w="1440"/>
+            <w:shd w:val="clear" w:color="auto" w:fill="003366"/>
+          </w:tcPr>
+          <w:p>
+            <w:r>
+              <w:rPr>
+                <w:rFonts w:ascii="Times New Roman" w:hAnsi="Times New Roman"/>
+                <w:b/>
+                <w:color w:val="FFFFFF"/>
+              </w:rPr>
+              <w:t>Cấu Trúc Key Pattern</w:t>
+            </w:r>
+          </w:p>
+        </w:tc>
+        <w:tc>
+          <w:tcPr>
+            <w:tcW w:type="dxa" w:w="1440"/>
+            <w:shd w:val="clear" w:color="auto" w:fill="003366"/>
+          </w:tcPr>
+          <w:p>
+            <w:r>
+              <w:rPr>
+                <w:rFonts w:ascii="Times New Roman" w:hAnsi="Times New Roman"/>
+                <w:b/>
+                <w:color w:val="FFFFFF"/>
+              </w:rPr>
+              <w:t>Kiểu Dữ Liệu</w:t>
+            </w:r>
+          </w:p>
+        </w:tc>
+        <w:tc>
+          <w:tcPr>
+            <w:tcW w:type="dxa" w:w="1440"/>
+            <w:shd w:val="clear" w:color="auto" w:fill="003366"/>
+          </w:tcPr>
+          <w:p>
+            <w:r>
+              <w:rPr>
+                <w:rFonts w:ascii="Times New Roman" w:hAnsi="Times New Roman"/>
+                <w:b/>
+                <w:color w:val="FFFFFF"/>
+              </w:rPr>
+              <w:t>Giá Trị (Value) Sample</w:t>
+            </w:r>
+          </w:p>
+        </w:tc>
+        <w:tc>
+          <w:tcPr>
+            <w:tcW w:type="dxa" w:w="1440"/>
+            <w:shd w:val="clear" w:color="auto" w:fill="003366"/>
+          </w:tcPr>
+          <w:p>
+            <w:r>
+              <w:rPr>
+                <w:rFonts w:ascii="Times New Roman" w:hAnsi="Times New Roman"/>
+                <w:b/>
+                <w:color w:val="FFFFFF"/>
+              </w:rPr>
+              <w:t>Thời Gian Tồn Tại (TTL)</w:t>
+            </w:r>
+          </w:p>
+        </w:tc>
+      </w:tr>
+      <w:tr>
+        <w:tc>
+          <w:tcPr>
+            <w:tcW w:type="dxa" w:w="1440"/>
+            <w:shd w:val="clear" w:color="auto" w:fill="F9F9F9"/>
+          </w:tcPr>
+          <w:p>
+            <w:r>
+              <w:rPr>
+                <w:rFonts w:ascii="Times New Roman" w:hAnsi="Times New Roman"/>
+                <w:sz w:val="22"/>
+              </w:rPr>
+              <w:t>**1**</w:t>
+            </w:r>
+          </w:p>
+        </w:tc>
+        <w:tc>
+          <w:tcPr>
+            <w:tcW w:type="dxa" w:w="1440"/>
+            <w:shd w:val="clear" w:color="auto" w:fill="F9F9F9"/>
+          </w:tcPr>
+          <w:p>
+            <w:r>
+              <w:rPr>
+                <w:rFonts w:ascii="Times New Roman" w:hAnsi="Times New Roman"/>
+                <w:sz w:val="22"/>
+              </w:rPr>
+              <w:t>Session Đăng Nhập</w:t>
+            </w:r>
+          </w:p>
+        </w:tc>
+        <w:tc>
+          <w:tcPr>
+            <w:tcW w:type="dxa" w:w="1440"/>
+            <w:shd w:val="clear" w:color="auto" w:fill="F9F9F9"/>
+          </w:tcPr>
+          <w:p>
+            <w:r>
+              <w:rPr>
+                <w:rFonts w:ascii="Times New Roman" w:hAnsi="Times New Roman"/>
+                <w:sz w:val="22"/>
+              </w:rPr>
+              <w:t>`user_session:{UserID}`</w:t>
+            </w:r>
+          </w:p>
+        </w:tc>
+        <w:tc>
+          <w:tcPr>
+            <w:tcW w:type="dxa" w:w="1440"/>
+            <w:shd w:val="clear" w:color="auto" w:fill="F9F9F9"/>
+          </w:tcPr>
+          <w:p>
+            <w:r>
+              <w:rPr>
+                <w:rFonts w:ascii="Times New Roman" w:hAnsi="Times New Roman"/>
+                <w:sz w:val="22"/>
+              </w:rPr>
+              <w:t>`String` (JSON)</w:t>
+            </w:r>
+          </w:p>
+        </w:tc>
+        <w:tc>
+          <w:tcPr>
+            <w:tcW w:type="dxa" w:w="1440"/>
+            <w:shd w:val="clear" w:color="auto" w:fill="F9F9F9"/>
+          </w:tcPr>
+          <w:p>
+            <w:r>
+              <w:rPr>
+                <w:rFonts w:ascii="Times New Roman" w:hAnsi="Times New Roman"/>
+                <w:sz w:val="22"/>
+              </w:rPr>
+              <w:t>`{"userId":7,"username":"huy","email":"huy@gmail.com","role":"Customer"}`</w:t>
+            </w:r>
+          </w:p>
+        </w:tc>
+        <w:tc>
+          <w:tcPr>
+            <w:tcW w:type="dxa" w:w="1440"/>
+            <w:shd w:val="clear" w:color="auto" w:fill="F9F9F9"/>
+          </w:tcPr>
+          <w:p>
+            <w:r>
+              <w:rPr>
+                <w:rFonts w:ascii="Times New Roman" w:hAnsi="Times New Roman"/>
+                <w:sz w:val="22"/>
+              </w:rPr>
+              <w:t>`3600`s (1 Giờ)</w:t>
+            </w:r>
+          </w:p>
+        </w:tc>
+      </w:tr>
+      <w:tr>
+        <w:tc>
+          <w:tcPr>
+            <w:tcW w:type="dxa" w:w="1440"/>
+          </w:tcPr>
+          <w:p>
+            <w:r>
+              <w:rPr>
+                <w:rFonts w:ascii="Times New Roman" w:hAnsi="Times New Roman"/>
+                <w:sz w:val="22"/>
+              </w:rPr>
+              <w:t>**2**</w:t>
+            </w:r>
+          </w:p>
+        </w:tc>
+        <w:tc>
+          <w:tcPr>
+            <w:tcW w:type="dxa" w:w="1440"/>
+          </w:tcPr>
+          <w:p>
+            <w:r>
+              <w:rPr>
+                <w:rFonts w:ascii="Times New Roman" w:hAnsi="Times New Roman"/>
+                <w:sz w:val="22"/>
+              </w:rPr>
+              <w:t>Giỏ Hàng Đặt Vé</w:t>
+            </w:r>
+          </w:p>
+        </w:tc>
+        <w:tc>
+          <w:tcPr>
+            <w:tcW w:type="dxa" w:w="1440"/>
+          </w:tcPr>
+          <w:p>
+            <w:r>
+              <w:rPr>
+                <w:rFonts w:ascii="Times New Roman" w:hAnsi="Times New Roman"/>
+                <w:sz w:val="22"/>
+              </w:rPr>
+              <w:t>`cart:{UserID}:{SuatChieuID}`</w:t>
+            </w:r>
+          </w:p>
+        </w:tc>
+        <w:tc>
+          <w:tcPr>
+            <w:tcW w:type="dxa" w:w="1440"/>
+          </w:tcPr>
+          <w:p>
+            <w:r>
+              <w:rPr>
+                <w:rFonts w:ascii="Times New Roman" w:hAnsi="Times New Roman"/>
+                <w:sz w:val="22"/>
+              </w:rPr>
+              <w:t>`Set` / `Hash`</w:t>
+            </w:r>
+          </w:p>
+        </w:tc>
+        <w:tc>
+          <w:tcPr>
+            <w:tcW w:type="dxa" w:w="1440"/>
+          </w:tcPr>
+          <w:p>
+            <w:r>
+              <w:rPr>
+                <w:rFonts w:ascii="Times New Roman" w:hAnsi="Times New Roman"/>
+                <w:sz w:val="22"/>
+              </w:rPr>
+              <w:t>`["A1", "A2", "ComboPopcornVIP"]`</w:t>
+            </w:r>
+          </w:p>
+        </w:tc>
+        <w:tc>
+          <w:tcPr>
+            <w:tcW w:type="dxa" w:w="1440"/>
+          </w:tcPr>
+          <w:p>
+            <w:r>
+              <w:rPr>
+                <w:rFonts w:ascii="Times New Roman" w:hAnsi="Times New Roman"/>
+                <w:sz w:val="22"/>
+              </w:rPr>
+              <w:t>`300`s (5 Phút)</w:t>
+            </w:r>
+          </w:p>
+        </w:tc>
+      </w:tr>
+      <w:tr>
+        <w:tc>
+          <w:tcPr>
+            <w:tcW w:type="dxa" w:w="1440"/>
+            <w:shd w:val="clear" w:color="auto" w:fill="F9F9F9"/>
+          </w:tcPr>
+          <w:p>
+            <w:r>
+              <w:rPr>
+                <w:rFonts w:ascii="Times New Roman" w:hAnsi="Times New Roman"/>
+                <w:sz w:val="22"/>
+              </w:rPr>
+              <w:t>**3**</w:t>
+            </w:r>
+          </w:p>
+        </w:tc>
+        <w:tc>
+          <w:tcPr>
+            <w:tcW w:type="dxa" w:w="1440"/>
+            <w:shd w:val="clear" w:color="auto" w:fill="F9F9F9"/>
+          </w:tcPr>
+          <w:p>
+            <w:r>
+              <w:rPr>
+                <w:rFonts w:ascii="Times New Roman" w:hAnsi="Times New Roman"/>
+                <w:sz w:val="22"/>
+              </w:rPr>
+              <w:t>Khóa Tạm Giữ Ghế</w:t>
+            </w:r>
+          </w:p>
+        </w:tc>
+        <w:tc>
+          <w:tcPr>
+            <w:tcW w:type="dxa" w:w="1440"/>
+            <w:shd w:val="clear" w:color="auto" w:fill="F9F9F9"/>
+          </w:tcPr>
+          <w:p>
+            <w:r>
+              <w:rPr>
+                <w:rFonts w:ascii="Times New Roman" w:hAnsi="Times New Roman"/>
+                <w:sz w:val="22"/>
+              </w:rPr>
+              <w:t>`seat_lock:{SuatChieuID}:{GheID}`</w:t>
+            </w:r>
+          </w:p>
+        </w:tc>
+        <w:tc>
+          <w:tcPr>
+            <w:tcW w:type="dxa" w:w="1440"/>
+            <w:shd w:val="clear" w:color="auto" w:fill="F9F9F9"/>
+          </w:tcPr>
+          <w:p>
+            <w:r>
+              <w:rPr>
+                <w:rFonts w:ascii="Times New Roman" w:hAnsi="Times New Roman"/>
+                <w:sz w:val="22"/>
+              </w:rPr>
+              <w:t>`String`</w:t>
+            </w:r>
+          </w:p>
+        </w:tc>
+        <w:tc>
+          <w:tcPr>
+            <w:tcW w:type="dxa" w:w="1440"/>
+            <w:shd w:val="clear" w:color="auto" w:fill="F9F9F9"/>
+          </w:tcPr>
+          <w:p>
+            <w:r>
+              <w:rPr>
+                <w:rFonts w:ascii="Times New Roman" w:hAnsi="Times New Roman"/>
+                <w:sz w:val="22"/>
+              </w:rPr>
+              <w:t>`UserID:7`</w:t>
+            </w:r>
+          </w:p>
+        </w:tc>
+        <w:tc>
+          <w:tcPr>
+            <w:tcW w:type="dxa" w:w="1440"/>
+            <w:shd w:val="clear" w:color="auto" w:fill="F9F9F9"/>
+          </w:tcPr>
+          <w:p>
+            <w:r>
+              <w:rPr>
+                <w:rFonts w:ascii="Times New Roman" w:hAnsi="Times New Roman"/>
+                <w:sz w:val="22"/>
+              </w:rPr>
+              <w:t>`300`s (5 Phút)</w:t>
+            </w:r>
+          </w:p>
+        </w:tc>
+      </w:tr>
+    </w:tbl>
     <w:p>
       <w:pPr>
-        <w:pStyle w:val="ListBullet"/>
-        <w:spacing w:before="40" w:after="40"/>
-      </w:pPr>
-      <w:r>
-        <w:rPr>
-          <w:rFonts w:ascii="Times New Roman" w:hAnsi="Times New Roman"/>
-        </w:rPr>
-      </w:r>
-      <w:r>
-        <w:rPr>
-          <w:rFonts w:ascii="Times New Roman" w:hAnsi="Times New Roman"/>
-          <w:b/>
-        </w:rPr>
-        <w:t>Key Pattern giữ ghế:</w:t>
-      </w:r>
-      <w:r>
-        <w:rPr>
-          <w:rFonts w:ascii="Times New Roman" w:hAnsi="Times New Roman"/>
-        </w:rPr>
-        <w:t xml:space="preserve"> `seat_lock:{SuatChieuID}:{GheID}` (Ví dụ: `seat_lock:101:A1`).</w:t>
-      </w:r>
-    </w:p>
-    <w:p>
-      <w:pPr>
-        <w:pStyle w:val="ListBullet"/>
-        <w:spacing w:before="40" w:after="40"/>
-      </w:pPr>
-      <w:r>
-        <w:rPr>
-          <w:rFonts w:ascii="Times New Roman" w:hAnsi="Times New Roman"/>
-        </w:rPr>
-      </w:r>
-      <w:r>
-        <w:rPr>
-          <w:rFonts w:ascii="Times New Roman" w:hAnsi="Times New Roman"/>
-          <w:b/>
-        </w:rPr>
-        <w:t>Value:</w:t>
-      </w:r>
-      <w:r>
-        <w:rPr>
-          <w:rFonts w:ascii="Times New Roman" w:hAnsi="Times New Roman"/>
-        </w:rPr>
-        <w:t xml:space="preserve"> `UserID:{UserID}` (Ví dụ: `UserID:7`).</w:t>
-      </w:r>
-    </w:p>
-    <w:p>
-      <w:pPr>
-        <w:pStyle w:val="ListBullet"/>
-        <w:spacing w:before="40" w:after="40"/>
-      </w:pPr>
-      <w:r>
-        <w:rPr>
-          <w:rFonts w:ascii="Times New Roman" w:hAnsi="Times New Roman"/>
-        </w:rPr>
-      </w:r>
-      <w:r>
-        <w:rPr>
-          <w:rFonts w:ascii="Times New Roman" w:hAnsi="Times New Roman"/>
-          <w:b/>
-        </w:rPr>
-        <w:t>Data Type:</w:t>
-      </w:r>
-      <w:r>
-        <w:rPr>
-          <w:rFonts w:ascii="Times New Roman" w:hAnsi="Times New Roman"/>
-        </w:rPr>
-        <w:t xml:space="preserve"> `String`.</w:t>
-      </w:r>
+        <w:spacing w:after="80"/>
+      </w:pPr>
     </w:p>
     <w:p>
       <w:pPr>
@@ -1725,7 +2089,7 @@
           <w:color w:val="222222"/>
           <w:sz w:val="28"/>
         </w:rPr>
-        <w:t>4.3 Bộ Lệnh Redis Shell Command:</w:t>
+        <w:t>4.3 Bộ Lệnh Redis Shell Command Đầy Đủ:</w:t>
       </w:r>
     </w:p>
     <w:tbl>
@@ -1753,22 +2117,63 @@
                 <w:color w:val="1F2428"/>
                 <w:sz w:val="21"/>
               </w:rPr>
-              <w:t># 1. Đặt khóa tạm giữ ghế A1 suất chiếu 101 trong 5 phút (300 giây) nếu ghế chưa bị khóa (NX)</w:t>
+              <w:t># ==========================================</w:t>
+              <w:br/>
+              <w:t># 1. PHÂN HỆ SESSION ĐĂNG NHẬP (USER SESSION)</w:t>
+              <w:br/>
+              <w:t># ==========================================</w:t>
+              <w:br/>
+              <w:t># Khởi tạo Session đăng nhập lưu trữ thông tin User trong Redis 1 giờ (3600s)</w:t>
+              <w:br/>
+              <w:t>SET user_session:7 "{\"userId\":7,\"username\":\"huy\",\"role\":\"Customer\"}" EX 3600</w:t>
+              <w:br/>
+              <w:br/>
+              <w:t># Kiểm tra thông tin Session khi người dùng chuyển trang</w:t>
+              <w:br/>
+              <w:t>GET user_session:7</w:t>
+              <w:br/>
+              <w:br/>
+              <w:t># Đăng xuất: Xóa Session đăng nhập khỏi Redis</w:t>
+              <w:br/>
+              <w:t>DEL user_session:7</w:t>
+              <w:br/>
+              <w:br/>
+              <w:t># ==========================================</w:t>
+              <w:br/>
+              <w:t># 2. PHÂN HỆ GIỎ HÀNG CHỌN VÉ (REALTIME CART FLOW)</w:t>
+              <w:br/>
+              <w:t># ==========================================</w:t>
+              <w:br/>
+              <w:t># Thêm ghế A1 và A2 vào Giỏ hàng đặt vé suất chiếu 101 của khách hàng User 7</w:t>
+              <w:br/>
+              <w:t>SADD cart:7:101 "A1" "A2"</w:t>
+              <w:br/>
+              <w:t>EXPIRE cart:7:101 300</w:t>
+              <w:br/>
+              <w:br/>
+              <w:t># Lấy danh sách toàn bộ items ghế có trong giỏ hàng hiện tại</w:t>
+              <w:br/>
+              <w:t>SMEMBERS cart:7:101</w:t>
+              <w:br/>
+              <w:br/>
+              <w:t># Xóa giỏ hàng khi người dùng hủy hoặc thanh toán thành công</w:t>
+              <w:br/>
+              <w:t>DEL cart:7:101</w:t>
+              <w:br/>
+              <w:br/>
+              <w:t># ==========================================</w:t>
+              <w:br/>
+              <w:t># 3. PHÂN HỆ KHÓA TẠM GIỮ GHẾ (REALTIME SEAT LOCK)</w:t>
+              <w:br/>
+              <w:t># ==========================================</w:t>
+              <w:br/>
+              <w:t># Đặt khóa giữ ghế A1 suất 101 trong 5 phút (NX: chỉ khóa khi ghế còn trống)</w:t>
               <w:br/>
               <w:t>SET seat_lock:101:A1 "UserID:7" NX EX 300</w:t>
               <w:br/>
-              <w:br/>
-              <w:t># 2. Kiểm tra xem ghế A1 suất 101 có đang bị ai giữ không</w:t>
-              <w:br/>
               <w:t>EXISTS seat_lock:101:A1</w:t>
               <w:br/>
-              <w:br/>
-              <w:t># 3. Xem thời gian giữ ghế còn lại bao nhiêu giây</w:t>
-              <w:br/>
               <w:t>TTL seat_lock:101:A1</w:t>
-              <w:br/>
-              <w:br/>
-              <w:t># 4. Giải phóng khóa giữ ghế khi khách bỏ chọn hoặc hoàn tất thanh toán</w:t>
               <w:br/>
               <w:t>DEL seat_lock:101:A1</w:t>
             </w:r>
@@ -1820,7 +2225,35 @@
                 <w:color w:val="1F2428"/>
                 <w:sz w:val="21"/>
               </w:rPr>
-              <w:t>// Đặt khóa giữ ghế 5 phút</w:t>
+              <w:t>// 1. Quản lý Session Đăng Nhập</w:t>
+              <w:br/>
+              <w:t>public bool SaveUserSession(int userId, object userSessionData) {</w:t>
+              <w:br/>
+              <w:t xml:space="preserve">    string key = $"user_session:{userId}";</w:t>
+              <w:br/>
+              <w:t xml:space="preserve">    string jsonValue = JsonConvert.SerializeObject(userSessionData);</w:t>
+              <w:br/>
+              <w:t xml:space="preserve">    return redisDb.StringSet(key, jsonValue, TimeSpan.FromHours(1));</w:t>
+              <w:br/>
+              <w:t>}</w:t>
+              <w:br/>
+              <w:br/>
+              <w:t>// 2. Quản lý Giỏ Hàng Đặt Vé</w:t>
+              <w:br/>
+              <w:t>public bool AddToCart(int userId, int suatChieuId, string seatName) {</w:t>
+              <w:br/>
+              <w:t xml:space="preserve">    string key = $"cart:{userId}:{suatChieuId}";</w:t>
+              <w:br/>
+              <w:t xml:space="preserve">    bool added = redisDb.SetAdd(key, seatName);</w:t>
+              <w:br/>
+              <w:t xml:space="preserve">    redisDb.KeyExpire(key, TimeSpan.FromMinutes(5));</w:t>
+              <w:br/>
+              <w:t xml:space="preserve">    return added;</w:t>
+              <w:br/>
+              <w:t>}</w:t>
+              <w:br/>
+              <w:br/>
+              <w:t>// 3. Quản lý Khóa Giữ Ghế 5 Phút</w:t>
               <w:br/>
               <w:t>public bool LockSeat(int suatChieuId, int gheId, int userId) {</w:t>
               <w:br/>
@@ -1829,17 +2262,6 @@
               <w:t xml:space="preserve">    string val = $"UserID:{userId}";</w:t>
               <w:br/>
               <w:t xml:space="preserve">    return redisDb.StringSet(key, val, TimeSpan.FromMinutes(5), When.NotExists);</w:t>
-              <w:br/>
-              <w:t>}</w:t>
-              <w:br/>
-              <w:br/>
-              <w:t>// Xóa khóa giữ ghế</w:t>
-              <w:br/>
-              <w:t>public bool UnlockSeat(int suatChieuId, int gheId) {</w:t>
-              <w:br/>
-              <w:t xml:space="preserve">    string key = $"seat_lock:{suatChieuId}:{gheId}";</w:t>
-              <w:br/>
-              <w:t xml:space="preserve">    return redisDb.KeyDelete(key);</w:t>
               <w:br/>
               <w:t>}</w:t>
             </w:r>
@@ -2935,6 +3357,10 @@
               <w:br/>
               <w:t xml:space="preserve">    class RedisManager {</w:t>
               <w:br/>
+              <w:t xml:space="preserve">        +SaveUserSession(userId, sessionData)</w:t>
+              <w:br/>
+              <w:t xml:space="preserve">        +AddToCart(userId, suatChieuId, seatName)</w:t>
+              <w:br/>
               <w:t xml:space="preserve">        +LockSeat(suatChieuId, gheId, userId)</w:t>
               <w:br/>
               <w:t xml:space="preserve">        +UnlockSeat(suatChieuId, gheId)</w:t>
@@ -2946,7 +3372,7 @@
               <w:br/>
               <w:t xml:space="preserve">    HomeController --&gt; Neo4jService : Gọi gợi ý &amp; thả tim Phim</w:t>
               <w:br/>
-              <w:t xml:space="preserve">    DatVeController --&gt; RedisManager : Tạm giữ ghế 5 phút</w:t>
+              <w:t xml:space="preserve">    DatVeController --&gt; RedisManager : Session, Giỏ hàng &amp; Tạm giữ ghế 5 phút</w:t>
               <w:br/>
               <w:t xml:space="preserve">    DatVeController --&gt; CassandraService : Ghi Log thanh toán vé</w:t>
               <w:br/>
@@ -3014,7 +3440,7 @@
           <w:b/>
           <w:sz w:val="26"/>
         </w:rPr>
-        <w:t>8.1.1 Luồng Khách Hàng Chọn Ghế &amp; Khóa Ghế Đếm Ngược Realtime (TTL 5 Phút)</w:t>
+        <w:t>8.1.1 Luồng Đăng Nhập &amp; Khởi Tạo Active Session Trong Redis (TTL 1 Giờ)</w:t>
       </w:r>
     </w:p>
     <w:tbl>
@@ -3046,30 +3472,34 @@
               <w:br/>
               <w:t xml:space="preserve">    autonumber</w:t>
               <w:br/>
-              <w:t xml:space="preserve">    actor User as Khách Hàng</w:t>
-              <w:br/>
-              <w:t xml:space="preserve">    participant Web as ASP.NET MVC Backend</w:t>
+              <w:t xml:space="preserve">    actor User as Khách Hàng / User</w:t>
+              <w:br/>
+              <w:t xml:space="preserve">    participant Web as AccountController (C# Backend)</w:t>
+              <w:br/>
+              <w:t xml:space="preserve">    participant SQL as SQL Server RDBMS</w:t>
               <w:br/>
               <w:t xml:space="preserve">    participant Redis as Redis Key-Value</w:t>
               <w:br/>
-              <w:t xml:space="preserve">    participant SQL as SQL Server RDBMS</w:t>
-              <w:br/>
-              <w:br/>
-              <w:t xml:space="preserve">    User-&gt;&gt;Web: Chọn ghế A1 Suất chiếu 101</w:t>
-              <w:br/>
-              <w:t xml:space="preserve">    Web-&gt;&gt;Redis: Lock key 'seat_lock:101:A1' (TTL 300s)</w:t>
-              <w:br/>
-              <w:t xml:space="preserve">    alt Ghế đã bị người khác chọn</w:t>
-              <w:br/>
-              <w:t xml:space="preserve">        Redis--&gt;&gt;Web: Trả về Key đã tồn tại</w:t>
-              <w:br/>
-              <w:t xml:space="preserve">        Web--&gt;&gt;User: Báo lỗi ghế đã bị giữ bởi người khác</w:t>
-              <w:br/>
-              <w:t xml:space="preserve">    else Ghế còn trống</w:t>
-              <w:br/>
-              <w:t xml:space="preserve">        Redis--&gt;&gt;Web: Khóa ghế thành công (True)</w:t>
-              <w:br/>
-              <w:t xml:space="preserve">        Web--&gt;&gt;User: Hiển thị đếm ngược 5 phút thanh toán</w:t>
+              <w:br/>
+              <w:t xml:space="preserve">    User-&gt;&gt;Web: Nhập Username &amp; Password bấm Đăng Nhập</w:t>
+              <w:br/>
+              <w:t xml:space="preserve">    Web-&gt;&gt;SQL: SELECT * FROM NguoiDung WHERE TenDangNhap = ...</w:t>
+              <w:br/>
+              <w:t xml:space="preserve">    alt Mật khẩu sai</w:t>
+              <w:br/>
+              <w:t xml:space="preserve">        SQL--&gt;&gt;Web: Trả về null</w:t>
+              <w:br/>
+              <w:t xml:space="preserve">        Web--&gt;&gt;User: Hiển thị báo lỗi Đăng nhập thất bại</w:t>
+              <w:br/>
+              <w:t xml:space="preserve">    else Đăng nhập thành công</w:t>
+              <w:br/>
+              <w:t xml:space="preserve">        SQL--&gt;&gt;Web: Trả về thông tin NguoiDung (UserID: 7)</w:t>
+              <w:br/>
+              <w:t xml:space="preserve">        Web-&gt;&gt;Redis: SET 'user_session:7' "{'userId':7, 'role':'Customer'}" EX 3600</w:t>
+              <w:br/>
+              <w:t xml:space="preserve">        Redis--&gt;&gt;Web: Lưu Session thành công (TTL 1 Giờ)</w:t>
+              <w:br/>
+              <w:t xml:space="preserve">        Web--&gt;&gt;User: Chuyển hướng Trang Chủ &amp; Đăng nhập hoàn tất</w:t>
               <w:br/>
               <w:t xml:space="preserve">    end</w:t>
             </w:r>
@@ -3092,7 +3522,7 @@
           <w:b/>
           <w:sz w:val="26"/>
         </w:rPr>
-        <w:t>8.1.2 Luồng Giải Phóng Khóa Giữ Ghế Khi Hủy Chọn Hoặc Thanh Toán Hoàn Tất (Redis Key Delete)</w:t>
+        <w:t>8.1.2 Luồng Quản Lý Giỏ Hàng Chọn Vé &amp; Khóa Ghế Đếm Ngược Realtime (TTL 5 Phút)</w:t>
       </w:r>
     </w:p>
     <w:tbl>
@@ -3126,6 +3556,82 @@
               <w:br/>
               <w:t xml:space="preserve">    actor User as Khách Hàng</w:t>
               <w:br/>
+              <w:t xml:space="preserve">    participant Web as DatVeController (C# Backend)</w:t>
+              <w:br/>
+              <w:t xml:space="preserve">    participant Redis as Redis Key-Value</w:t>
+              <w:br/>
+              <w:br/>
+              <w:t xml:space="preserve">    User-&gt;&gt;Web: Thao tác chọn ghế A1 &amp; A2 Suất chiếu 101</w:t>
+              <w:br/>
+              <w:t xml:space="preserve">    Web-&gt;&gt;Redis: SADD 'cart:7:101' "A1" "A2" &amp; SET 'seat_lock:101:A1' "UserID:7" EX 300</w:t>
+              <w:br/>
+              <w:t xml:space="preserve">    alt Ghế đã bị người khác giữ trước</w:t>
+              <w:br/>
+              <w:t xml:space="preserve">        Redis--&gt;&gt;Web: Trả về Key đã tồn tại</w:t>
+              <w:br/>
+              <w:t xml:space="preserve">        Web--&gt;&gt;User: Báo lỗi ghế đã bị giữ bởi người khác</w:t>
+              <w:br/>
+              <w:t xml:space="preserve">    else Ghế còn trống</w:t>
+              <w:br/>
+              <w:t xml:space="preserve">        Redis--&gt;&gt;Web: Thêm vào Giỏ hàng &amp; Khóa ghế thành công (True)</w:t>
+              <w:br/>
+              <w:t xml:space="preserve">        Web--&gt;&gt;User: Cập nhật Giỏ hàng &amp; Đếm ngược 5 phút thanh toán</w:t>
+              <w:br/>
+              <w:t xml:space="preserve">    end</w:t>
+            </w:r>
+          </w:p>
+        </w:tc>
+      </w:tr>
+    </w:tbl>
+    <w:p>
+      <w:pPr>
+        <w:spacing w:before="0" w:after="80"/>
+      </w:pPr>
+    </w:p>
+    <w:p>
+      <w:pPr>
+        <w:spacing w:before="160" w:after="40"/>
+      </w:pPr>
+      <w:r>
+        <w:rPr>
+          <w:rFonts w:ascii="Times New Roman" w:hAnsi="Times New Roman"/>
+          <w:b/>
+          <w:sz w:val="26"/>
+        </w:rPr>
+        <w:t>8.1.3 Luồng Giải Phóng Khóa Giữ Ghế / Giỏ Hàng Khi Hủy Hoặc Thanh Toán Hoàn Tất (Redis Key Delete)</w:t>
+      </w:r>
+    </w:p>
+    <w:tbl>
+      <w:tblPr>
+        <w:tblW w:type="auto" w:w="0"/>
+        <w:jc w:val="center"/>
+        <w:tblLook w:firstColumn="1" w:firstRow="1" w:lastColumn="0" w:lastRow="0" w:noHBand="0" w:noVBand="1" w:val="04A0"/>
+      </w:tblPr>
+      <w:tblGrid>
+        <w:gridCol w:w="8640"/>
+      </w:tblGrid>
+      <w:tr>
+        <w:tc>
+          <w:tcPr>
+            <w:tcW w:type="dxa" w:w="8640"/>
+            <w:shd w:val="clear" w:color="auto" w:fill="F4F4F6"/>
+          </w:tcPr>
+          <w:p>
+            <w:pPr>
+              <w:spacing w:before="80" w:after="80"/>
+            </w:pPr>
+            <w:r>
+              <w:rPr>
+                <w:rFonts w:ascii="Consolas" w:hAnsi="Consolas"/>
+                <w:color w:val="1F2428"/>
+                <w:sz w:val="21"/>
+              </w:rPr>
+              <w:t>sequenceDiagram</w:t>
+              <w:br/>
+              <w:t xml:space="preserve">    autonumber</w:t>
+              <w:br/>
+              <w:t xml:space="preserve">    actor User as Khách Hàng</w:t>
+              <w:br/>
               <w:t xml:space="preserve">    participant Web as ASP.NET MVC Backend</w:t>
               <w:br/>
               <w:t xml:space="preserve">    participant Redis as Redis Key-Value</w:t>
@@ -3135,11 +3641,11 @@
               <w:br/>
               <w:t xml:space="preserve">    alt Trường hợp 1: Khách hàng bấm Bỏ Chọn Ghế hoặc Hủy Đơn</w:t>
               <w:br/>
-              <w:t xml:space="preserve">        User-&gt;&gt;Web: Bấm Bỏ chọn ghế A1 Suất chiếu 101</w:t>
-              <w:br/>
-              <w:t xml:space="preserve">        Web-&gt;&gt;Redis: KeyDelete('seat_lock:101:A1')</w:t>
-              <w:br/>
-              <w:t xml:space="preserve">        Redis--&gt;&gt;Web: Xóa Key giữ ghế thành công</w:t>
+              <w:t xml:space="preserve">        User-&gt;&gt;Web: Bấm Bỏ chọn ghế A1 / Hủy giỏ hàng</w:t>
+              <w:br/>
+              <w:t xml:space="preserve">        Web-&gt;&gt;Redis: DEL 'cart:7:101' &amp; DEL 'seat_lock:101:A1'</w:t>
+              <w:br/>
+              <w:t xml:space="preserve">        Redis--&gt;&gt;Web: Xóa Key giỏ hàng &amp; giữ ghế thành công</w:t>
               <w:br/>
               <w:t xml:space="preserve">        Web--&gt;&gt;User: Ghế A1 trở về trạng thái trống cho người khác chọn</w:t>
               <w:br/>
@@ -3149,15 +3655,15 @@
               <w:br/>
               <w:t xml:space="preserve">        Web-&gt;&gt;SQL: Lưu Hóa Đơn &amp; Mã Vé vào SQL Server</w:t>
               <w:br/>
-              <w:t xml:space="preserve">        Web-&gt;&gt;Redis: KeyDelete('seat_lock:101:A1') (Giải phóng khóa tạm)</w:t>
-              <w:br/>
-              <w:t xml:space="preserve">        Redis--&gt;&gt;Web: Xóa Key thành công</w:t>
+              <w:t xml:space="preserve">        Web-&gt;&gt;Redis: DEL 'cart:7:101' &amp; DEL 'seat_lock:101:A1'</w:t>
+              <w:br/>
+              <w:t xml:space="preserve">        Redis--&gt;&gt;Web: Xóa Key giỏ hàng &amp; giải phóng khóa tạm</w:t>
               <w:br/>
               <w:t xml:space="preserve">        Web--&gt;&gt;User: Trả về Vé Xem Phim &amp; Mã QR Code thành công</w:t>
               <w:br/>
-              <w:t xml:space="preserve">    else Trường hợp 3: Quá 5 Phút Không Thanh Toán (Hết hạn TTL)</w:t>
-              <w:br/>
-              <w:t xml:space="preserve">        Redis-&gt;&gt;Redis: Tự động xóa Key 'seat_lock:101:A1' do TTL = 0</w:t>
+              <w:t xml:space="preserve">    else Trường hợp 3: Quá 5 Phút Không Thanh Toán (Hết hạn TTL = 0)</w:t>
+              <w:br/>
+              <w:t xml:space="preserve">        Redis-&gt;&gt;Redis: Tự động xóa Key 'cart:7:101' &amp; 'seat_lock:101:A1' do TTL = 0</w:t>
               <w:br/>
               <w:t xml:space="preserve">        User-&gt;&gt;Web: Bấm Thanh Toán muộn (sau 5 phút)</w:t>
               <w:br/>
@@ -3165,7 +3671,7 @@
               <w:br/>
               <w:t xml:space="preserve">        Redis--&gt;&gt;Web: Trả về False (Key đã hết hạn)</w:t>
               <w:br/>
-              <w:t xml:space="preserve">        Web--&gt;&gt;User: Thông báo 'Đã hết thời gian giữ ghế 5 phút, vui lòng chọn lại!'</w:t>
+              <w:t xml:space="preserve">        Web--&gt;&gt;User: Thông báo 'Đã hết thời gian 5 phút giữ giỏ hàng, vui lòng chọn lại!'</w:t>
               <w:br/>
               <w:t xml:space="preserve">    end</w:t>
             </w:r>

</xml_diff>

<commit_message>
[Doc] Nang cap So do Lop Chuong 7 kien truc 3 Tang (Controllers, Services, Data Models DTOs)
</commit_message>
<xml_diff>
--- a/TaiLieu/TaiLieu_SDS_ToanBo_HeThong_Movana.docx
+++ b/TaiLieu/TaiLieu_SDS_ToanBo_HeThong_Movana.docx
@@ -2496,7 +2496,7 @@
               <w:br/>
               <w:t>MATCH (u:User { userId: 'huy' }), (m:Movie { movieId: 101 })</w:t>
               <w:br/>
-              <w:t>MERGE (u)-[r:FAVORITED]-&gt;(m);</w:t>
+              <w:t>MERGE (u)-[:FAVORITED]-&gt;(m);</w:t>
               <w:br/>
               <w:br/>
               <w:t>// 5. Thống Kê Phân Tích Độ Phổ Biến Theo Thể Loại Phim Đồ Thị</w:t>
@@ -3230,6 +3230,102 @@
         <w:t>CHƯƠNG 7: THIẾT KẾ MÔ ĐUN XỬ LÝ VÀ SƠ ĐỒ LỚP (CLASS DIAGRAM)</w:t>
       </w:r>
     </w:p>
+    <w:p>
+      <w:pPr>
+        <w:spacing w:before="60" w:after="60" w:line="276" w:lineRule="auto"/>
+      </w:pPr>
+      <w:r>
+        <w:rPr>
+          <w:rFonts w:ascii="Times New Roman" w:hAnsi="Times New Roman"/>
+        </w:rPr>
+        <w:t xml:space="preserve">Sơ đồ Lớp (Class Diagram) tổng thể hệ thống được chia làm </w:t>
+      </w:r>
+      <w:r>
+        <w:rPr>
+          <w:rFonts w:ascii="Times New Roman" w:hAnsi="Times New Roman"/>
+          <w:b/>
+        </w:rPr>
+        <w:t>3 Tầng Kiến Trúc (3-Tier Architecture)</w:t>
+      </w:r>
+      <w:r>
+        <w:rPr>
+          <w:rFonts w:ascii="Times New Roman" w:hAnsi="Times New Roman"/>
+        </w:rPr>
+        <w:t>:</w:t>
+      </w:r>
+    </w:p>
+    <w:p>
+      <w:pPr>
+        <w:spacing w:before="40" w:after="40"/>
+      </w:pPr>
+      <w:r>
+        <w:rPr>
+          <w:rFonts w:ascii="Times New Roman" w:hAnsi="Times New Roman"/>
+        </w:rPr>
+        <w:t xml:space="preserve">1. </w:t>
+      </w:r>
+      <w:r>
+        <w:rPr>
+          <w:rFonts w:ascii="Times New Roman" w:hAnsi="Times New Roman"/>
+          <w:b/>
+        </w:rPr>
+        <w:t>Tầng Giao Diện / Điều Hướng (Web Controllers Layer):</w:t>
+      </w:r>
+      <w:r>
+        <w:rPr>
+          <w:rFonts w:ascii="Times New Roman" w:hAnsi="Times New Roman"/>
+        </w:rPr>
+        <w:t xml:space="preserve"> Nhận Request từ Khách hàng &amp; Admin.</w:t>
+      </w:r>
+    </w:p>
+    <w:p>
+      <w:pPr>
+        <w:spacing w:before="40" w:after="40"/>
+      </w:pPr>
+      <w:r>
+        <w:rPr>
+          <w:rFonts w:ascii="Times New Roman" w:hAnsi="Times New Roman"/>
+        </w:rPr>
+        <w:t xml:space="preserve">2. </w:t>
+      </w:r>
+      <w:r>
+        <w:rPr>
+          <w:rFonts w:ascii="Times New Roman" w:hAnsi="Times New Roman"/>
+          <w:b/>
+        </w:rPr>
+        <w:t>Tầng Xử Lý Dữ Liệu NoSQL (Data Access Services Layer):</w:t>
+      </w:r>
+      <w:r>
+        <w:rPr>
+          <w:rFonts w:ascii="Times New Roman" w:hAnsi="Times New Roman"/>
+        </w:rPr>
+        <w:t xml:space="preserve"> Thực thi tương tác trực tiếp với 5 hệ CSDL.</w:t>
+      </w:r>
+    </w:p>
+    <w:p>
+      <w:pPr>
+        <w:spacing w:before="40" w:after="40"/>
+      </w:pPr>
+      <w:r>
+        <w:rPr>
+          <w:rFonts w:ascii="Times New Roman" w:hAnsi="Times New Roman"/>
+        </w:rPr>
+        <w:t xml:space="preserve">3. </w:t>
+      </w:r>
+      <w:r>
+        <w:rPr>
+          <w:rFonts w:ascii="Times New Roman" w:hAnsi="Times New Roman"/>
+          <w:b/>
+        </w:rPr>
+        <w:t>Tầng Thực Thể &amp; Mô Hình Dữ Liệu (Entities &amp; DTOs Layer):</w:t>
+      </w:r>
+      <w:r>
+        <w:rPr>
+          <w:rFonts w:ascii="Times New Roman" w:hAnsi="Times New Roman"/>
+        </w:rPr>
+        <w:t xml:space="preserve"> Định nghĩa cấu trúc BSON Document, Graph Nodes và Wide-Column Entities.</w:t>
+      </w:r>
+    </w:p>
     <w:tbl>
       <w:tblPr>
         <w:tblW w:type="auto" w:w="0"/>
@@ -3257,6 +3353,12 @@
               </w:rPr>
               <w:t>classDiagram</w:t>
               <w:br/>
+              <w:t xml:space="preserve">    %% ==========================================</w:t>
+              <w:br/>
+              <w:t xml:space="preserve">    %% 1. TẦNG WEB CONTROLLERS</w:t>
+              <w:br/>
+              <w:t xml:space="preserve">    %% ==========================================</w:t>
+              <w:br/>
               <w:t xml:space="preserve">    class HomeController {</w:t>
               <w:br/>
               <w:t xml:space="preserve">        +PhimDangChieu() ActionResult</w:t>
@@ -3270,6 +3372,8 @@
               <w:br/>
               <w:t xml:space="preserve">        +ChonGhe(suatChieuId) ActionResult</w:t>
               <w:br/>
+              <w:t xml:space="preserve">        +AddToCart(suatChieuId, seatName) JsonResult</w:t>
+              <w:br/>
               <w:t xml:space="preserve">        +LockSeatRedis(suatChieuId, gheId) JsonResult</w:t>
               <w:br/>
               <w:t xml:space="preserve">        +ThanhToan(hoaDonId) ActionResult</w:t>
@@ -3306,81 +3410,168 @@
               <w:t xml:space="preserve">    }</w:t>
               <w:br/>
               <w:br/>
+              <w:t xml:space="preserve">    %% ==========================================</w:t>
+              <w:br/>
+              <w:t xml:space="preserve">    %% 2. TẦNG DATA ACCESS SERVICES (5 DATABASES)</w:t>
+              <w:br/>
+              <w:t xml:space="preserve">    %% ==========================================</w:t>
+              <w:br/>
               <w:t xml:space="preserve">    class MgdbService {</w:t>
               <w:br/>
               <w:t xml:space="preserve">        -MongoClient Client</w:t>
               <w:br/>
-              <w:t xml:space="preserve">        +GetFeedbacksByUser(userId)</w:t>
-              <w:br/>
-              <w:t xml:space="preserve">        +AddFeedback(doc)</w:t>
-              <w:br/>
-              <w:t xml:space="preserve">        +ReplyFeedback(id, replyMsg)</w:t>
-              <w:br/>
-              <w:t xml:space="preserve">        +GetFeedbackCategoryStats()</w:t>
-              <w:br/>
-              <w:t xml:space="preserve">        +GetActivePromotions()</w:t>
-              <w:br/>
-              <w:t xml:space="preserve">        +ClaimPromotion(code)</w:t>
+              <w:t xml:space="preserve">        +GetFeedbacksByUser(userId) List~CustomerFeedbackDoc~</w:t>
+              <w:br/>
+              <w:t xml:space="preserve">        +AddFeedback(doc) void</w:t>
+              <w:br/>
+              <w:t xml:space="preserve">        +ReplyFeedback(id, replyMsg) void</w:t>
+              <w:br/>
+              <w:t xml:space="preserve">        +GetFeedbackCategoryStats() JArray</w:t>
+              <w:br/>
+              <w:t xml:space="preserve">        +GetActivePromotions() List~CinemaPromotionDoc~</w:t>
+              <w:br/>
+              <w:t xml:space="preserve">        +ClaimPromotion(code) bool</w:t>
               <w:br/>
               <w:t xml:space="preserve">    }</w:t>
               <w:br/>
               <w:br/>
               <w:t xml:space="preserve">    class Neo4jService {</w:t>
               <w:br/>
-              <w:t xml:space="preserve">        +ExecuteCypher(query)</w:t>
-              <w:br/>
-              <w:t xml:space="preserve">        +GetTopBookedMovies(limit)</w:t>
-              <w:br/>
-              <w:t xml:space="preserve">        +GetTopFavoriteMovies(limit)</w:t>
-              <w:br/>
-              <w:t xml:space="preserve">        +ToggleFavorite(userId, movieId)</w:t>
-              <w:br/>
-              <w:t xml:space="preserve">        +GetGenreAnalytics()</w:t>
-              <w:br/>
-              <w:t xml:space="preserve">        +SeedInitialData()</w:t>
+              <w:t xml:space="preserve">        +ExecuteCypher(query) JObject</w:t>
+              <w:br/>
+              <w:t xml:space="preserve">        +GetTopBookedMovies(limit) List~Neo4jMovieViewModel~</w:t>
+              <w:br/>
+              <w:t xml:space="preserve">        +GetTopFavoriteMovies(limit) List~Neo4jMovieViewModel~</w:t>
+              <w:br/>
+              <w:t xml:space="preserve">        +ToggleFavorite(userId, movieId) bool</w:t>
+              <w:br/>
+              <w:t xml:space="preserve">        +GetGenreAnalytics() List~Neo4jGenreViewModel~</w:t>
+              <w:br/>
+              <w:t xml:space="preserve">        +SeedInitialData() void</w:t>
               <w:br/>
               <w:t xml:space="preserve">    }</w:t>
               <w:br/>
               <w:br/>
               <w:t xml:space="preserve">    class CassandraService {</w:t>
               <w:br/>
-              <w:t xml:space="preserve">        +GetActivityLogsByUser(userId)</w:t>
-              <w:br/>
-              <w:t xml:space="preserve">        +LogUserActivity(userId, activityType, desc)</w:t>
-              <w:br/>
-              <w:t xml:space="preserve">        +GetTicketHistoryByUser(userId)</w:t>
-              <w:br/>
-              <w:t xml:space="preserve">        +LogTicketHistory(userId, bookingId, amount)</w:t>
+              <w:t xml:space="preserve">        +GetActivityLogsByUser(userId) List~UserActivityLog~</w:t>
+              <w:br/>
+              <w:t xml:space="preserve">        +LogUserActivity(userId, activityType, desc) Task</w:t>
+              <w:br/>
+              <w:t xml:space="preserve">        +GetTicketHistoryByUser(userId) List~UserTicketHistory~</w:t>
+              <w:br/>
+              <w:t xml:space="preserve">        +LogTicketHistory(userId, bookingId, amount) Task</w:t>
               <w:br/>
               <w:t xml:space="preserve">    }</w:t>
               <w:br/>
               <w:br/>
               <w:t xml:space="preserve">    class RedisManager {</w:t>
               <w:br/>
-              <w:t xml:space="preserve">        +SaveUserSession(userId, sessionData)</w:t>
-              <w:br/>
-              <w:t xml:space="preserve">        +AddToCart(userId, suatChieuId, seatName)</w:t>
-              <w:br/>
-              <w:t xml:space="preserve">        +LockSeat(suatChieuId, gheId, userId)</w:t>
-              <w:br/>
-              <w:t xml:space="preserve">        +UnlockSeat(suatChieuId, gheId)</w:t>
-              <w:br/>
-              <w:t xml:space="preserve">        +IsSeatLocked(suatChieuId, gheId)</w:t>
+              <w:t xml:space="preserve">        -ConnectionMultiplexer Redis</w:t>
+              <w:br/>
+              <w:t xml:space="preserve">        +SaveUserSession(userId, sessionData) bool</w:t>
+              <w:br/>
+              <w:t xml:space="preserve">        +AddToCart(userId, suatChieuId, seatName) bool</w:t>
+              <w:br/>
+              <w:t xml:space="preserve">        +LockSeat(suatChieuId, gheId, userId) bool</w:t>
+              <w:br/>
+              <w:t xml:space="preserve">        +UnlockSeat(suatChieuId, gheId) bool</w:t>
+              <w:br/>
+              <w:t xml:space="preserve">        +IsSeatLocked(suatChieuId, gheId) bool</w:t>
               <w:br/>
               <w:t xml:space="preserve">    }</w:t>
               <w:br/>
               <w:br/>
-              <w:t xml:space="preserve">    HomeController --&gt; Neo4jService : Gọi gợi ý &amp; thả tim Phim</w:t>
-              <w:br/>
-              <w:t xml:space="preserve">    DatVeController --&gt; RedisManager : Session, Giỏ hàng &amp; Tạm giữ ghế 5 phút</w:t>
-              <w:br/>
-              <w:t xml:space="preserve">    DatVeController --&gt; CassandraService : Ghi Log thanh toán vé</w:t>
-              <w:br/>
-              <w:t xml:space="preserve">    MgdbCustomerFeedbackController --&gt; MgdbService : Quản lý khiếu nại</w:t>
-              <w:br/>
-              <w:t xml:space="preserve">    MgdbPromotionController --&gt; MgdbService : Tra cứu &amp; Trừ kho Voucher</w:t>
-              <w:br/>
-              <w:t xml:space="preserve">    CassandraController --&gt; CassandraService : Truy vấn nhật ký Big Data</w:t>
+              <w:t xml:space="preserve">    %% ==========================================</w:t>
+              <w:br/>
+              <w:t xml:space="preserve">    %% 3. TẦNG ENTITIES &amp; DATA MODELS (DTOs)</w:t>
+              <w:br/>
+              <w:t xml:space="preserve">    %% ==========================================</w:t>
+              <w:br/>
+              <w:t xml:space="preserve">    class CustomerFeedbackDoc {</w:t>
+              <w:br/>
+              <w:t xml:space="preserve">        +ObjectId Id</w:t>
+              <w:br/>
+              <w:t xml:space="preserve">        +int UserId</w:t>
+              <w:br/>
+              <w:t xml:space="preserve">        +string Category</w:t>
+              <w:br/>
+              <w:t xml:space="preserve">        +string Subject</w:t>
+              <w:br/>
+              <w:t xml:space="preserve">        +string Status</w:t>
+              <w:br/>
+              <w:t xml:space="preserve">        +List~ConversationItem~ Conversations</w:t>
+              <w:br/>
+              <w:t xml:space="preserve">    }</w:t>
+              <w:br/>
+              <w:br/>
+              <w:t xml:space="preserve">    class CinemaPromotionDoc {</w:t>
+              <w:br/>
+              <w:t xml:space="preserve">        +ObjectId Id</w:t>
+              <w:br/>
+              <w:t xml:space="preserve">        +string Code</w:t>
+              <w:br/>
+              <w:t xml:space="preserve">        +int DiscountAmount</w:t>
+              <w:br/>
+              <w:t xml:space="preserve">        +int Quantity</w:t>
+              <w:br/>
+              <w:t xml:space="preserve">        +int ClaimedCount</w:t>
+              <w:br/>
+              <w:t xml:space="preserve">    }</w:t>
+              <w:br/>
+              <w:br/>
+              <w:t xml:space="preserve">    class Neo4jMovieViewModel {</w:t>
+              <w:br/>
+              <w:t xml:space="preserve">        +int MovieId</w:t>
+              <w:br/>
+              <w:t xml:space="preserve">        +string Title</w:t>
+              <w:br/>
+              <w:t xml:space="preserve">        +int TotalBookings</w:t>
+              <w:br/>
+              <w:t xml:space="preserve">        +int TotalFavorites</w:t>
+              <w:br/>
+              <w:t xml:space="preserve">    }</w:t>
+              <w:br/>
+              <w:br/>
+              <w:t xml:space="preserve">    class UserActivityLog {</w:t>
+              <w:br/>
+              <w:t xml:space="preserve">        +int UserId</w:t>
+              <w:br/>
+              <w:t xml:space="preserve">        +DateTime ActivityTime</w:t>
+              <w:br/>
+              <w:t xml:space="preserve">        +string ActivityType</w:t>
+              <w:br/>
+              <w:t xml:space="preserve">        +string Description</w:t>
+              <w:br/>
+              <w:t xml:space="preserve">    }</w:t>
+              <w:br/>
+              <w:br/>
+              <w:t xml:space="preserve">    %% ==========================================</w:t>
+              <w:br/>
+              <w:t xml:space="preserve">    %% QUAN HỆ KẾT NỐI GIỮA CÁC LỚP (RELATIONSHIPS)</w:t>
+              <w:br/>
+              <w:t xml:space="preserve">    %% ==========================================</w:t>
+              <w:br/>
+              <w:t xml:space="preserve">    HomeController --&gt; Neo4jService : Gọi gợi ý &amp; thả tim Phim Neo4j</w:t>
+              <w:br/>
+              <w:t xml:space="preserve">    DatVeController --&gt; RedisManager : Active Session, Giỏ hàng &amp; Tạm giữ ghế 5 phút</w:t>
+              <w:br/>
+              <w:t xml:space="preserve">    DatVeController --&gt; CassandraService : Ghi Log thanh toán vé Big Data</w:t>
+              <w:br/>
+              <w:t xml:space="preserve">    MgdbCustomerFeedbackController --&gt; MgdbService : Quản lý khiếu nại MongoDB</w:t>
+              <w:br/>
+              <w:t xml:space="preserve">    MgdbPromotionController --&gt; MgdbService : Tra cứu &amp; Trừ kho Voucher MongoDB</w:t>
+              <w:br/>
+              <w:t xml:space="preserve">    CassandraController --&gt; CassandraService : Truy vấn nhật ký Big Data Cassandra</w:t>
+              <w:br/>
+              <w:br/>
+              <w:t xml:space="preserve">    MgdbService ..&gt; CustomerFeedbackDoc : Thao tác Document</w:t>
+              <w:br/>
+              <w:t xml:space="preserve">    MgdbService ..&gt; CinemaPromotionDoc : Thao tác Document</w:t>
+              <w:br/>
+              <w:t xml:space="preserve">    Neo4jService ..&gt; Neo4jMovieViewModel : Mapping Graph Node</w:t>
+              <w:br/>
+              <w:t xml:space="preserve">    CassandraService ..&gt; UserActivityLog : Mapping Wide-Column Row</w:t>
             </w:r>
           </w:p>
         </w:tc>

</xml_diff>